<commit_message>
Add timing diagrams, INC_PC, and RESET output
Added INC_PC to sequence ROM output signals in 3.5
Added timing diagrams for 5 bit counter in 4.1
Updated L1 block diagram because RESET is now an output
</commit_message>
<xml_diff>
--- a/CPU Design/L1IsDesign.docx
+++ b/CPU Design/L1IsDesign.docx
@@ -107,7 +107,7 @@
                             <w:szCs w:val="72"/>
                           </w:rPr>
                           <w:alias w:val="Title"/>
-                          <w:id w:val="682328113"/>
+                          <w:id w:val="75242275"/>
                           <w:dataBinding w:prefixMappings="xmlns:ns0='http://schemas.openxmlformats.org/package/2006/metadata/core-properties' xmlns:ns1='http://purl.org/dc/elements/1.1/'" w:xpath="/ns0:coreProperties[1]/ns1:title[1]" w:storeItemID="{6C3C8BC8-F283-45AE-878A-BAB7291924A1}"/>
                           <w:text/>
                         </w:sdtPr>
@@ -146,7 +146,7 @@
                             <w:szCs w:val="40"/>
                           </w:rPr>
                           <w:alias w:val="Subtitle"/>
-                          <w:id w:val="682328114"/>
+                          <w:id w:val="75242276"/>
                           <w:dataBinding w:prefixMappings="xmlns:ns0='http://schemas.openxmlformats.org/package/2006/metadata/core-properties' xmlns:ns1='http://purl.org/dc/elements/1.1/'" w:xpath="/ns0:coreProperties[1]/ns1:subject[1]" w:storeItemID="{6C3C8BC8-F283-45AE-878A-BAB7291924A1}"/>
                           <w:text/>
                         </w:sdtPr>
@@ -184,7 +184,7 @@
                             <w:szCs w:val="32"/>
                           </w:rPr>
                           <w:alias w:val="Author"/>
-                          <w:id w:val="682328115"/>
+                          <w:id w:val="75242277"/>
                           <w:dataBinding w:prefixMappings="xmlns:ns0='http://schemas.openxmlformats.org/package/2006/metadata/core-properties' xmlns:ns1='http://purl.org/dc/elements/1.1/'" w:xpath="/ns0:coreProperties[1]/ns1:creator[1]" w:storeItemID="{6C3C8BC8-F283-45AE-878A-BAB7291924A1}"/>
                           <w:text/>
                         </w:sdtPr>
@@ -575,7 +575,7 @@
                   <w:rPr>
                     <w:rFonts w:cstheme="minorHAnsi"/>
                   </w:rPr>
-                  <w:instrText xml:space="preserve"> REF _Ref233822155 \r \h </w:instrText>
+                  <w:instrText xml:space="preserve"> REF _Ref233901979 \r \h </w:instrText>
                 </w:r>
                 <w:r>
                   <w:rPr>
@@ -605,6 +605,133 @@
                     <w:rFonts w:cstheme="minorHAnsi"/>
                   </w:rPr>
                   <w:t xml:space="preserve"> “AND gate” is now “NAND gate”</w:t>
+                </w:r>
+              </w:p>
+            </w:tc>
+          </w:tr>
+          <w:tr>
+            <w:tc>
+              <w:tcPr>
+                <w:tcW w:w="1384" w:type="dxa"/>
+              </w:tcPr>
+              <w:p>
+                <w:pPr>
+                  <w:rPr>
+                    <w:rFonts w:cstheme="minorHAnsi"/>
+                  </w:rPr>
+                </w:pPr>
+                <w:r>
+                  <w:rPr>
+                    <w:rFonts w:cstheme="minorHAnsi"/>
+                  </w:rPr>
+                  <w:t>2 Jul 2026</w:t>
+                </w:r>
+              </w:p>
+            </w:tc>
+            <w:tc>
+              <w:tcPr>
+                <w:tcW w:w="7858" w:type="dxa"/>
+              </w:tcPr>
+              <w:p>
+                <w:pPr>
+                  <w:rPr>
+                    <w:rFonts w:cstheme="minorHAnsi"/>
+                  </w:rPr>
+                </w:pPr>
+                <w:r>
+                  <w:rPr>
+                    <w:rFonts w:cstheme="minorHAnsi"/>
+                  </w:rPr>
+                  <w:t>Added INC</w:t>
+                </w:r>
+                <w:r>
+                  <w:rPr>
+                    <w:rFonts w:cstheme="minorHAnsi"/>
+                  </w:rPr>
+                  <w:t xml:space="preserve">_PC to sequence ROM output signals in </w:t>
+                </w:r>
+                <w:r>
+                  <w:rPr>
+                    <w:rFonts w:cstheme="minorHAnsi"/>
+                  </w:rPr>
+                  <w:fldChar w:fldCharType="begin"/>
+                </w:r>
+                <w:r>
+                  <w:rPr>
+                    <w:rFonts w:cstheme="minorHAnsi"/>
+                  </w:rPr>
+                  <w:instrText xml:space="preserve"> REF _Ref233543378 \r \h </w:instrText>
+                </w:r>
+                <w:r>
+                  <w:rPr>
+                    <w:rFonts w:cstheme="minorHAnsi"/>
+                  </w:rPr>
+                </w:r>
+                <w:r>
+                  <w:rPr>
+                    <w:rFonts w:cstheme="minorHAnsi"/>
+                  </w:rPr>
+                  <w:fldChar w:fldCharType="separate"/>
+                </w:r>
+                <w:r>
+                  <w:rPr>
+                    <w:rFonts w:cstheme="minorHAnsi"/>
+                  </w:rPr>
+                  <w:t>3.5</w:t>
+                </w:r>
+                <w:r>
+                  <w:rPr>
+                    <w:rFonts w:cstheme="minorHAnsi"/>
+                  </w:rPr>
+                  <w:fldChar w:fldCharType="end"/>
+                </w:r>
+              </w:p>
+              <w:p>
+                <w:pPr>
+                  <w:rPr>
+                    <w:rFonts w:cstheme="minorHAnsi"/>
+                  </w:rPr>
+                </w:pPr>
+                <w:r>
+                  <w:rPr>
+                    <w:rFonts w:cstheme="minorHAnsi"/>
+                  </w:rPr>
+                  <w:t xml:space="preserve">Added timing diagrams for 5 bit counter in </w:t>
+                </w:r>
+                <w:r>
+                  <w:rPr>
+                    <w:rFonts w:cstheme="minorHAnsi"/>
+                  </w:rPr>
+                  <w:fldChar w:fldCharType="begin"/>
+                </w:r>
+                <w:r>
+                  <w:rPr>
+                    <w:rFonts w:cstheme="minorHAnsi"/>
+                  </w:rPr>
+                  <w:instrText xml:space="preserve"> REF _Ref233901870 \r \h </w:instrText>
+                </w:r>
+                <w:r>
+                  <w:rPr>
+                    <w:rFonts w:cstheme="minorHAnsi"/>
+                  </w:rPr>
+                </w:r>
+                <w:r>
+                  <w:rPr>
+                    <w:rFonts w:cstheme="minorHAnsi"/>
+                  </w:rPr>
+                  <w:fldChar w:fldCharType="separate"/>
+                </w:r>
+                <w:r>
+                  <w:rPr>
+                    <w:rFonts w:cstheme="minorHAnsi"/>
+                  </w:rPr>
+                  <w:t>4.1</w:t>
+                </w:r>
+                <w:r>
+                  <w:rPr>
+                    <w:rFonts w:cstheme="minorHAnsi"/>
+                  </w:rPr>
+                  <w:fldChar w:fldCharType="end"/>
                 </w:r>
               </w:p>
             </w:tc>
@@ -677,7 +804,7 @@
           <w:r>
             <w:fldChar w:fldCharType="separate"/>
           </w:r>
-          <w:hyperlink w:anchor="_Toc233800356" w:history="1">
+          <w:hyperlink w:anchor="_Toc233901911" w:history="1">
             <w:r>
               <w:rPr>
                 <w:rStyle w:val="Hyperlink"/>
@@ -723,7 +850,7 @@
                 <w:noProof/>
                 <w:webHidden/>
               </w:rPr>
-              <w:instrText xml:space="preserve"> PAGEREF _Toc233800356 \h </w:instrText>
+              <w:instrText xml:space="preserve"> PAGEREF _Toc233901911 \h </w:instrText>
             </w:r>
             <w:r>
               <w:rPr>
@@ -767,7 +894,7 @@
               <w:lang w:eastAsia="en-GB"/>
             </w:rPr>
           </w:pPr>
-          <w:hyperlink w:anchor="_Toc233800357" w:history="1">
+          <w:hyperlink w:anchor="_Toc233901912" w:history="1">
             <w:r>
               <w:rPr>
                 <w:rStyle w:val="Hyperlink"/>
@@ -811,7 +938,7 @@
                 <w:noProof/>
                 <w:webHidden/>
               </w:rPr>
-              <w:instrText xml:space="preserve"> PAGEREF _Toc233800357 \h </w:instrText>
+              <w:instrText xml:space="preserve"> PAGEREF _Toc233901912 \h </w:instrText>
             </w:r>
             <w:r>
               <w:rPr>
@@ -855,7 +982,7 @@
               <w:lang w:eastAsia="en-GB"/>
             </w:rPr>
           </w:pPr>
-          <w:hyperlink w:anchor="_Toc233800358" w:history="1">
+          <w:hyperlink w:anchor="_Toc233901913" w:history="1">
             <w:r>
               <w:rPr>
                 <w:rStyle w:val="Hyperlink"/>
@@ -899,7 +1026,7 @@
                 <w:noProof/>
                 <w:webHidden/>
               </w:rPr>
-              <w:instrText xml:space="preserve"> PAGEREF _Toc233800358 \h </w:instrText>
+              <w:instrText xml:space="preserve"> PAGEREF _Toc233901913 \h </w:instrText>
             </w:r>
             <w:r>
               <w:rPr>
@@ -943,7 +1070,7 @@
               <w:lang w:eastAsia="en-GB"/>
             </w:rPr>
           </w:pPr>
-          <w:hyperlink w:anchor="_Toc233800359" w:history="1">
+          <w:hyperlink w:anchor="_Toc233901914" w:history="1">
             <w:r>
               <w:rPr>
                 <w:rStyle w:val="Hyperlink"/>
@@ -987,7 +1114,7 @@
                 <w:noProof/>
                 <w:webHidden/>
               </w:rPr>
-              <w:instrText xml:space="preserve"> PAGEREF _Toc233800359 \h </w:instrText>
+              <w:instrText xml:space="preserve"> PAGEREF _Toc233901914 \h </w:instrText>
             </w:r>
             <w:r>
               <w:rPr>
@@ -1031,7 +1158,7 @@
               <w:lang w:eastAsia="en-GB"/>
             </w:rPr>
           </w:pPr>
-          <w:hyperlink w:anchor="_Toc233800360" w:history="1">
+          <w:hyperlink w:anchor="_Toc233901915" w:history="1">
             <w:r>
               <w:rPr>
                 <w:rStyle w:val="Hyperlink"/>
@@ -1075,7 +1202,7 @@
                 <w:noProof/>
                 <w:webHidden/>
               </w:rPr>
-              <w:instrText xml:space="preserve"> PAGEREF _Toc233800360 \h </w:instrText>
+              <w:instrText xml:space="preserve"> PAGEREF _Toc233901915 \h </w:instrText>
             </w:r>
             <w:r>
               <w:rPr>
@@ -1119,7 +1246,7 @@
               <w:lang w:eastAsia="en-GB"/>
             </w:rPr>
           </w:pPr>
-          <w:hyperlink w:anchor="_Toc233800361" w:history="1">
+          <w:hyperlink w:anchor="_Toc233901916" w:history="1">
             <w:r>
               <w:rPr>
                 <w:rStyle w:val="Hyperlink"/>
@@ -1163,7 +1290,7 @@
                 <w:noProof/>
                 <w:webHidden/>
               </w:rPr>
-              <w:instrText xml:space="preserve"> PAGEREF _Toc233800361 \h </w:instrText>
+              <w:instrText xml:space="preserve"> PAGEREF _Toc233901916 \h </w:instrText>
             </w:r>
             <w:r>
               <w:rPr>
@@ -1207,7 +1334,7 @@
               <w:lang w:eastAsia="en-GB"/>
             </w:rPr>
           </w:pPr>
-          <w:hyperlink w:anchor="_Toc233800362" w:history="1">
+          <w:hyperlink w:anchor="_Toc233901917" w:history="1">
             <w:r>
               <w:rPr>
                 <w:rStyle w:val="Hyperlink"/>
@@ -1258,7 +1385,7 @@
                 <w:noProof/>
                 <w:webHidden/>
               </w:rPr>
-              <w:instrText xml:space="preserve"> PAGEREF _Toc233800362 \h </w:instrText>
+              <w:instrText xml:space="preserve"> PAGEREF _Toc233901917 \h </w:instrText>
             </w:r>
             <w:r>
               <w:rPr>
@@ -1302,7 +1429,7 @@
               <w:lang w:eastAsia="en-GB"/>
             </w:rPr>
           </w:pPr>
-          <w:hyperlink w:anchor="_Toc233800363" w:history="1">
+          <w:hyperlink w:anchor="_Toc233901918" w:history="1">
             <w:r>
               <w:rPr>
                 <w:rStyle w:val="Hyperlink"/>
@@ -1346,7 +1473,7 @@
                 <w:noProof/>
                 <w:webHidden/>
               </w:rPr>
-              <w:instrText xml:space="preserve"> PAGEREF _Toc233800363 \h </w:instrText>
+              <w:instrText xml:space="preserve"> PAGEREF _Toc233901918 \h </w:instrText>
             </w:r>
             <w:r>
               <w:rPr>
@@ -1390,7 +1517,7 @@
               <w:lang w:eastAsia="en-GB"/>
             </w:rPr>
           </w:pPr>
-          <w:hyperlink w:anchor="_Toc233800364" w:history="1">
+          <w:hyperlink w:anchor="_Toc233901919" w:history="1">
             <w:r>
               <w:rPr>
                 <w:rStyle w:val="Hyperlink"/>
@@ -1434,7 +1561,7 @@
                 <w:noProof/>
                 <w:webHidden/>
               </w:rPr>
-              <w:instrText xml:space="preserve"> PAGEREF _Toc233800364 \h </w:instrText>
+              <w:instrText xml:space="preserve"> PAGEREF _Toc233901919 \h </w:instrText>
             </w:r>
             <w:r>
               <w:rPr>
@@ -1478,7 +1605,7 @@
               <w:lang w:eastAsia="en-GB"/>
             </w:rPr>
           </w:pPr>
-          <w:hyperlink w:anchor="_Toc233800365" w:history="1">
+          <w:hyperlink w:anchor="_Toc233901920" w:history="1">
             <w:r>
               <w:rPr>
                 <w:rStyle w:val="Hyperlink"/>
@@ -1522,7 +1649,7 @@
                 <w:noProof/>
                 <w:webHidden/>
               </w:rPr>
-              <w:instrText xml:space="preserve"> PAGEREF _Toc233800365 \h </w:instrText>
+              <w:instrText xml:space="preserve"> PAGEREF _Toc233901920 \h </w:instrText>
             </w:r>
             <w:r>
               <w:rPr>
@@ -1566,7 +1693,7 @@
               <w:lang w:eastAsia="en-GB"/>
             </w:rPr>
           </w:pPr>
-          <w:hyperlink w:anchor="_Toc233800366" w:history="1">
+          <w:hyperlink w:anchor="_Toc233901921" w:history="1">
             <w:r>
               <w:rPr>
                 <w:rStyle w:val="Hyperlink"/>
@@ -1610,7 +1737,7 @@
                 <w:noProof/>
                 <w:webHidden/>
               </w:rPr>
-              <w:instrText xml:space="preserve"> PAGEREF _Toc233800366 \h </w:instrText>
+              <w:instrText xml:space="preserve"> PAGEREF _Toc233901921 \h </w:instrText>
             </w:r>
             <w:r>
               <w:rPr>
@@ -1654,7 +1781,7 @@
               <w:lang w:eastAsia="en-GB"/>
             </w:rPr>
           </w:pPr>
-          <w:hyperlink w:anchor="_Toc233800367" w:history="1">
+          <w:hyperlink w:anchor="_Toc233901922" w:history="1">
             <w:r>
               <w:rPr>
                 <w:rStyle w:val="Hyperlink"/>
@@ -1698,7 +1825,7 @@
                 <w:noProof/>
                 <w:webHidden/>
               </w:rPr>
-              <w:instrText xml:space="preserve"> PAGEREF _Toc233800367 \h </w:instrText>
+              <w:instrText xml:space="preserve"> PAGEREF _Toc233901922 \h </w:instrText>
             </w:r>
             <w:r>
               <w:rPr>
@@ -1742,7 +1869,7 @@
               <w:lang w:eastAsia="en-GB"/>
             </w:rPr>
           </w:pPr>
-          <w:hyperlink w:anchor="_Toc233800368" w:history="1">
+          <w:hyperlink w:anchor="_Toc233901923" w:history="1">
             <w:r>
               <w:rPr>
                 <w:rStyle w:val="Hyperlink"/>
@@ -1786,7 +1913,7 @@
                 <w:noProof/>
                 <w:webHidden/>
               </w:rPr>
-              <w:instrText xml:space="preserve"> PAGEREF _Toc233800368 \h </w:instrText>
+              <w:instrText xml:space="preserve"> PAGEREF _Toc233901923 \h </w:instrText>
             </w:r>
             <w:r>
               <w:rPr>
@@ -1830,7 +1957,7 @@
               <w:lang w:eastAsia="en-GB"/>
             </w:rPr>
           </w:pPr>
-          <w:hyperlink w:anchor="_Toc233800369" w:history="1">
+          <w:hyperlink w:anchor="_Toc233901924" w:history="1">
             <w:r>
               <w:rPr>
                 <w:rStyle w:val="Hyperlink"/>
@@ -1874,7 +2001,7 @@
                 <w:noProof/>
                 <w:webHidden/>
               </w:rPr>
-              <w:instrText xml:space="preserve"> PAGEREF _Toc233800369 \h </w:instrText>
+              <w:instrText xml:space="preserve"> PAGEREF _Toc233901924 \h </w:instrText>
             </w:r>
             <w:r>
               <w:rPr>
@@ -1918,7 +2045,7 @@
               <w:lang w:eastAsia="en-GB"/>
             </w:rPr>
           </w:pPr>
-          <w:hyperlink w:anchor="_Toc233800370" w:history="1">
+          <w:hyperlink w:anchor="_Toc233901925" w:history="1">
             <w:r>
               <w:rPr>
                 <w:rStyle w:val="Hyperlink"/>
@@ -1962,7 +2089,7 @@
                 <w:noProof/>
                 <w:webHidden/>
               </w:rPr>
-              <w:instrText xml:space="preserve"> PAGEREF _Toc233800370 \h </w:instrText>
+              <w:instrText xml:space="preserve"> PAGEREF _Toc233901925 \h </w:instrText>
             </w:r>
             <w:r>
               <w:rPr>
@@ -2006,7 +2133,7 @@
               <w:lang w:eastAsia="en-GB"/>
             </w:rPr>
           </w:pPr>
-          <w:hyperlink w:anchor="_Toc233800371" w:history="1">
+          <w:hyperlink w:anchor="_Toc233901926" w:history="1">
             <w:r>
               <w:rPr>
                 <w:rStyle w:val="Hyperlink"/>
@@ -2050,7 +2177,7 @@
                 <w:noProof/>
                 <w:webHidden/>
               </w:rPr>
-              <w:instrText xml:space="preserve"> PAGEREF _Toc233800371 \h </w:instrText>
+              <w:instrText xml:space="preserve"> PAGEREF _Toc233901926 \h </w:instrText>
             </w:r>
             <w:r>
               <w:rPr>
@@ -2094,7 +2221,7 @@
               <w:lang w:eastAsia="en-GB"/>
             </w:rPr>
           </w:pPr>
-          <w:hyperlink w:anchor="_Toc233800372" w:history="1">
+          <w:hyperlink w:anchor="_Toc233901927" w:history="1">
             <w:r>
               <w:rPr>
                 <w:rStyle w:val="Hyperlink"/>
@@ -2138,7 +2265,7 @@
                 <w:noProof/>
                 <w:webHidden/>
               </w:rPr>
-              <w:instrText xml:space="preserve"> PAGEREF _Toc233800372 \h </w:instrText>
+              <w:instrText xml:space="preserve"> PAGEREF _Toc233901927 \h </w:instrText>
             </w:r>
             <w:r>
               <w:rPr>
@@ -2182,7 +2309,7 @@
               <w:lang w:eastAsia="en-GB"/>
             </w:rPr>
           </w:pPr>
-          <w:hyperlink w:anchor="_Toc233800373" w:history="1">
+          <w:hyperlink w:anchor="_Toc233901928" w:history="1">
             <w:r>
               <w:rPr>
                 <w:rStyle w:val="Hyperlink"/>
@@ -2226,7 +2353,7 @@
                 <w:noProof/>
                 <w:webHidden/>
               </w:rPr>
-              <w:instrText xml:space="preserve"> PAGEREF _Toc233800373 \h </w:instrText>
+              <w:instrText xml:space="preserve"> PAGEREF _Toc233901928 \h </w:instrText>
             </w:r>
             <w:r>
               <w:rPr>
@@ -2270,7 +2397,7 @@
               <w:lang w:eastAsia="en-GB"/>
             </w:rPr>
           </w:pPr>
-          <w:hyperlink w:anchor="_Toc233800374" w:history="1">
+          <w:hyperlink w:anchor="_Toc233901929" w:history="1">
             <w:r>
               <w:rPr>
                 <w:rStyle w:val="Hyperlink"/>
@@ -2314,7 +2441,7 @@
                 <w:noProof/>
                 <w:webHidden/>
               </w:rPr>
-              <w:instrText xml:space="preserve"> PAGEREF _Toc233800374 \h </w:instrText>
+              <w:instrText xml:space="preserve"> PAGEREF _Toc233901929 \h </w:instrText>
             </w:r>
             <w:r>
               <w:rPr>
@@ -2334,7 +2461,7 @@
                 <w:noProof/>
                 <w:webHidden/>
               </w:rPr>
-              <w:t>12</w:t>
+              <w:t>14</w:t>
             </w:r>
             <w:r>
               <w:rPr>
@@ -2358,7 +2485,7 @@
               <w:lang w:eastAsia="en-GB"/>
             </w:rPr>
           </w:pPr>
-          <w:hyperlink w:anchor="_Toc233800375" w:history="1">
+          <w:hyperlink w:anchor="_Toc233901930" w:history="1">
             <w:r>
               <w:rPr>
                 <w:rStyle w:val="Hyperlink"/>
@@ -2402,7 +2529,7 @@
                 <w:noProof/>
                 <w:webHidden/>
               </w:rPr>
-              <w:instrText xml:space="preserve"> PAGEREF _Toc233800375 \h </w:instrText>
+              <w:instrText xml:space="preserve"> PAGEREF _Toc233901930 \h </w:instrText>
             </w:r>
             <w:r>
               <w:rPr>
@@ -2422,7 +2549,7 @@
                 <w:noProof/>
                 <w:webHidden/>
               </w:rPr>
-              <w:t>14</w:t>
+              <w:t>15</w:t>
             </w:r>
             <w:r>
               <w:rPr>
@@ -2510,7 +2637,7 @@
         </w:rPr>
         <w:fldChar w:fldCharType="separate"/>
       </w:r>
-      <w:hyperlink w:anchor="_Toc233800376" w:history="1">
+      <w:hyperlink w:anchor="_Toc233901931" w:history="1">
         <w:r>
           <w:rPr>
             <w:rStyle w:val="Hyperlink"/>
@@ -2537,7 +2664,7 @@
             <w:noProof/>
             <w:webHidden/>
           </w:rPr>
-          <w:instrText xml:space="preserve"> PAGEREF _Toc233800376 \h </w:instrText>
+          <w:instrText xml:space="preserve"> PAGEREF _Toc233901931 \h </w:instrText>
         </w:r>
         <w:r>
           <w:rPr>
@@ -2580,7 +2707,7 @@
           <w:lang w:eastAsia="en-GB"/>
         </w:rPr>
       </w:pPr>
-      <w:hyperlink w:anchor="_Toc233800377" w:history="1">
+      <w:hyperlink w:anchor="_Toc233901932" w:history="1">
         <w:r>
           <w:rPr>
             <w:rStyle w:val="Hyperlink"/>
@@ -2607,7 +2734,7 @@
             <w:noProof/>
             <w:webHidden/>
           </w:rPr>
-          <w:instrText xml:space="preserve"> PAGEREF _Toc233800377 \h </w:instrText>
+          <w:instrText xml:space="preserve"> PAGEREF _Toc233901932 \h </w:instrText>
         </w:r>
         <w:r>
           <w:rPr>
@@ -2650,7 +2777,7 @@
           <w:lang w:eastAsia="en-GB"/>
         </w:rPr>
       </w:pPr>
-      <w:hyperlink w:anchor="_Toc233800378" w:history="1">
+      <w:hyperlink w:anchor="_Toc233901933" w:history="1">
         <w:r>
           <w:rPr>
             <w:rStyle w:val="Hyperlink"/>
@@ -2677,7 +2804,7 @@
             <w:noProof/>
             <w:webHidden/>
           </w:rPr>
-          <w:instrText xml:space="preserve"> PAGEREF _Toc233800378 \h </w:instrText>
+          <w:instrText xml:space="preserve"> PAGEREF _Toc233901933 \h </w:instrText>
         </w:r>
         <w:r>
           <w:rPr>
@@ -2720,7 +2847,7 @@
           <w:lang w:eastAsia="en-GB"/>
         </w:rPr>
       </w:pPr>
-      <w:hyperlink w:anchor="_Toc233800379" w:history="1">
+      <w:hyperlink w:anchor="_Toc233901934" w:history="1">
         <w:r>
           <w:rPr>
             <w:rStyle w:val="Hyperlink"/>
@@ -2747,7 +2874,7 @@
             <w:noProof/>
             <w:webHidden/>
           </w:rPr>
-          <w:instrText xml:space="preserve"> PAGEREF _Toc233800379 \h </w:instrText>
+          <w:instrText xml:space="preserve"> PAGEREF _Toc233901934 \h </w:instrText>
         </w:r>
         <w:r>
           <w:rPr>
@@ -2790,7 +2917,7 @@
           <w:lang w:eastAsia="en-GB"/>
         </w:rPr>
       </w:pPr>
-      <w:hyperlink w:anchor="_Toc233800380" w:history="1">
+      <w:hyperlink w:anchor="_Toc233901935" w:history="1">
         <w:r>
           <w:rPr>
             <w:rStyle w:val="Hyperlink"/>
@@ -2817,7 +2944,7 @@
             <w:noProof/>
             <w:webHidden/>
           </w:rPr>
-          <w:instrText xml:space="preserve"> PAGEREF _Toc233800380 \h </w:instrText>
+          <w:instrText xml:space="preserve"> PAGEREF _Toc233901935 \h </w:instrText>
         </w:r>
         <w:r>
           <w:rPr>
@@ -2860,7 +2987,7 @@
           <w:lang w:eastAsia="en-GB"/>
         </w:rPr>
       </w:pPr>
-      <w:hyperlink w:anchor="_Toc233800381" w:history="1">
+      <w:hyperlink w:anchor="_Toc233901936" w:history="1">
         <w:r>
           <w:rPr>
             <w:rStyle w:val="Hyperlink"/>
@@ -2887,7 +3014,7 @@
             <w:noProof/>
             <w:webHidden/>
           </w:rPr>
-          <w:instrText xml:space="preserve"> PAGEREF _Toc233800381 \h </w:instrText>
+          <w:instrText xml:space="preserve"> PAGEREF _Toc233901936 \h </w:instrText>
         </w:r>
         <w:r>
           <w:rPr>
@@ -2930,7 +3057,7 @@
           <w:lang w:eastAsia="en-GB"/>
         </w:rPr>
       </w:pPr>
-      <w:hyperlink w:anchor="_Toc233800382" w:history="1">
+      <w:hyperlink w:anchor="_Toc233901937" w:history="1">
         <w:r>
           <w:rPr>
             <w:rStyle w:val="Hyperlink"/>
@@ -2957,7 +3084,7 @@
             <w:noProof/>
             <w:webHidden/>
           </w:rPr>
-          <w:instrText xml:space="preserve"> PAGEREF _Toc233800382 \h </w:instrText>
+          <w:instrText xml:space="preserve"> PAGEREF _Toc233901937 \h </w:instrText>
         </w:r>
         <w:r>
           <w:rPr>
@@ -2990,6 +3117,146 @@
     </w:p>
     <w:p>
       <w:pPr>
+        <w:pStyle w:val="TableofFigures"/>
+        <w:tabs>
+          <w:tab w:val="right" w:leader="dot" w:pos="9016"/>
+        </w:tabs>
+        <w:rPr>
+          <w:rFonts w:eastAsiaTheme="minorEastAsia"/>
+          <w:noProof/>
+          <w:lang w:eastAsia="en-GB"/>
+        </w:rPr>
+      </w:pPr>
+      <w:hyperlink w:anchor="_Toc233901938" w:history="1">
+        <w:r>
+          <w:rPr>
+            <w:rStyle w:val="Hyperlink"/>
+            <w:noProof/>
+          </w:rPr>
+          <w:t>Figure 8:   Timing requirements for 5 bit counter when RESET is low</w:t>
+        </w:r>
+        <w:r>
+          <w:rPr>
+            <w:noProof/>
+            <w:webHidden/>
+          </w:rPr>
+          <w:tab/>
+        </w:r>
+        <w:r>
+          <w:rPr>
+            <w:noProof/>
+            <w:webHidden/>
+          </w:rPr>
+          <w:fldChar w:fldCharType="begin"/>
+        </w:r>
+        <w:r>
+          <w:rPr>
+            <w:noProof/>
+            <w:webHidden/>
+          </w:rPr>
+          <w:instrText xml:space="preserve"> PAGEREF _Toc233901938 \h </w:instrText>
+        </w:r>
+        <w:r>
+          <w:rPr>
+            <w:noProof/>
+            <w:webHidden/>
+          </w:rPr>
+        </w:r>
+        <w:r>
+          <w:rPr>
+            <w:noProof/>
+            <w:webHidden/>
+          </w:rPr>
+          <w:fldChar w:fldCharType="separate"/>
+        </w:r>
+        <w:r>
+          <w:rPr>
+            <w:noProof/>
+            <w:webHidden/>
+          </w:rPr>
+          <w:t>12</w:t>
+        </w:r>
+        <w:r>
+          <w:rPr>
+            <w:noProof/>
+            <w:webHidden/>
+          </w:rPr>
+          <w:fldChar w:fldCharType="end"/>
+        </w:r>
+      </w:hyperlink>
+    </w:p>
+    <w:p>
+      <w:pPr>
+        <w:pStyle w:val="TableofFigures"/>
+        <w:tabs>
+          <w:tab w:val="right" w:leader="dot" w:pos="9016"/>
+        </w:tabs>
+        <w:rPr>
+          <w:rFonts w:eastAsiaTheme="minorEastAsia"/>
+          <w:noProof/>
+          <w:lang w:eastAsia="en-GB"/>
+        </w:rPr>
+      </w:pPr>
+      <w:hyperlink w:anchor="_Toc233901939" w:history="1">
+        <w:r>
+          <w:rPr>
+            <w:rStyle w:val="Hyperlink"/>
+            <w:noProof/>
+          </w:rPr>
+          <w:t>Figure 9:   Timing requirements for 5 bit counter when RESET is high</w:t>
+        </w:r>
+        <w:r>
+          <w:rPr>
+            <w:noProof/>
+            <w:webHidden/>
+          </w:rPr>
+          <w:tab/>
+        </w:r>
+        <w:r>
+          <w:rPr>
+            <w:noProof/>
+            <w:webHidden/>
+          </w:rPr>
+          <w:fldChar w:fldCharType="begin"/>
+        </w:r>
+        <w:r>
+          <w:rPr>
+            <w:noProof/>
+            <w:webHidden/>
+          </w:rPr>
+          <w:instrText xml:space="preserve"> PAGEREF _Toc233901939 \h </w:instrText>
+        </w:r>
+        <w:r>
+          <w:rPr>
+            <w:noProof/>
+            <w:webHidden/>
+          </w:rPr>
+        </w:r>
+        <w:r>
+          <w:rPr>
+            <w:noProof/>
+            <w:webHidden/>
+          </w:rPr>
+          <w:fldChar w:fldCharType="separate"/>
+        </w:r>
+        <w:r>
+          <w:rPr>
+            <w:noProof/>
+            <w:webHidden/>
+          </w:rPr>
+          <w:t>13</w:t>
+        </w:r>
+        <w:r>
+          <w:rPr>
+            <w:noProof/>
+            <w:webHidden/>
+          </w:rPr>
+          <w:fldChar w:fldCharType="end"/>
+        </w:r>
+      </w:hyperlink>
+    </w:p>
+    <w:p>
+      <w:pPr>
         <w:rPr>
           <w:rFonts w:eastAsia="Times New Roman"/>
           <w:lang w:eastAsia="en-GB"/>
@@ -3037,7 +3304,7 @@
           <w:lang w:eastAsia="en-GB"/>
         </w:rPr>
       </w:pPr>
-      <w:bookmarkStart w:id="1" w:name="_Toc233800356"/>
+      <w:bookmarkStart w:id="1" w:name="_Toc233901911"/>
       <w:bookmarkEnd w:id="0"/>
       <w:r>
         <w:rPr>
@@ -3118,7 +3385,7 @@
           <w:lang w:eastAsia="en-GB"/>
         </w:rPr>
       </w:pPr>
-      <w:bookmarkStart w:id="2" w:name="_Toc233800357"/>
+      <w:bookmarkStart w:id="2" w:name="_Toc233901912"/>
       <w:r>
         <w:rPr>
           <w:lang w:eastAsia="en-GB"/>
@@ -3345,7 +3612,7 @@
         </w:rPr>
       </w:pPr>
       <w:bookmarkStart w:id="3" w:name="_Ref232757332"/>
-      <w:bookmarkStart w:id="4" w:name="_Toc233800376"/>
+      <w:bookmarkStart w:id="4" w:name="_Toc233901931"/>
       <w:r>
         <w:t xml:space="preserve">Figure </w:t>
       </w:r>
@@ -3703,7 +3970,7 @@
           <w:lang w:eastAsia="en-GB"/>
         </w:rPr>
       </w:pPr>
-      <w:bookmarkStart w:id="5" w:name="_Toc233800358"/>
+      <w:bookmarkStart w:id="5" w:name="_Toc233901913"/>
       <w:r>
         <w:rPr>
           <w:lang w:eastAsia="en-GB"/>
@@ -5232,7 +5499,7 @@
           <w:lang w:eastAsia="en-GB"/>
         </w:rPr>
       </w:pPr>
-      <w:bookmarkStart w:id="7" w:name="_Toc233800359"/>
+      <w:bookmarkStart w:id="7" w:name="_Toc233901914"/>
       <w:r>
         <w:rPr>
           <w:lang w:eastAsia="en-GB"/>
@@ -5303,7 +5570,7 @@
           <w:lang w:eastAsia="en-GB"/>
         </w:rPr>
       </w:pPr>
-      <w:bookmarkStart w:id="8" w:name="_Toc233800360"/>
+      <w:bookmarkStart w:id="8" w:name="_Toc233901915"/>
       <w:r>
         <w:rPr>
           <w:rFonts w:eastAsiaTheme="minorHAnsi"/>
@@ -8683,7 +8950,7 @@
           <w:lang w:eastAsia="en-GB"/>
         </w:rPr>
       </w:pPr>
-      <w:bookmarkStart w:id="10" w:name="_Toc233800361"/>
+      <w:bookmarkStart w:id="10" w:name="_Toc233901916"/>
       <w:r>
         <w:rPr>
           <w:lang w:eastAsia="en-GB"/>
@@ -8826,7 +9093,7 @@
       </w:pPr>
       <w:bookmarkStart w:id="11" w:name="_Ref232762527"/>
       <w:bookmarkStart w:id="12" w:name="_Ref233641508"/>
-      <w:bookmarkStart w:id="13" w:name="_Toc233800377"/>
+      <w:bookmarkStart w:id="13" w:name="_Toc233901932"/>
       <w:r>
         <w:t xml:space="preserve">Figure </w:t>
       </w:r>
@@ -8884,7 +9151,7 @@
           <w:lang w:eastAsia="en-GB"/>
         </w:rPr>
       </w:pPr>
-      <w:bookmarkStart w:id="14" w:name="_Toc233800362"/>
+      <w:bookmarkStart w:id="14" w:name="_Toc233901917"/>
       <w:r>
         <w:rPr>
           <w:lang w:eastAsia="en-GB"/>
@@ -8996,7 +9263,8 @@
           <w:lang w:eastAsia="en-GB"/>
         </w:rPr>
       </w:pPr>
-      <w:bookmarkStart w:id="15" w:name="_Toc233800363"/>
+      <w:bookmarkStart w:id="15" w:name="_Ref233894649"/>
+      <w:bookmarkStart w:id="16" w:name="_Toc233901918"/>
       <w:r>
         <w:rPr>
           <w:lang w:eastAsia="en-GB"/>
@@ -9004,6 +9272,7 @@
         <w:t>Opcode Latch</w:t>
       </w:r>
       <w:bookmarkEnd w:id="15"/>
+      <w:bookmarkEnd w:id="16"/>
     </w:p>
     <w:p>
       <w:pPr>
@@ -9409,8 +9678,8 @@
         <w:pStyle w:val="Caption"/>
         <w:jc w:val="center"/>
       </w:pPr>
-      <w:bookmarkStart w:id="16" w:name="_Ref233471569"/>
-      <w:bookmarkStart w:id="17" w:name="_Toc233800378"/>
+      <w:bookmarkStart w:id="17" w:name="_Ref233471569"/>
+      <w:bookmarkStart w:id="18" w:name="_Toc233901933"/>
       <w:r>
         <w:t xml:space="preserve">Figure </w:t>
       </w:r>
@@ -9422,11 +9691,11 @@
           <w:t>3</w:t>
         </w:r>
       </w:fldSimple>
-      <w:bookmarkEnd w:id="16"/>
+      <w:bookmarkEnd w:id="17"/>
       <w:r>
         <w:t>:   Mapping for all outputs except JBITS</w:t>
       </w:r>
-      <w:bookmarkEnd w:id="17"/>
+      <w:bookmarkEnd w:id="18"/>
     </w:p>
     <w:p>
       <w:pPr>
@@ -9712,8 +9981,8 @@
         <w:pStyle w:val="Caption"/>
         <w:jc w:val="center"/>
       </w:pPr>
-      <w:bookmarkStart w:id="18" w:name="_Ref233472606"/>
-      <w:bookmarkStart w:id="19" w:name="_Toc233800379"/>
+      <w:bookmarkStart w:id="19" w:name="_Ref233472606"/>
+      <w:bookmarkStart w:id="20" w:name="_Toc233901934"/>
       <w:r>
         <w:t xml:space="preserve">Figure </w:t>
       </w:r>
@@ -9725,11 +9994,11 @@
           <w:t>4</w:t>
         </w:r>
       </w:fldSimple>
-      <w:bookmarkEnd w:id="18"/>
+      <w:bookmarkEnd w:id="19"/>
       <w:r>
         <w:t>:   Mapping for JBITS output</w:t>
       </w:r>
-      <w:bookmarkEnd w:id="19"/>
+      <w:bookmarkEnd w:id="20"/>
     </w:p>
     <w:p>
       <w:pPr>
@@ -9779,7 +10048,7 @@
           <w:lang w:eastAsia="en-GB"/>
         </w:rPr>
       </w:pPr>
-      <w:bookmarkStart w:id="20" w:name="SufficientInfo"/>
+      <w:bookmarkStart w:id="21" w:name="SufficientInfo"/>
       <w:r>
         <w:rPr>
           <w:lang w:eastAsia="en-GB"/>
@@ -9805,7 +10074,7 @@
         </w:rPr>
         <w:t>design</w:t>
       </w:r>
-      <w:bookmarkEnd w:id="20"/>
+      <w:bookmarkEnd w:id="21"/>
       <w:proofErr w:type="gramEnd"/>
       <w:r>
         <w:rPr>
@@ -9813,7 +10082,7 @@
         </w:rPr>
         <w:t>.</w:t>
       </w:r>
-      <w:bookmarkStart w:id="21" w:name="_Ref172648415"/>
+      <w:bookmarkStart w:id="22" w:name="_Ref172648415"/>
       <w:r>
         <w:rPr>
           <w:lang w:eastAsia="en-GB"/>
@@ -9828,7 +10097,7 @@
           <w:lang w:eastAsia="en-GB"/>
         </w:rPr>
       </w:pPr>
-      <w:bookmarkStart w:id="22" w:name="_Toc233800364"/>
+      <w:bookmarkStart w:id="23" w:name="_Toc233901919"/>
       <w:r>
         <w:rPr>
           <w:lang w:eastAsia="en-GB"/>
@@ -9836,7 +10105,7 @@
         <w:lastRenderedPageBreak/>
         <w:t>Clock Generator</w:t>
       </w:r>
-      <w:bookmarkEnd w:id="22"/>
+      <w:bookmarkEnd w:id="23"/>
     </w:p>
     <w:p>
       <w:pPr>
@@ -9993,26 +10262,75 @@
           <w:lang w:eastAsia="en-GB"/>
         </w:rPr>
       </w:pPr>
-      <w:bookmarkStart w:id="23" w:name="_Toc233800365"/>
+      <w:bookmarkStart w:id="24" w:name="_Ref233900184"/>
+      <w:bookmarkStart w:id="25" w:name="_Toc233901920"/>
       <w:r>
         <w:rPr>
           <w:lang w:eastAsia="en-GB"/>
         </w:rPr>
         <w:t>Power up Reset</w:t>
       </w:r>
-      <w:bookmarkEnd w:id="23"/>
-    </w:p>
-    <w:p>
-      <w:pPr>
-        <w:rPr>
-          <w:lang w:eastAsia="en-GB"/>
-        </w:rPr>
-      </w:pPr>
-      <w:r>
-        <w:rPr>
-          <w:lang w:eastAsia="en-GB"/>
-        </w:rPr>
-        <w:t>The function of this block is to provide the RESET signal which will be used to set the sequence control block to the correct initial state.</w:t>
+      <w:bookmarkEnd w:id="24"/>
+      <w:bookmarkEnd w:id="25"/>
+    </w:p>
+    <w:p>
+      <w:pPr>
+        <w:rPr>
+          <w:lang w:eastAsia="en-GB"/>
+        </w:rPr>
+      </w:pPr>
+      <w:r>
+        <w:rPr>
+          <w:lang w:eastAsia="en-GB"/>
+        </w:rPr>
+        <w:t xml:space="preserve">The function of this block is to provide the RESET signal </w:t>
+      </w:r>
+      <w:r>
+        <w:rPr>
+          <w:lang w:eastAsia="en-GB"/>
+        </w:rPr>
+        <w:t xml:space="preserve">defined in the section named “Common bus signals” of ref </w:t>
+      </w:r>
+      <w:r>
+        <w:rPr>
+          <w:lang w:eastAsia="en-GB"/>
+        </w:rPr>
+        <w:fldChar w:fldCharType="begin"/>
+      </w:r>
+      <w:r>
+        <w:rPr>
+          <w:lang w:eastAsia="en-GB"/>
+        </w:rPr>
+        <w:instrText xml:space="preserve"> REF RefCpuDesign \r \h </w:instrText>
+      </w:r>
+      <w:r>
+        <w:rPr>
+          <w:lang w:eastAsia="en-GB"/>
+        </w:rPr>
+      </w:r>
+      <w:r>
+        <w:rPr>
+          <w:lang w:eastAsia="en-GB"/>
+        </w:rPr>
+        <w:fldChar w:fldCharType="separate"/>
+      </w:r>
+      <w:r>
+        <w:rPr>
+          <w:lang w:eastAsia="en-GB"/>
+        </w:rPr>
+        <w:t>2</w:t>
+      </w:r>
+      <w:r>
+        <w:rPr>
+          <w:lang w:eastAsia="en-GB"/>
+        </w:rPr>
+        <w:fldChar w:fldCharType="end"/>
+      </w:r>
+      <w:r>
+        <w:rPr>
+          <w:lang w:eastAsia="en-GB"/>
+        </w:rPr>
+        <w:t>.</w:t>
       </w:r>
     </w:p>
     <w:p>
@@ -10091,8 +10409,8 @@
           <w:lang w:eastAsia="en-GB"/>
         </w:rPr>
       </w:pPr>
-      <w:bookmarkStart w:id="24" w:name="_Ref233641794"/>
-      <w:bookmarkStart w:id="25" w:name="_Toc233800366"/>
+      <w:bookmarkStart w:id="26" w:name="_Ref233641794"/>
+      <w:bookmarkStart w:id="27" w:name="_Toc233901921"/>
       <w:r>
         <w:rPr>
           <w:lang w:eastAsia="en-GB"/>
@@ -10100,8 +10418,8 @@
         <w:lastRenderedPageBreak/>
         <w:t>Sequence Control</w:t>
       </w:r>
-      <w:bookmarkEnd w:id="24"/>
-      <w:bookmarkEnd w:id="25"/>
+      <w:bookmarkEnd w:id="26"/>
+      <w:bookmarkEnd w:id="27"/>
     </w:p>
     <w:p>
       <w:pPr>
@@ -10574,6 +10892,53 @@
         </w:rPr>
         <w:t>Reset the counter to 0 when (RESET OR SEQ_END) is high</w:t>
       </w:r>
+      <w:r>
+        <w:rPr>
+          <w:lang w:eastAsia="en-GB"/>
+        </w:rPr>
+        <w:t xml:space="preserve"> (see </w:t>
+      </w:r>
+      <w:r>
+        <w:rPr>
+          <w:lang w:eastAsia="en-GB"/>
+        </w:rPr>
+        <w:fldChar w:fldCharType="begin"/>
+      </w:r>
+      <w:r>
+        <w:rPr>
+          <w:lang w:eastAsia="en-GB"/>
+        </w:rPr>
+        <w:instrText xml:space="preserve"> REF _Ref233901870 \r \h </w:instrText>
+      </w:r>
+      <w:r>
+        <w:rPr>
+          <w:lang w:eastAsia="en-GB"/>
+        </w:rPr>
+      </w:r>
+      <w:r>
+        <w:rPr>
+          <w:lang w:eastAsia="en-GB"/>
+        </w:rPr>
+        <w:fldChar w:fldCharType="separate"/>
+      </w:r>
+      <w:r>
+        <w:rPr>
+          <w:lang w:eastAsia="en-GB"/>
+        </w:rPr>
+        <w:t>4.1</w:t>
+      </w:r>
+      <w:r>
+        <w:rPr>
+          <w:lang w:eastAsia="en-GB"/>
+        </w:rPr>
+        <w:fldChar w:fldCharType="end"/>
+      </w:r>
+      <w:r>
+        <w:rPr>
+          <w:lang w:eastAsia="en-GB"/>
+        </w:rPr>
+        <w:t xml:space="preserve"> for more precise requirement)</w:t>
+      </w:r>
     </w:p>
     <w:p>
       <w:pPr>
@@ -10709,7 +11074,7 @@
           <w:lang w:eastAsia="en-GB"/>
         </w:rPr>
       </w:pPr>
-      <w:bookmarkStart w:id="26" w:name="ComplexInfo"/>
+      <w:bookmarkStart w:id="28" w:name="ComplexInfo"/>
       <w:r>
         <w:rPr>
           <w:color w:val="FF0000"/>
@@ -10725,7 +11090,7 @@
         </w:rPr>
         <w:t>diagram</w:t>
       </w:r>
-      <w:bookmarkEnd w:id="26"/>
+      <w:bookmarkEnd w:id="28"/>
       <w:proofErr w:type="gramEnd"/>
       <w:r>
         <w:rPr>
@@ -10793,7 +11158,7 @@
           <w:lang w:eastAsia="en-GB"/>
         </w:rPr>
       </w:pPr>
-      <w:bookmarkStart w:id="27" w:name="_Ref233534943"/>
+      <w:bookmarkStart w:id="29" w:name="_Ref233534943"/>
       <w:r>
         <w:rPr>
           <w:lang w:eastAsia="en-GB"/>
@@ -10808,8 +11173,8 @@
           <w:lang w:eastAsia="en-GB"/>
         </w:rPr>
       </w:pPr>
-      <w:bookmarkStart w:id="28" w:name="_Ref233543378"/>
-      <w:bookmarkStart w:id="29" w:name="_Toc233800367"/>
+      <w:bookmarkStart w:id="30" w:name="_Ref233543378"/>
+      <w:bookmarkStart w:id="31" w:name="_Toc233901922"/>
       <w:r>
         <w:rPr>
           <w:lang w:eastAsia="en-GB"/>
@@ -10817,9 +11182,9 @@
         <w:lastRenderedPageBreak/>
         <w:t>Sequence ROM</w:t>
       </w:r>
-      <w:bookmarkEnd w:id="27"/>
-      <w:bookmarkEnd w:id="28"/>
       <w:bookmarkEnd w:id="29"/>
+      <w:bookmarkEnd w:id="30"/>
+      <w:bookmarkEnd w:id="31"/>
     </w:p>
     <w:p>
       <w:pPr>
@@ -10994,8 +11359,8 @@
         <w:pStyle w:val="Caption"/>
         <w:jc w:val="center"/>
       </w:pPr>
-      <w:bookmarkStart w:id="30" w:name="_Ref233534511"/>
-      <w:bookmarkStart w:id="31" w:name="_Toc233800380"/>
+      <w:bookmarkStart w:id="32" w:name="_Ref233534511"/>
+      <w:bookmarkStart w:id="33" w:name="_Toc233901935"/>
       <w:r>
         <w:t xml:space="preserve">Figure </w:t>
       </w:r>
@@ -11007,11 +11372,11 @@
           <w:t>5</w:t>
         </w:r>
       </w:fldSimple>
-      <w:bookmarkEnd w:id="30"/>
+      <w:bookmarkEnd w:id="32"/>
       <w:r>
         <w:t>:   Sequence ROM Layout</w:t>
       </w:r>
-      <w:bookmarkEnd w:id="31"/>
+      <w:bookmarkEnd w:id="33"/>
     </w:p>
     <w:p>
       <w:r>
@@ -11255,7 +11620,13 @@
     </w:p>
     <w:p>
       <w:r>
-        <w:t>The remaining outputs (SEQ_END and</w:t>
+        <w:t>The remaining outputs (</w:t>
+      </w:r>
+      <w:r>
+        <w:t xml:space="preserve">INC_PC, </w:t>
+      </w:r>
+      <w:r>
+        <w:t>SEQ_END and</w:t>
       </w:r>
       <w:r>
         <w:t xml:space="preserve"> ID_ACL) will </w:t>
@@ -11269,7 +11640,7 @@
         <w:t>So the total number of b</w:t>
       </w:r>
       <w:r>
-        <w:t>its required in a ROM word is 13</w:t>
+        <w:t>its required in a ROM word is 14</w:t>
       </w:r>
       <w:r>
         <w:t>.</w:t>
@@ -11313,7 +11684,7 @@
           <w:lang w:eastAsia="en-GB"/>
         </w:rPr>
       </w:pPr>
-      <w:bookmarkStart w:id="32" w:name="_Toc233800368"/>
+      <w:bookmarkStart w:id="34" w:name="_Toc233901923"/>
       <w:r>
         <w:rPr>
           <w:lang w:eastAsia="en-GB"/>
@@ -11321,7 +11692,7 @@
         <w:lastRenderedPageBreak/>
         <w:t>RAM Address Control</w:t>
       </w:r>
-      <w:bookmarkEnd w:id="32"/>
+      <w:bookmarkEnd w:id="34"/>
     </w:p>
     <w:p>
       <w:pPr>
@@ -11682,14 +12053,14 @@
           <w:lang w:eastAsia="en-GB"/>
         </w:rPr>
       </w:pPr>
-      <w:bookmarkStart w:id="33" w:name="_Toc233800369"/>
+      <w:bookmarkStart w:id="35" w:name="_Toc233901924"/>
       <w:r>
         <w:rPr>
           <w:lang w:eastAsia="en-GB"/>
         </w:rPr>
         <w:t>Temp 16 Bit Latch1</w:t>
       </w:r>
-      <w:bookmarkEnd w:id="33"/>
+      <w:bookmarkEnd w:id="35"/>
     </w:p>
     <w:p>
       <w:pPr>
@@ -11939,14 +12310,14 @@
           <w:lang w:eastAsia="en-GB"/>
         </w:rPr>
       </w:pPr>
-      <w:bookmarkStart w:id="34" w:name="_Toc233800370"/>
+      <w:bookmarkStart w:id="36" w:name="_Toc233901925"/>
       <w:r>
         <w:rPr>
           <w:lang w:eastAsia="en-GB"/>
         </w:rPr>
         <w:t>Temp 16 Bit Latch2</w:t>
       </w:r>
-      <w:bookmarkEnd w:id="34"/>
+      <w:bookmarkEnd w:id="36"/>
     </w:p>
     <w:p>
       <w:pPr>
@@ -12012,7 +12383,7 @@
           <w:lang w:eastAsia="en-GB"/>
         </w:rPr>
       </w:pPr>
-      <w:bookmarkStart w:id="35" w:name="_Toc233800371"/>
+      <w:bookmarkStart w:id="37" w:name="_Toc233901926"/>
       <w:r>
         <w:rPr>
           <w:lang w:eastAsia="en-GB"/>
@@ -12020,7 +12391,7 @@
         <w:lastRenderedPageBreak/>
         <w:t>16 Bit Tristate Buffer</w:t>
       </w:r>
-      <w:bookmarkEnd w:id="35"/>
+      <w:bookmarkEnd w:id="37"/>
     </w:p>
     <w:p>
       <w:pPr>
@@ -12142,8 +12513,8 @@
           <w:lang w:eastAsia="en-GB"/>
         </w:rPr>
       </w:pPr>
-      <w:bookmarkStart w:id="36" w:name="_Ref233797296"/>
-      <w:bookmarkStart w:id="37" w:name="_Toc233800372"/>
+      <w:bookmarkStart w:id="38" w:name="_Ref233797296"/>
+      <w:bookmarkStart w:id="39" w:name="_Toc233901927"/>
       <w:r>
         <w:rPr>
           <w:lang w:eastAsia="en-GB"/>
@@ -12157,8 +12528,8 @@
         </w:rPr>
         <w:t>or Sequence Control</w:t>
       </w:r>
-      <w:bookmarkEnd w:id="36"/>
-      <w:bookmarkEnd w:id="37"/>
+      <w:bookmarkEnd w:id="38"/>
+      <w:bookmarkEnd w:id="39"/>
     </w:p>
     <w:p>
       <w:pPr>
@@ -12323,8 +12694,8 @@
         <w:pStyle w:val="Caption"/>
         <w:jc w:val="center"/>
       </w:pPr>
-      <w:bookmarkStart w:id="38" w:name="_Ref233641691"/>
-      <w:bookmarkStart w:id="39" w:name="_Toc233800381"/>
+      <w:bookmarkStart w:id="40" w:name="_Ref233641691"/>
+      <w:bookmarkStart w:id="41" w:name="_Toc233901936"/>
       <w:r>
         <w:t xml:space="preserve">Figure </w:t>
       </w:r>
@@ -12336,7 +12707,7 @@
           <w:t>6</w:t>
         </w:r>
       </w:fldSimple>
-      <w:bookmarkEnd w:id="38"/>
+      <w:bookmarkEnd w:id="40"/>
       <w:r>
         <w:t xml:space="preserve">:   Sequence Control part of </w:t>
       </w:r>
@@ -12358,7 +12729,7 @@
         </w:rPr>
         <w:t>2</w:t>
       </w:r>
-      <w:bookmarkEnd w:id="39"/>
+      <w:bookmarkEnd w:id="41"/>
       <w:r>
         <w:fldChar w:fldCharType="end"/>
       </w:r>
@@ -12477,8 +12848,8 @@
         <w:pStyle w:val="Caption"/>
         <w:jc w:val="center"/>
       </w:pPr>
-      <w:bookmarkStart w:id="40" w:name="_Ref233648800"/>
-      <w:bookmarkStart w:id="41" w:name="_Toc233800382"/>
+      <w:bookmarkStart w:id="42" w:name="_Ref233648800"/>
+      <w:bookmarkStart w:id="43" w:name="_Toc233901937"/>
       <w:r>
         <w:t xml:space="preserve">Figure </w:t>
       </w:r>
@@ -12490,11 +12861,11 @@
           <w:t>7</w:t>
         </w:r>
       </w:fldSimple>
-      <w:bookmarkEnd w:id="40"/>
+      <w:bookmarkEnd w:id="42"/>
       <w:r>
         <w:t>:   Sequence Control L2 Block Diagram</w:t>
       </w:r>
-      <w:bookmarkEnd w:id="41"/>
+      <w:bookmarkEnd w:id="43"/>
     </w:p>
     <w:p>
       <w:r>
@@ -12574,7 +12945,8 @@
           <w:lang w:eastAsia="en-GB"/>
         </w:rPr>
       </w:pPr>
-      <w:bookmarkStart w:id="42" w:name="_Toc233800373"/>
+      <w:bookmarkStart w:id="44" w:name="_Ref233901870"/>
+      <w:bookmarkStart w:id="45" w:name="_Toc233901928"/>
       <w:r>
         <w:rPr>
           <w:lang w:eastAsia="en-GB"/>
@@ -12582,7 +12954,8 @@
         <w:lastRenderedPageBreak/>
         <w:t>5 Bit Counter</w:t>
       </w:r>
-      <w:bookmarkEnd w:id="42"/>
+      <w:bookmarkEnd w:id="44"/>
+      <w:bookmarkEnd w:id="45"/>
     </w:p>
     <w:p>
       <w:pPr>
@@ -12643,62 +13016,1256 @@
         <w:rPr>
           <w:lang w:eastAsia="en-GB"/>
         </w:rPr>
-        <w:t>If (RESET OR SEQ_END) is high the counter output will be reset to 0.</w:t>
-      </w:r>
-    </w:p>
-    <w:p>
-      <w:pPr>
-        <w:rPr>
-          <w:lang w:eastAsia="en-GB"/>
-        </w:rPr>
-      </w:pPr>
-      <w:r>
-        <w:rPr>
-          <w:lang w:eastAsia="en-GB"/>
-        </w:rPr>
-        <w:t>If (RESET OR SEQ_END) is low, a rising edge on the clock signal will increment the counter.</w:t>
-      </w:r>
-    </w:p>
-    <w:p>
-      <w:pPr>
-        <w:rPr>
-          <w:lang w:eastAsia="en-GB"/>
-        </w:rPr>
-      </w:pPr>
-      <w:r>
-        <w:rPr>
-          <w:lang w:eastAsia="en-GB"/>
-        </w:rPr>
-        <w:t>When the counter output is 0, OLS will be high, otherwise it will be low.</w:t>
-      </w:r>
-    </w:p>
-    <w:p>
-      <w:pPr>
-        <w:rPr>
-          <w:lang w:eastAsia="en-GB"/>
-        </w:rPr>
-      </w:pPr>
-      <w:r>
-        <w:rPr>
-          <w:lang w:eastAsia="en-GB"/>
-        </w:rPr>
-        <w:t>&lt;</w:t>
-      </w:r>
-      <w:proofErr w:type="spellStart"/>
+        <w:t>The timing requirements for this block</w:t>
+      </w:r>
+      <w:r>
+        <w:rPr>
+          <w:lang w:eastAsia="en-GB"/>
+        </w:rPr>
+        <w:t xml:space="preserve"> when </w:t>
+      </w:r>
+      <w:r>
+        <w:rPr>
+          <w:lang w:eastAsia="en-GB"/>
+        </w:rPr>
+        <w:t>RESET</w:t>
+      </w:r>
+      <w:r>
+        <w:rPr>
+          <w:lang w:eastAsia="en-GB"/>
+        </w:rPr>
+        <w:t xml:space="preserve"> is low</w:t>
+      </w:r>
+      <w:r>
+        <w:rPr>
+          <w:lang w:eastAsia="en-GB"/>
+        </w:rPr>
+        <w:t xml:space="preserve"> </w:t>
+      </w:r>
+      <w:r>
+        <w:rPr>
+          <w:lang w:eastAsia="en-GB"/>
+        </w:rPr>
+        <w:t xml:space="preserve">are shown in </w:t>
+      </w:r>
+      <w:r>
+        <w:rPr>
+          <w:lang w:eastAsia="en-GB"/>
+        </w:rPr>
+        <w:fldChar w:fldCharType="begin"/>
+      </w:r>
+      <w:r>
+        <w:rPr>
+          <w:lang w:eastAsia="en-GB"/>
+        </w:rPr>
+        <w:instrText xml:space="preserve"> REF _Ref233894277 \h </w:instrText>
+      </w:r>
+      <w:r>
+        <w:rPr>
+          <w:lang w:eastAsia="en-GB"/>
+        </w:rPr>
+      </w:r>
+      <w:r>
+        <w:rPr>
+          <w:lang w:eastAsia="en-GB"/>
+        </w:rPr>
+        <w:fldChar w:fldCharType="separate"/>
+      </w:r>
+      <w:r>
+        <w:t xml:space="preserve">Figure </w:t>
+      </w:r>
+      <w:r>
+        <w:rPr>
+          <w:noProof/>
+        </w:rPr>
+        <w:t>8</w:t>
+      </w:r>
+      <w:r>
+        <w:rPr>
+          <w:lang w:eastAsia="en-GB"/>
+        </w:rPr>
+        <w:fldChar w:fldCharType="end"/>
+      </w:r>
+      <w:r>
+        <w:rPr>
+          <w:lang w:eastAsia="en-GB"/>
+        </w:rPr>
+        <w:t>.</w:t>
+      </w:r>
+    </w:p>
+    <w:p>
+      <w:pPr>
+        <w:keepNext/>
+        <w:jc w:val="center"/>
+      </w:pPr>
+      <w:r>
+        <w:rPr>
+          <w:noProof/>
+          <w:lang w:eastAsia="en-GB"/>
+        </w:rPr>
+        <w:drawing>
+          <wp:inline distT="0" distB="0" distL="0" distR="0">
+            <wp:extent cx="2934000" cy="2027475"/>
+            <wp:effectExtent l="19050" t="0" r="0" b="0"/>
+            <wp:docPr id="9" name="Picture 4"/>
+            <wp:cNvGraphicFramePr>
+              <a:graphicFrameLocks xmlns:a="http://schemas.openxmlformats.org/drawingml/2006/main" noChangeAspect="1"/>
+            </wp:cNvGraphicFramePr>
+            <a:graphic xmlns:a="http://schemas.openxmlformats.org/drawingml/2006/main">
+              <a:graphicData uri="http://schemas.openxmlformats.org/drawingml/2006/picture">
+                <pic:pic xmlns:pic="http://schemas.openxmlformats.org/drawingml/2006/picture">
+                  <pic:nvPicPr>
+                    <pic:cNvPr id="0" name="Picture 4"/>
+                    <pic:cNvPicPr>
+                      <a:picLocks noChangeAspect="1" noChangeArrowheads="1"/>
+                    </pic:cNvPicPr>
+                  </pic:nvPicPr>
+                  <pic:blipFill>
+                    <a:blip r:embed="rId18" cstate="print"/>
+                    <a:srcRect/>
+                    <a:stretch>
+                      <a:fillRect/>
+                    </a:stretch>
+                  </pic:blipFill>
+                  <pic:spPr bwMode="auto">
+                    <a:xfrm>
+                      <a:off x="0" y="0"/>
+                      <a:ext cx="2934000" cy="2027475"/>
+                    </a:xfrm>
+                    <a:prstGeom prst="rect">
+                      <a:avLst/>
+                    </a:prstGeom>
+                    <a:noFill/>
+                    <a:ln w="9525">
+                      <a:noFill/>
+                      <a:miter lim="800000"/>
+                      <a:headEnd/>
+                      <a:tailEnd/>
+                    </a:ln>
+                  </pic:spPr>
+                </pic:pic>
+              </a:graphicData>
+            </a:graphic>
+          </wp:inline>
+        </w:drawing>
+      </w:r>
+    </w:p>
+    <w:p>
+      <w:pPr>
+        <w:pStyle w:val="Caption"/>
+        <w:jc w:val="center"/>
+      </w:pPr>
+      <w:bookmarkStart w:id="46" w:name="_Ref233894277"/>
+      <w:bookmarkStart w:id="47" w:name="_Ref233894262"/>
+      <w:bookmarkStart w:id="48" w:name="_Toc233901938"/>
+      <w:r>
+        <w:t xml:space="preserve">Figure </w:t>
+      </w:r>
+      <w:fldSimple w:instr=" SEQ Figure \* ARABIC ">
+        <w:r>
+          <w:rPr>
+            <w:noProof/>
+          </w:rPr>
+          <w:t>8</w:t>
+        </w:r>
+      </w:fldSimple>
+      <w:bookmarkEnd w:id="46"/>
+      <w:r>
+        <w:t>:   Timing requirements for 5 bit counter</w:t>
+      </w:r>
+      <w:bookmarkEnd w:id="47"/>
+      <w:r>
+        <w:t xml:space="preserve"> when RESET is low</w:t>
+      </w:r>
+      <w:bookmarkEnd w:id="48"/>
+    </w:p>
+    <w:p>
+      <w:pPr>
+        <w:rPr>
+          <w:lang w:eastAsia="en-GB"/>
+        </w:rPr>
+      </w:pPr>
+      <w:r>
+        <w:rPr>
+          <w:lang w:eastAsia="en-GB"/>
+        </w:rPr>
+        <w:t xml:space="preserve">Notes about </w:t>
+      </w:r>
+      <w:r>
+        <w:rPr>
+          <w:lang w:eastAsia="en-GB"/>
+        </w:rPr>
+        <w:fldChar w:fldCharType="begin"/>
+      </w:r>
+      <w:r>
+        <w:rPr>
+          <w:lang w:eastAsia="en-GB"/>
+        </w:rPr>
+        <w:instrText xml:space="preserve"> REF _Ref233894277 \h </w:instrText>
+      </w:r>
+      <w:r>
+        <w:rPr>
+          <w:lang w:eastAsia="en-GB"/>
+        </w:rPr>
+      </w:r>
+      <w:r>
+        <w:rPr>
+          <w:lang w:eastAsia="en-GB"/>
+        </w:rPr>
+        <w:fldChar w:fldCharType="separate"/>
+      </w:r>
+      <w:r>
+        <w:t xml:space="preserve">Figure </w:t>
+      </w:r>
+      <w:r>
+        <w:rPr>
+          <w:noProof/>
+        </w:rPr>
+        <w:t>8</w:t>
+      </w:r>
+      <w:r>
+        <w:rPr>
+          <w:lang w:eastAsia="en-GB"/>
+        </w:rPr>
+        <w:fldChar w:fldCharType="end"/>
+      </w:r>
+      <w:r>
+        <w:rPr>
+          <w:lang w:eastAsia="en-GB"/>
+        </w:rPr>
+        <w:t>:</w:t>
+      </w:r>
+    </w:p>
+    <w:p>
+      <w:pPr>
+        <w:pStyle w:val="ListParagraph"/>
+        <w:numPr>
+          <w:ilvl w:val="0"/>
+          <w:numId w:val="40"/>
+        </w:numPr>
+        <w:rPr>
+          <w:lang w:eastAsia="en-GB"/>
+        </w:rPr>
+      </w:pPr>
+      <w:r>
+        <w:rPr>
+          <w:lang w:eastAsia="en-GB"/>
+        </w:rPr>
+        <w:t xml:space="preserve">STEP is as shown in ref </w:t>
+      </w:r>
+      <w:r>
+        <w:rPr>
+          <w:lang w:eastAsia="en-GB"/>
+        </w:rPr>
+        <w:fldChar w:fldCharType="begin"/>
+      </w:r>
+      <w:r>
+        <w:rPr>
+          <w:lang w:eastAsia="en-GB"/>
+        </w:rPr>
+        <w:instrText xml:space="preserve"> REF RefL1SeqXlsx \r \h </w:instrText>
+      </w:r>
+      <w:r>
+        <w:rPr>
+          <w:lang w:eastAsia="en-GB"/>
+        </w:rPr>
+      </w:r>
+      <w:r>
+        <w:rPr>
+          <w:lang w:eastAsia="en-GB"/>
+        </w:rPr>
+        <w:fldChar w:fldCharType="separate"/>
+      </w:r>
+      <w:r>
+        <w:rPr>
+          <w:lang w:eastAsia="en-GB"/>
+        </w:rPr>
+        <w:t>3</w:t>
+      </w:r>
+      <w:r>
+        <w:rPr>
+          <w:lang w:eastAsia="en-GB"/>
+        </w:rPr>
+        <w:fldChar w:fldCharType="end"/>
+      </w:r>
+      <w:r>
+        <w:rPr>
+          <w:lang w:eastAsia="en-GB"/>
+        </w:rPr>
+        <w:t xml:space="preserve">. </w:t>
+      </w:r>
+      <w:r>
+        <w:rPr>
+          <w:lang w:eastAsia="en-GB"/>
+        </w:rPr>
+        <w:t>It is the count output from the 5 bit counter.</w:t>
+      </w:r>
+    </w:p>
+    <w:p>
+      <w:pPr>
+        <w:pStyle w:val="ListParagraph"/>
+        <w:numPr>
+          <w:ilvl w:val="1"/>
+          <w:numId w:val="40"/>
+        </w:numPr>
+        <w:rPr>
+          <w:lang w:eastAsia="en-GB"/>
+        </w:rPr>
+      </w:pPr>
+      <w:r>
+        <w:rPr>
+          <w:lang w:eastAsia="en-GB"/>
+        </w:rPr>
+        <w:t xml:space="preserve">The figure shows the last two steps (N-1 and N) of the previous sequence and </w:t>
+      </w:r>
+    </w:p>
+    <w:p>
+      <w:pPr>
+        <w:pStyle w:val="ListParagraph"/>
+        <w:numPr>
+          <w:ilvl w:val="1"/>
+          <w:numId w:val="40"/>
+        </w:numPr>
+        <w:rPr>
+          <w:lang w:eastAsia="en-GB"/>
+        </w:rPr>
+      </w:pPr>
+      <w:r>
+        <w:rPr>
+          <w:lang w:eastAsia="en-GB"/>
+        </w:rPr>
+        <w:t>T</w:t>
+      </w:r>
+      <w:r>
+        <w:rPr>
+          <w:lang w:eastAsia="en-GB"/>
+        </w:rPr>
+        <w:t>he first two steps (0 and 1) of the new sequence.</w:t>
+      </w:r>
+    </w:p>
+    <w:p>
+      <w:pPr>
+        <w:pStyle w:val="ListParagraph"/>
+        <w:numPr>
+          <w:ilvl w:val="0"/>
+          <w:numId w:val="40"/>
+        </w:numPr>
+        <w:rPr>
+          <w:lang w:eastAsia="en-GB"/>
+        </w:rPr>
+      </w:pPr>
+      <w:r>
+        <w:rPr>
+          <w:lang w:eastAsia="en-GB"/>
+        </w:rPr>
+        <w:t xml:space="preserve">SEQ_END is produced by one of the sequence ROM outputs (see </w:t>
+      </w:r>
+      <w:r>
+        <w:rPr>
+          <w:lang w:eastAsia="en-GB"/>
+        </w:rPr>
+        <w:fldChar w:fldCharType="begin"/>
+      </w:r>
+      <w:r>
+        <w:rPr>
+          <w:lang w:eastAsia="en-GB"/>
+        </w:rPr>
+        <w:instrText xml:space="preserve"> REF _Ref233543378 \r \h </w:instrText>
+      </w:r>
+      <w:r>
+        <w:rPr>
+          <w:lang w:eastAsia="en-GB"/>
+        </w:rPr>
+      </w:r>
+      <w:r>
+        <w:rPr>
+          <w:lang w:eastAsia="en-GB"/>
+        </w:rPr>
+        <w:fldChar w:fldCharType="separate"/>
+      </w:r>
+      <w:r>
+        <w:rPr>
+          <w:lang w:eastAsia="en-GB"/>
+        </w:rPr>
+        <w:t>3.5</w:t>
+      </w:r>
+      <w:r>
+        <w:rPr>
+          <w:lang w:eastAsia="en-GB"/>
+        </w:rPr>
+        <w:fldChar w:fldCharType="end"/>
+      </w:r>
+      <w:r>
+        <w:rPr>
+          <w:lang w:eastAsia="en-GB"/>
+        </w:rPr>
+        <w:t>)</w:t>
+      </w:r>
+    </w:p>
+    <w:p>
+      <w:pPr>
+        <w:pStyle w:val="ListParagraph"/>
+        <w:numPr>
+          <w:ilvl w:val="1"/>
+          <w:numId w:val="40"/>
+        </w:numPr>
+        <w:rPr>
+          <w:lang w:eastAsia="en-GB"/>
+        </w:rPr>
+      </w:pPr>
+      <w:r>
+        <w:rPr>
+          <w:lang w:eastAsia="en-GB"/>
+        </w:rPr>
+        <w:t>The 5 bit counter must be reset to 0 when SEQ_END is high and there is a rising edge on CLOCK.</w:t>
+      </w:r>
+    </w:p>
+    <w:p>
+      <w:pPr>
+        <w:pStyle w:val="ListParagraph"/>
+        <w:numPr>
+          <w:ilvl w:val="1"/>
+          <w:numId w:val="40"/>
+        </w:numPr>
+        <w:rPr>
+          <w:lang w:eastAsia="en-GB"/>
+        </w:rPr>
+      </w:pPr>
+      <w:r>
+        <w:rPr>
+          <w:lang w:eastAsia="en-GB"/>
+        </w:rPr>
+        <w:t>When SEQ_END is low a rising edge on CLOCK must increment the counter.</w:t>
+      </w:r>
+    </w:p>
+    <w:p>
+      <w:pPr>
+        <w:pStyle w:val="ListParagraph"/>
+        <w:numPr>
+          <w:ilvl w:val="0"/>
+          <w:numId w:val="40"/>
+        </w:numPr>
+        <w:rPr>
+          <w:lang w:eastAsia="en-GB"/>
+        </w:rPr>
+      </w:pPr>
+      <w:r>
+        <w:rPr>
+          <w:lang w:eastAsia="en-GB"/>
+        </w:rPr>
+        <w:t xml:space="preserve">INC_PC is not used by the IS. </w:t>
+      </w:r>
+    </w:p>
+    <w:p>
+      <w:pPr>
+        <w:pStyle w:val="ListParagraph"/>
+        <w:numPr>
+          <w:ilvl w:val="1"/>
+          <w:numId w:val="40"/>
+        </w:numPr>
+        <w:rPr>
+          <w:lang w:eastAsia="en-GB"/>
+        </w:rPr>
+      </w:pPr>
+      <w:r>
+        <w:rPr>
+          <w:lang w:eastAsia="en-GB"/>
+        </w:rPr>
+        <w:t xml:space="preserve">It is shown in this figure because it is what causes OPCODE to change from the previous (OLD) opcode to the </w:t>
+      </w:r>
+      <w:r>
+        <w:rPr>
+          <w:lang w:eastAsia="en-GB"/>
+        </w:rPr>
+        <w:t xml:space="preserve">NEW </w:t>
+      </w:r>
+      <w:r>
+        <w:rPr>
+          <w:lang w:eastAsia="en-GB"/>
+        </w:rPr>
+        <w:t>opcode.</w:t>
+      </w:r>
+    </w:p>
+    <w:p>
+      <w:pPr>
+        <w:pStyle w:val="ListParagraph"/>
+        <w:numPr>
+          <w:ilvl w:val="1"/>
+          <w:numId w:val="40"/>
+        </w:numPr>
+        <w:rPr>
+          <w:lang w:eastAsia="en-GB"/>
+        </w:rPr>
+      </w:pPr>
+      <w:r>
+        <w:rPr>
+          <w:lang w:eastAsia="en-GB"/>
+        </w:rPr>
+        <w:t>Most sequences increment the PC on the last step of the sequence, but some set it to the new value (Followed jump, RET and CALL) set it earlier in the sequence. Worst case, for new opcode being available, is when it’s done on the last step.</w:t>
+      </w:r>
+    </w:p>
+    <w:p>
+      <w:pPr>
+        <w:pStyle w:val="ListParagraph"/>
+        <w:numPr>
+          <w:ilvl w:val="0"/>
+          <w:numId w:val="40"/>
+        </w:numPr>
+        <w:rPr>
+          <w:lang w:eastAsia="en-GB"/>
+        </w:rPr>
+      </w:pPr>
+      <w:r>
+        <w:rPr>
+          <w:lang w:eastAsia="en-GB"/>
+        </w:rPr>
+        <w:t>OPCODE is the output from the Code ROM (not the sequence ROM)</w:t>
+      </w:r>
+    </w:p>
+    <w:p>
+      <w:pPr>
+        <w:pStyle w:val="ListParagraph"/>
+        <w:numPr>
+          <w:ilvl w:val="0"/>
+          <w:numId w:val="40"/>
+        </w:numPr>
+        <w:rPr>
+          <w:lang w:eastAsia="en-GB"/>
+        </w:rPr>
+      </w:pPr>
+      <w:r>
+        <w:rPr>
+          <w:lang w:eastAsia="en-GB"/>
+        </w:rPr>
+        <w:t xml:space="preserve">OLS is the signal that latches the new opcode into the IS opcode latch (see </w:t>
+      </w:r>
+      <w:r>
+        <w:rPr>
+          <w:lang w:eastAsia="en-GB"/>
+        </w:rPr>
+        <w:fldChar w:fldCharType="begin"/>
+      </w:r>
+      <w:r>
+        <w:rPr>
+          <w:lang w:eastAsia="en-GB"/>
+        </w:rPr>
+        <w:instrText xml:space="preserve"> REF _Ref233894649 \r \h </w:instrText>
+      </w:r>
+      <w:r>
+        <w:rPr>
+          <w:lang w:eastAsia="en-GB"/>
+        </w:rPr>
+      </w:r>
+      <w:r>
+        <w:rPr>
+          <w:lang w:eastAsia="en-GB"/>
+        </w:rPr>
+        <w:fldChar w:fldCharType="separate"/>
+      </w:r>
+      <w:r>
+        <w:rPr>
+          <w:lang w:eastAsia="en-GB"/>
+        </w:rPr>
+        <w:t>3.1</w:t>
+      </w:r>
+      <w:r>
+        <w:rPr>
+          <w:lang w:eastAsia="en-GB"/>
+        </w:rPr>
+        <w:fldChar w:fldCharType="end"/>
+      </w:r>
+      <w:r>
+        <w:rPr>
+          <w:lang w:eastAsia="en-GB"/>
+        </w:rPr>
+        <w:t>).</w:t>
+      </w:r>
+    </w:p>
+    <w:p>
+      <w:pPr>
+        <w:pStyle w:val="ListParagraph"/>
+        <w:numPr>
+          <w:ilvl w:val="1"/>
+          <w:numId w:val="40"/>
+        </w:numPr>
+        <w:rPr>
+          <w:lang w:eastAsia="en-GB"/>
+        </w:rPr>
+      </w:pPr>
+      <w:r>
+        <w:rPr>
+          <w:lang w:eastAsia="en-GB"/>
+        </w:rPr>
+        <w:t>OLS = SEQ_END AND !CLOCK</w:t>
+      </w:r>
+      <w:r>
+        <w:rPr>
+          <w:lang w:eastAsia="en-GB"/>
+        </w:rPr>
+        <w:br w:type="page"/>
+      </w:r>
+    </w:p>
+    <w:p>
+      <w:pPr>
+        <w:rPr>
+          <w:lang w:eastAsia="en-GB"/>
+        </w:rPr>
+      </w:pPr>
+      <w:r>
+        <w:rPr>
+          <w:lang w:eastAsia="en-GB"/>
+        </w:rPr>
+        <w:lastRenderedPageBreak/>
+        <w:t xml:space="preserve">The timing requirements for this block when </w:t>
+      </w:r>
+      <w:r>
+        <w:rPr>
+          <w:lang w:eastAsia="en-GB"/>
+        </w:rPr>
+        <w:t>RESET</w:t>
+      </w:r>
+      <w:r>
+        <w:rPr>
+          <w:lang w:eastAsia="en-GB"/>
+        </w:rPr>
+        <w:t xml:space="preserve"> is high are shown in </w:t>
+      </w:r>
+      <w:r>
+        <w:rPr>
+          <w:lang w:eastAsia="en-GB"/>
+        </w:rPr>
+        <w:fldChar w:fldCharType="begin"/>
+      </w:r>
+      <w:r>
+        <w:rPr>
+          <w:lang w:eastAsia="en-GB"/>
+        </w:rPr>
+        <w:instrText xml:space="preserve"> REF _Ref233899110 \h </w:instrText>
+      </w:r>
+      <w:r>
+        <w:rPr>
+          <w:lang w:eastAsia="en-GB"/>
+        </w:rPr>
+      </w:r>
+      <w:r>
+        <w:rPr>
+          <w:lang w:eastAsia="en-GB"/>
+        </w:rPr>
+        <w:fldChar w:fldCharType="separate"/>
+      </w:r>
+      <w:r>
+        <w:t xml:space="preserve">Figure </w:t>
+      </w:r>
+      <w:r>
+        <w:rPr>
+          <w:noProof/>
+        </w:rPr>
+        <w:t>9</w:t>
+      </w:r>
+      <w:r>
+        <w:rPr>
+          <w:lang w:eastAsia="en-GB"/>
+        </w:rPr>
+        <w:fldChar w:fldCharType="end"/>
+      </w:r>
+      <w:r>
+        <w:rPr>
+          <w:lang w:eastAsia="en-GB"/>
+        </w:rPr>
+        <w:t>.</w:t>
+      </w:r>
+    </w:p>
+    <w:p>
+      <w:pPr>
+        <w:jc w:val="center"/>
+        <w:rPr>
+          <w:lang w:eastAsia="en-GB"/>
+        </w:rPr>
+      </w:pPr>
+      <w:r>
+        <w:rPr>
+          <w:noProof/>
+          <w:lang w:eastAsia="en-GB"/>
+        </w:rPr>
+        <w:drawing>
+          <wp:inline distT="0" distB="0" distL="0" distR="0">
+            <wp:extent cx="2919580" cy="1731600"/>
+            <wp:effectExtent l="19050" t="0" r="0" b="0"/>
+            <wp:docPr id="13" name="Picture 13"/>
+            <wp:cNvGraphicFramePr>
+              <a:graphicFrameLocks xmlns:a="http://schemas.openxmlformats.org/drawingml/2006/main" noChangeAspect="1"/>
+            </wp:cNvGraphicFramePr>
+            <a:graphic xmlns:a="http://schemas.openxmlformats.org/drawingml/2006/main">
+              <a:graphicData uri="http://schemas.openxmlformats.org/drawingml/2006/picture">
+                <pic:pic xmlns:pic="http://schemas.openxmlformats.org/drawingml/2006/picture">
+                  <pic:nvPicPr>
+                    <pic:cNvPr id="0" name="Picture 13"/>
+                    <pic:cNvPicPr>
+                      <a:picLocks noChangeAspect="1" noChangeArrowheads="1"/>
+                    </pic:cNvPicPr>
+                  </pic:nvPicPr>
+                  <pic:blipFill>
+                    <a:blip r:embed="rId19" cstate="print"/>
+                    <a:srcRect/>
+                    <a:stretch>
+                      <a:fillRect/>
+                    </a:stretch>
+                  </pic:blipFill>
+                  <pic:spPr bwMode="auto">
+                    <a:xfrm>
+                      <a:off x="0" y="0"/>
+                      <a:ext cx="2919580" cy="1731600"/>
+                    </a:xfrm>
+                    <a:prstGeom prst="rect">
+                      <a:avLst/>
+                    </a:prstGeom>
+                    <a:noFill/>
+                    <a:ln w="9525">
+                      <a:noFill/>
+                      <a:miter lim="800000"/>
+                      <a:headEnd/>
+                      <a:tailEnd/>
+                    </a:ln>
+                  </pic:spPr>
+                </pic:pic>
+              </a:graphicData>
+            </a:graphic>
+          </wp:inline>
+        </w:drawing>
+      </w:r>
+    </w:p>
+    <w:p>
+      <w:pPr>
+        <w:pStyle w:val="Caption"/>
+        <w:jc w:val="center"/>
+      </w:pPr>
+      <w:bookmarkStart w:id="49" w:name="_Ref233899110"/>
+      <w:bookmarkStart w:id="50" w:name="_Toc233901939"/>
+      <w:r>
+        <w:t xml:space="preserve">Figure </w:t>
+      </w:r>
+      <w:fldSimple w:instr=" SEQ Figure \* ARABIC ">
+        <w:r>
+          <w:rPr>
+            <w:noProof/>
+          </w:rPr>
+          <w:t>9</w:t>
+        </w:r>
+      </w:fldSimple>
+      <w:bookmarkEnd w:id="49"/>
+      <w:r>
+        <w:t>:   Timing requirements for 5 bit counter when RESET is high</w:t>
+      </w:r>
+      <w:bookmarkEnd w:id="50"/>
+    </w:p>
+    <w:p>
+      <w:pPr>
+        <w:rPr>
+          <w:lang w:eastAsia="en-GB"/>
+        </w:rPr>
+      </w:pPr>
+      <w:r>
+        <w:rPr>
+          <w:lang w:eastAsia="en-GB"/>
+        </w:rPr>
+        <w:t xml:space="preserve">Notes about </w:t>
+      </w:r>
+      <w:r>
+        <w:rPr>
+          <w:lang w:eastAsia="en-GB"/>
+        </w:rPr>
+        <w:fldChar w:fldCharType="begin"/>
+      </w:r>
+      <w:r>
+        <w:rPr>
+          <w:lang w:eastAsia="en-GB"/>
+        </w:rPr>
+        <w:instrText xml:space="preserve"> REF _Ref233899110 \h </w:instrText>
+      </w:r>
+      <w:r>
+        <w:rPr>
+          <w:lang w:eastAsia="en-GB"/>
+        </w:rPr>
+      </w:r>
+      <w:r>
+        <w:rPr>
+          <w:lang w:eastAsia="en-GB"/>
+        </w:rPr>
+        <w:fldChar w:fldCharType="separate"/>
+      </w:r>
+      <w:r>
+        <w:t xml:space="preserve">Figure </w:t>
+      </w:r>
+      <w:r>
+        <w:rPr>
+          <w:noProof/>
+        </w:rPr>
+        <w:t>9</w:t>
+      </w:r>
+      <w:r>
+        <w:rPr>
+          <w:lang w:eastAsia="en-GB"/>
+        </w:rPr>
+        <w:fldChar w:fldCharType="end"/>
+      </w:r>
+      <w:r>
+        <w:rPr>
+          <w:lang w:eastAsia="en-GB"/>
+        </w:rPr>
+        <w:t>:</w:t>
+      </w:r>
+    </w:p>
+    <w:p>
+      <w:pPr>
+        <w:pStyle w:val="ListParagraph"/>
+        <w:numPr>
+          <w:ilvl w:val="0"/>
+          <w:numId w:val="41"/>
+        </w:numPr>
+        <w:rPr>
+          <w:lang w:eastAsia="en-GB"/>
+        </w:rPr>
+      </w:pPr>
+      <w:r>
+        <w:rPr>
+          <w:lang w:eastAsia="en-GB"/>
+        </w:rPr>
+        <w:t xml:space="preserve">STEP is as shown in ref </w:t>
+      </w:r>
+      <w:r>
+        <w:rPr>
+          <w:lang w:eastAsia="en-GB"/>
+        </w:rPr>
+        <w:fldChar w:fldCharType="begin"/>
+      </w:r>
+      <w:r>
+        <w:rPr>
+          <w:lang w:eastAsia="en-GB"/>
+        </w:rPr>
+        <w:instrText xml:space="preserve"> REF RefL1SeqXlsx \r \h </w:instrText>
+      </w:r>
+      <w:r>
+        <w:rPr>
+          <w:lang w:eastAsia="en-GB"/>
+        </w:rPr>
+      </w:r>
+      <w:r>
+        <w:rPr>
+          <w:lang w:eastAsia="en-GB"/>
+        </w:rPr>
+        <w:fldChar w:fldCharType="separate"/>
+      </w:r>
+      <w:r>
+        <w:rPr>
+          <w:lang w:eastAsia="en-GB"/>
+        </w:rPr>
+        <w:t>3</w:t>
+      </w:r>
+      <w:r>
+        <w:rPr>
+          <w:lang w:eastAsia="en-GB"/>
+        </w:rPr>
+        <w:fldChar w:fldCharType="end"/>
+      </w:r>
+      <w:r>
+        <w:rPr>
+          <w:lang w:eastAsia="en-GB"/>
+        </w:rPr>
+        <w:t>. It is the count output from the 5 bit counter.</w:t>
+      </w:r>
+    </w:p>
+    <w:p>
+      <w:pPr>
+        <w:pStyle w:val="ListParagraph"/>
+        <w:numPr>
+          <w:ilvl w:val="1"/>
+          <w:numId w:val="41"/>
+        </w:numPr>
+        <w:rPr>
+          <w:lang w:eastAsia="en-GB"/>
+        </w:rPr>
+      </w:pPr>
+      <w:bookmarkStart w:id="51" w:name="CurrentEditPos"/>
+      <w:bookmarkEnd w:id="51"/>
+      <w:r>
+        <w:rPr>
+          <w:lang w:eastAsia="en-GB"/>
+        </w:rPr>
+        <w:t>When RESET is high the count is reset to 0</w:t>
+      </w:r>
+      <w:r>
+        <w:rPr>
+          <w:lang w:eastAsia="en-GB"/>
+        </w:rPr>
+        <w:t xml:space="preserve"> and kept at 0.</w:t>
+      </w:r>
+    </w:p>
+    <w:p>
+      <w:pPr>
+        <w:pStyle w:val="ListParagraph"/>
+        <w:numPr>
+          <w:ilvl w:val="0"/>
+          <w:numId w:val="41"/>
+        </w:numPr>
+        <w:rPr>
+          <w:lang w:eastAsia="en-GB"/>
+        </w:rPr>
+      </w:pPr>
+      <w:r>
+        <w:rPr>
+          <w:lang w:eastAsia="en-GB"/>
+        </w:rPr>
+        <w:t xml:space="preserve">RESET is the “power up reset” as defined in </w:t>
+      </w:r>
+      <w:r>
+        <w:rPr>
+          <w:lang w:eastAsia="en-GB"/>
+        </w:rPr>
+        <w:fldChar w:fldCharType="begin"/>
+      </w:r>
+      <w:r>
+        <w:rPr>
+          <w:lang w:eastAsia="en-GB"/>
+        </w:rPr>
+        <w:instrText xml:space="preserve"> REF _Ref233900184 \r \h </w:instrText>
+      </w:r>
+      <w:r>
+        <w:rPr>
+          <w:lang w:eastAsia="en-GB"/>
+        </w:rPr>
+      </w:r>
+      <w:r>
+        <w:rPr>
+          <w:lang w:eastAsia="en-GB"/>
+        </w:rPr>
+        <w:fldChar w:fldCharType="separate"/>
+      </w:r>
+      <w:r>
+        <w:rPr>
+          <w:lang w:eastAsia="en-GB"/>
+        </w:rPr>
+        <w:t>3.3</w:t>
+      </w:r>
+      <w:r>
+        <w:rPr>
+          <w:lang w:eastAsia="en-GB"/>
+        </w:rPr>
+        <w:fldChar w:fldCharType="end"/>
+      </w:r>
+      <w:r>
+        <w:rPr>
+          <w:lang w:eastAsia="en-GB"/>
+        </w:rPr>
+        <w:t>.</w:t>
+      </w:r>
+    </w:p>
+    <w:p>
+      <w:pPr>
+        <w:pStyle w:val="ListParagraph"/>
+        <w:numPr>
+          <w:ilvl w:val="0"/>
+          <w:numId w:val="41"/>
+        </w:numPr>
+        <w:rPr>
+          <w:lang w:eastAsia="en-GB"/>
+        </w:rPr>
+      </w:pPr>
+      <w:r>
+        <w:rPr>
+          <w:lang w:eastAsia="en-GB"/>
+        </w:rPr>
+        <w:t>OPCODE is the output from the Code ROM (not the sequence ROM).</w:t>
+      </w:r>
+    </w:p>
+    <w:p>
+      <w:pPr>
+        <w:pStyle w:val="ListParagraph"/>
+        <w:numPr>
+          <w:ilvl w:val="0"/>
+          <w:numId w:val="40"/>
+        </w:numPr>
+        <w:rPr>
+          <w:lang w:eastAsia="en-GB"/>
+        </w:rPr>
+      </w:pPr>
+      <w:r>
+        <w:rPr>
+          <w:lang w:eastAsia="en-GB"/>
+        </w:rPr>
+        <w:t xml:space="preserve">OLS is the signal that latches the new opcode into the IS opcode latch (see </w:t>
+      </w:r>
+      <w:r>
+        <w:rPr>
+          <w:lang w:eastAsia="en-GB"/>
+        </w:rPr>
+        <w:fldChar w:fldCharType="begin"/>
+      </w:r>
+      <w:r>
+        <w:rPr>
+          <w:lang w:eastAsia="en-GB"/>
+        </w:rPr>
+        <w:instrText xml:space="preserve"> REF _Ref233894649 \r \h </w:instrText>
+      </w:r>
+      <w:r>
+        <w:rPr>
+          <w:lang w:eastAsia="en-GB"/>
+        </w:rPr>
+      </w:r>
+      <w:r>
+        <w:rPr>
+          <w:lang w:eastAsia="en-GB"/>
+        </w:rPr>
+        <w:fldChar w:fldCharType="separate"/>
+      </w:r>
+      <w:r>
+        <w:rPr>
+          <w:lang w:eastAsia="en-GB"/>
+        </w:rPr>
+        <w:t>3.1</w:t>
+      </w:r>
+      <w:r>
+        <w:rPr>
+          <w:lang w:eastAsia="en-GB"/>
+        </w:rPr>
+        <w:fldChar w:fldCharType="end"/>
+      </w:r>
+      <w:r>
+        <w:rPr>
+          <w:lang w:eastAsia="en-GB"/>
+        </w:rPr>
+        <w:t>).</w:t>
+      </w:r>
+    </w:p>
+    <w:p>
+      <w:pPr>
+        <w:pStyle w:val="ListParagraph"/>
+        <w:numPr>
+          <w:ilvl w:val="1"/>
+          <w:numId w:val="40"/>
+        </w:numPr>
+        <w:rPr>
+          <w:lang w:eastAsia="en-GB"/>
+        </w:rPr>
+      </w:pPr>
+      <w:r>
+        <w:rPr>
+          <w:lang w:eastAsia="en-GB"/>
+        </w:rPr>
+        <w:t>OLS = RESET AND !CLOCK</w:t>
+      </w:r>
+    </w:p>
+    <w:p>
+      <w:pPr>
+        <w:pStyle w:val="ListParagraph"/>
+        <w:numPr>
+          <w:ilvl w:val="1"/>
+          <w:numId w:val="40"/>
+        </w:numPr>
+        <w:rPr>
+          <w:lang w:eastAsia="en-GB"/>
+        </w:rPr>
+      </w:pPr>
+      <w:r>
+        <w:rPr>
+          <w:lang w:eastAsia="en-GB"/>
+        </w:rPr>
+        <w:t>The rising edge of OLS causes the new opcode to be stored in the IS opcode latch</w:t>
+      </w:r>
+    </w:p>
+    <w:p>
+      <w:pPr>
+        <w:pStyle w:val="ListParagraph"/>
+        <w:numPr>
+          <w:ilvl w:val="1"/>
+          <w:numId w:val="40"/>
+        </w:numPr>
+        <w:rPr>
+          <w:lang w:eastAsia="en-GB"/>
+        </w:rPr>
+      </w:pPr>
+      <w:r>
+        <w:rPr>
+          <w:lang w:eastAsia="en-GB"/>
+        </w:rPr>
+        <w:t>The fact that there will be multiple OLS pulses is not a problem.</w:t>
+      </w:r>
+    </w:p>
+    <w:p>
+      <w:pPr>
+        <w:rPr>
+          <w:lang w:eastAsia="en-GB"/>
+        </w:rPr>
+      </w:pPr>
+      <w:r>
+        <w:rPr>
+          <w:lang w:eastAsia="en-GB"/>
+        </w:rPr>
+        <w:t>Combining the Boolean equations for OLS:</w:t>
+      </w:r>
+    </w:p>
+    <w:p>
+      <w:pPr>
+        <w:pStyle w:val="ListParagraph"/>
+        <w:numPr>
+          <w:ilvl w:val="0"/>
+          <w:numId w:val="40"/>
+        </w:numPr>
+        <w:rPr>
+          <w:lang w:eastAsia="en-GB"/>
+        </w:rPr>
+      </w:pPr>
+      <w:r>
+        <w:rPr>
+          <w:lang w:eastAsia="en-GB"/>
+        </w:rPr>
+        <w:fldChar w:fldCharType="begin"/>
+      </w:r>
+      <w:r>
+        <w:rPr>
+          <w:lang w:eastAsia="en-GB"/>
+        </w:rPr>
+        <w:instrText xml:space="preserve"> REF _Ref233894277 \h </w:instrText>
+      </w:r>
+      <w:r>
+        <w:rPr>
+          <w:lang w:eastAsia="en-GB"/>
+        </w:rPr>
+      </w:r>
+      <w:r>
+        <w:rPr>
+          <w:lang w:eastAsia="en-GB"/>
+        </w:rPr>
+        <w:fldChar w:fldCharType="separate"/>
+      </w:r>
+      <w:r>
+        <w:t xml:space="preserve">Figure </w:t>
+      </w:r>
+      <w:r>
+        <w:rPr>
+          <w:noProof/>
+        </w:rPr>
+        <w:t>8</w:t>
+      </w:r>
+      <w:r>
+        <w:rPr>
+          <w:lang w:eastAsia="en-GB"/>
+        </w:rPr>
+        <w:fldChar w:fldCharType="end"/>
+      </w:r>
+      <w:r>
+        <w:rPr>
+          <w:lang w:eastAsia="en-GB"/>
+        </w:rPr>
+        <w:t xml:space="preserve"> OLS = SEQ_END AND !CLOCK</w:t>
+      </w:r>
+    </w:p>
+    <w:p>
+      <w:pPr>
+        <w:pStyle w:val="ListParagraph"/>
+        <w:numPr>
+          <w:ilvl w:val="0"/>
+          <w:numId w:val="40"/>
+        </w:numPr>
+        <w:rPr>
+          <w:lang w:eastAsia="en-GB"/>
+        </w:rPr>
+      </w:pPr>
+      <w:r>
+        <w:rPr>
+          <w:lang w:eastAsia="en-GB"/>
+        </w:rPr>
+        <w:fldChar w:fldCharType="begin"/>
+      </w:r>
+      <w:r>
+        <w:rPr>
+          <w:lang w:eastAsia="en-GB"/>
+        </w:rPr>
+        <w:instrText xml:space="preserve"> REF _Ref233899110 \h </w:instrText>
+      </w:r>
+      <w:r>
+        <w:rPr>
+          <w:lang w:eastAsia="en-GB"/>
+        </w:rPr>
+      </w:r>
+      <w:r>
+        <w:rPr>
+          <w:lang w:eastAsia="en-GB"/>
+        </w:rPr>
+        <w:fldChar w:fldCharType="separate"/>
+      </w:r>
+      <w:r>
+        <w:t xml:space="preserve">Figure </w:t>
+      </w:r>
+      <w:r>
+        <w:rPr>
+          <w:noProof/>
+        </w:rPr>
+        <w:t>9</w:t>
+      </w:r>
+      <w:r>
+        <w:rPr>
+          <w:lang w:eastAsia="en-GB"/>
+        </w:rPr>
+        <w:fldChar w:fldCharType="end"/>
+      </w:r>
+      <w:r>
+        <w:rPr>
+          <w:lang w:eastAsia="en-GB"/>
+        </w:rPr>
+        <w:t xml:space="preserve"> OLS = RESET AND !CLOCK</w:t>
+      </w:r>
+    </w:p>
+    <w:p>
+      <w:pPr>
+        <w:rPr>
+          <w:lang w:eastAsia="en-GB"/>
+        </w:rPr>
+      </w:pPr>
+      <w:r>
+        <w:rPr>
+          <w:lang w:eastAsia="en-GB"/>
+        </w:rPr>
+        <w:t xml:space="preserve">Combined </w:t>
+      </w:r>
+      <w:r>
+        <w:rPr>
+          <w:lang w:eastAsia="en-GB"/>
+        </w:rPr>
+        <w:t xml:space="preserve">equation </w:t>
+      </w:r>
+      <w:r>
+        <w:rPr>
+          <w:lang w:eastAsia="en-GB"/>
+        </w:rPr>
+        <w:t xml:space="preserve">OLS = (SEQ_END OR RESET) </w:t>
+      </w:r>
       <w:proofErr w:type="gramStart"/>
       <w:r>
         <w:rPr>
           <w:lang w:eastAsia="en-GB"/>
         </w:rPr>
-        <w:t>tbd</w:t>
-      </w:r>
-      <w:proofErr w:type="spellEnd"/>
+        <w:t>AND !CLOCK</w:t>
+      </w:r>
       <w:proofErr w:type="gramEnd"/>
-      <w:r>
-        <w:rPr>
-          <w:lang w:eastAsia="en-GB"/>
-        </w:rPr>
-        <w:t xml:space="preserve"> is more work required here to check the timing details of the three sentences above? This level of detail won’t be required until the IS schematic is being drawn. I will take another look at it, if necessary when (or sometime before) Earth is ready to draw the schematic&gt;</w:t>
+    </w:p>
+    <w:p>
+      <w:pPr>
+        <w:rPr>
+          <w:rFonts w:asciiTheme="majorHAnsi" w:eastAsiaTheme="majorEastAsia" w:hAnsiTheme="majorHAnsi" w:cstheme="majorBidi"/>
+          <w:b/>
+          <w:bCs/>
+          <w:color w:val="4F81BD" w:themeColor="accent1"/>
+          <w:sz w:val="26"/>
+          <w:szCs w:val="26"/>
+          <w:lang w:eastAsia="en-GB"/>
+        </w:rPr>
+      </w:pPr>
+      <w:bookmarkStart w:id="52" w:name="_Ref233822155"/>
+      <w:r>
+        <w:rPr>
+          <w:lang w:eastAsia="en-GB"/>
+        </w:rPr>
+        <w:br w:type="page"/>
       </w:r>
     </w:p>
     <w:p>
@@ -12708,16 +14275,18 @@
           <w:lang w:eastAsia="en-GB"/>
         </w:rPr>
       </w:pPr>
-      <w:bookmarkStart w:id="43" w:name="_Toc233800374"/>
-      <w:bookmarkStart w:id="44" w:name="_Ref233822155"/>
-      <w:r>
-        <w:rPr>
-          <w:lang w:eastAsia="en-GB"/>
-        </w:rPr>
+      <w:bookmarkStart w:id="53" w:name="_Toc233901929"/>
+      <w:bookmarkStart w:id="54" w:name="_Ref233901979"/>
+      <w:r>
+        <w:rPr>
+          <w:lang w:eastAsia="en-GB"/>
+        </w:rPr>
+        <w:lastRenderedPageBreak/>
         <w:t>Follow Jump?</w:t>
       </w:r>
-      <w:bookmarkEnd w:id="43"/>
-      <w:bookmarkEnd w:id="44"/>
+      <w:bookmarkEnd w:id="52"/>
+      <w:bookmarkEnd w:id="53"/>
+      <w:bookmarkEnd w:id="54"/>
     </w:p>
     <w:p>
       <w:pPr>
@@ -12804,8 +14373,6 @@
           <w:lang w:eastAsia="en-GB"/>
         </w:rPr>
       </w:pPr>
-      <w:bookmarkStart w:id="45" w:name="CurrentEditPos"/>
-      <w:bookmarkEnd w:id="45"/>
       <w:r>
         <w:rPr>
           <w:lang w:eastAsia="en-GB"/>
@@ -13347,7 +14914,6 @@
         <w:rPr>
           <w:lang w:eastAsia="en-GB"/>
         </w:rPr>
-        <w:lastRenderedPageBreak/>
         <w:t xml:space="preserve">This should be sufficient information for producing a schematic diagram for this block without needing any further level 3 </w:t>
       </w:r>
       <w:proofErr w:type="gramStart"/>
@@ -13378,7 +14944,7 @@
           <w:lang w:eastAsia="en-GB"/>
         </w:rPr>
       </w:pPr>
-      <w:bookmarkStart w:id="46" w:name="_Toc233800375"/>
+      <w:bookmarkStart w:id="55" w:name="_Toc233901930"/>
       <w:r>
         <w:rPr>
           <w:lang w:eastAsia="en-GB"/>
@@ -13386,10 +14952,10 @@
         <w:lastRenderedPageBreak/>
         <w:t>References</w:t>
       </w:r>
-      <w:bookmarkEnd w:id="21"/>
-      <w:bookmarkEnd w:id="46"/>
-    </w:p>
-    <w:bookmarkStart w:id="47" w:name="AVR_Instruction_Doc"/>
+      <w:bookmarkEnd w:id="22"/>
+      <w:bookmarkEnd w:id="55"/>
+    </w:p>
+    <w:bookmarkStart w:id="56" w:name="AVR_Instruction_Doc"/>
     <w:p>
       <w:pPr>
         <w:pStyle w:val="ListParagraph"/>
@@ -13426,7 +14992,7 @@
         </w:rPr>
         <w:t>AVR Instruction Set Manual</w:t>
       </w:r>
-      <w:bookmarkEnd w:id="47"/>
+      <w:bookmarkEnd w:id="56"/>
       <w:r>
         <w:rPr>
           <w:lang w:eastAsia="en-GB"/>
@@ -13434,7 +15000,7 @@
         <w:fldChar w:fldCharType="end"/>
       </w:r>
     </w:p>
-    <w:bookmarkStart w:id="48" w:name="RefCpuDesign"/>
+    <w:bookmarkStart w:id="57" w:name="RefCpuDesign"/>
     <w:p>
       <w:pPr>
         <w:pStyle w:val="ListParagraph"/>
@@ -13471,7 +15037,7 @@
         </w:rPr>
         <w:t>CpuDesign.docx</w:t>
       </w:r>
-      <w:bookmarkEnd w:id="48"/>
+      <w:bookmarkEnd w:id="57"/>
       <w:r>
         <w:rPr>
           <w:lang w:eastAsia="en-GB"/>
@@ -13479,7 +15045,7 @@
         <w:fldChar w:fldCharType="end"/>
       </w:r>
     </w:p>
-    <w:bookmarkStart w:id="49" w:name="RefL1SeqXlsx"/>
+    <w:bookmarkStart w:id="58" w:name="RefL1SeqXlsx"/>
     <w:p>
       <w:pPr>
         <w:pStyle w:val="ListParagraph"/>
@@ -13522,9 +15088,9 @@
         </w:rPr>
         <w:fldChar w:fldCharType="end"/>
       </w:r>
-      <w:bookmarkEnd w:id="49"/>
-    </w:p>
-    <w:bookmarkStart w:id="50" w:name="RefOpcodeFormat"/>
+      <w:bookmarkEnd w:id="58"/>
+    </w:p>
+    <w:bookmarkStart w:id="59" w:name="RefOpcodeFormat"/>
     <w:p>
       <w:pPr>
         <w:pStyle w:val="ListParagraph"/>
@@ -13567,7 +15133,7 @@
         </w:rPr>
         <w:fldChar w:fldCharType="end"/>
       </w:r>
-      <w:bookmarkEnd w:id="50"/>
+      <w:bookmarkEnd w:id="59"/>
     </w:p>
     <w:p>
       <w:pPr>
@@ -13646,7 +15212,7 @@
         <w:color w:val="7F7F7F" w:themeColor="background1" w:themeShade="7F"/>
         <w:spacing w:val="60"/>
       </w:rPr>
-      <w:id w:val="682328134"/>
+      <w:id w:val="75242279"/>
       <w:docPartObj>
         <w:docPartGallery w:val="Page Numbers (Top of Page)"/>
         <w:docPartUnique/>
@@ -13686,7 +15252,7 @@
               <w:b/>
               <w:noProof/>
             </w:rPr>
-            <w:t>12</w:t>
+            <w:t>ii</w:t>
           </w:r>
         </w:fldSimple>
       </w:p>
@@ -15495,6 +17061,119 @@
     </w:lvl>
   </w:abstractNum>
   <w:abstractNum w:abstractNumId="16">
+    <w:nsid w:val="31DE61EB"/>
+    <w:multiLevelType w:val="hybridMultilevel"/>
+    <w:tmpl w:val="67BCF3A0"/>
+    <w:lvl w:ilvl="0" w:tplc="08090001">
+      <w:start w:val="1"/>
+      <w:numFmt w:val="bullet"/>
+      <w:lvlText w:val=""/>
+      <w:lvlJc w:val="left"/>
+      <w:pPr>
+        <w:ind w:left="720" w:hanging="360"/>
+      </w:pPr>
+      <w:rPr>
+        <w:rFonts w:ascii="Symbol" w:hAnsi="Symbol" w:hint="default"/>
+      </w:rPr>
+    </w:lvl>
+    <w:lvl w:ilvl="1" w:tplc="08090003">
+      <w:start w:val="1"/>
+      <w:numFmt w:val="bullet"/>
+      <w:lvlText w:val="o"/>
+      <w:lvlJc w:val="left"/>
+      <w:pPr>
+        <w:ind w:left="1440" w:hanging="360"/>
+      </w:pPr>
+      <w:rPr>
+        <w:rFonts w:ascii="Courier New" w:hAnsi="Courier New" w:cs="Courier New" w:hint="default"/>
+      </w:rPr>
+    </w:lvl>
+    <w:lvl w:ilvl="2" w:tplc="08090005" w:tentative="1">
+      <w:start w:val="1"/>
+      <w:numFmt w:val="bullet"/>
+      <w:lvlText w:val=""/>
+      <w:lvlJc w:val="left"/>
+      <w:pPr>
+        <w:ind w:left="2160" w:hanging="360"/>
+      </w:pPr>
+      <w:rPr>
+        <w:rFonts w:ascii="Wingdings" w:hAnsi="Wingdings" w:hint="default"/>
+      </w:rPr>
+    </w:lvl>
+    <w:lvl w:ilvl="3" w:tplc="08090001" w:tentative="1">
+      <w:start w:val="1"/>
+      <w:numFmt w:val="bullet"/>
+      <w:lvlText w:val=""/>
+      <w:lvlJc w:val="left"/>
+      <w:pPr>
+        <w:ind w:left="2880" w:hanging="360"/>
+      </w:pPr>
+      <w:rPr>
+        <w:rFonts w:ascii="Symbol" w:hAnsi="Symbol" w:hint="default"/>
+      </w:rPr>
+    </w:lvl>
+    <w:lvl w:ilvl="4" w:tplc="08090003" w:tentative="1">
+      <w:start w:val="1"/>
+      <w:numFmt w:val="bullet"/>
+      <w:lvlText w:val="o"/>
+      <w:lvlJc w:val="left"/>
+      <w:pPr>
+        <w:ind w:left="3600" w:hanging="360"/>
+      </w:pPr>
+      <w:rPr>
+        <w:rFonts w:ascii="Courier New" w:hAnsi="Courier New" w:cs="Courier New" w:hint="default"/>
+      </w:rPr>
+    </w:lvl>
+    <w:lvl w:ilvl="5" w:tplc="08090005" w:tentative="1">
+      <w:start w:val="1"/>
+      <w:numFmt w:val="bullet"/>
+      <w:lvlText w:val=""/>
+      <w:lvlJc w:val="left"/>
+      <w:pPr>
+        <w:ind w:left="4320" w:hanging="360"/>
+      </w:pPr>
+      <w:rPr>
+        <w:rFonts w:ascii="Wingdings" w:hAnsi="Wingdings" w:hint="default"/>
+      </w:rPr>
+    </w:lvl>
+    <w:lvl w:ilvl="6" w:tplc="08090001" w:tentative="1">
+      <w:start w:val="1"/>
+      <w:numFmt w:val="bullet"/>
+      <w:lvlText w:val=""/>
+      <w:lvlJc w:val="left"/>
+      <w:pPr>
+        <w:ind w:left="5040" w:hanging="360"/>
+      </w:pPr>
+      <w:rPr>
+        <w:rFonts w:ascii="Symbol" w:hAnsi="Symbol" w:hint="default"/>
+      </w:rPr>
+    </w:lvl>
+    <w:lvl w:ilvl="7" w:tplc="08090003" w:tentative="1">
+      <w:start w:val="1"/>
+      <w:numFmt w:val="bullet"/>
+      <w:lvlText w:val="o"/>
+      <w:lvlJc w:val="left"/>
+      <w:pPr>
+        <w:ind w:left="5760" w:hanging="360"/>
+      </w:pPr>
+      <w:rPr>
+        <w:rFonts w:ascii="Courier New" w:hAnsi="Courier New" w:cs="Courier New" w:hint="default"/>
+      </w:rPr>
+    </w:lvl>
+    <w:lvl w:ilvl="8" w:tplc="08090005" w:tentative="1">
+      <w:start w:val="1"/>
+      <w:numFmt w:val="bullet"/>
+      <w:lvlText w:val=""/>
+      <w:lvlJc w:val="left"/>
+      <w:pPr>
+        <w:ind w:left="6480" w:hanging="360"/>
+      </w:pPr>
+      <w:rPr>
+        <w:rFonts w:ascii="Wingdings" w:hAnsi="Wingdings" w:hint="default"/>
+      </w:rPr>
+    </w:lvl>
+  </w:abstractNum>
+  <w:abstractNum w:abstractNumId="17">
     <w:nsid w:val="36E52853"/>
     <w:multiLevelType w:val="hybridMultilevel"/>
     <w:tmpl w:val="590A3C98"/>
@@ -15607,7 +17286,7 @@
       </w:rPr>
     </w:lvl>
   </w:abstractNum>
-  <w:abstractNum w:abstractNumId="17">
+  <w:abstractNum w:abstractNumId="18">
     <w:nsid w:val="38A37EA3"/>
     <w:multiLevelType w:val="hybridMultilevel"/>
     <w:tmpl w:val="0B88BD08"/>
@@ -15693,7 +17372,7 @@
       </w:pPr>
     </w:lvl>
   </w:abstractNum>
-  <w:abstractNum w:abstractNumId="18">
+  <w:abstractNum w:abstractNumId="19">
     <w:nsid w:val="3DA11B31"/>
     <w:multiLevelType w:val="hybridMultilevel"/>
     <w:tmpl w:val="C81448AA"/>
@@ -15806,7 +17485,7 @@
       </w:rPr>
     </w:lvl>
   </w:abstractNum>
-  <w:abstractNum w:abstractNumId="19">
+  <w:abstractNum w:abstractNumId="20">
     <w:nsid w:val="3E131CF4"/>
     <w:multiLevelType w:val="hybridMultilevel"/>
     <w:tmpl w:val="D3BEBFBE"/>
@@ -15919,7 +17598,7 @@
       </w:rPr>
     </w:lvl>
   </w:abstractNum>
-  <w:abstractNum w:abstractNumId="20">
+  <w:abstractNum w:abstractNumId="21">
     <w:nsid w:val="3F1E2626"/>
     <w:multiLevelType w:val="multilevel"/>
     <w:tmpl w:val="08090025"/>
@@ -16014,7 +17693,7 @@
       </w:pPr>
     </w:lvl>
   </w:abstractNum>
-  <w:abstractNum w:abstractNumId="21">
+  <w:abstractNum w:abstractNumId="22">
     <w:nsid w:val="3F270B44"/>
     <w:multiLevelType w:val="hybridMultilevel"/>
     <w:tmpl w:val="B8C25E36"/>
@@ -16127,7 +17806,7 @@
       </w:rPr>
     </w:lvl>
   </w:abstractNum>
-  <w:abstractNum w:abstractNumId="22">
+  <w:abstractNum w:abstractNumId="23">
     <w:nsid w:val="46DF192C"/>
     <w:multiLevelType w:val="hybridMultilevel"/>
     <w:tmpl w:val="C67C00BE"/>
@@ -16213,7 +17892,7 @@
       </w:pPr>
     </w:lvl>
   </w:abstractNum>
-  <w:abstractNum w:abstractNumId="23">
+  <w:abstractNum w:abstractNumId="24">
     <w:nsid w:val="49B43EC9"/>
     <w:multiLevelType w:val="hybridMultilevel"/>
     <w:tmpl w:val="C04CC570"/>
@@ -16326,7 +18005,7 @@
       </w:rPr>
     </w:lvl>
   </w:abstractNum>
-  <w:abstractNum w:abstractNumId="24">
+  <w:abstractNum w:abstractNumId="25">
     <w:nsid w:val="4B362C0A"/>
     <w:multiLevelType w:val="hybridMultilevel"/>
     <w:tmpl w:val="5A168552"/>
@@ -16439,7 +18118,120 @@
       </w:rPr>
     </w:lvl>
   </w:abstractNum>
-  <w:abstractNum w:abstractNumId="25">
+  <w:abstractNum w:abstractNumId="26">
+    <w:nsid w:val="4F610E97"/>
+    <w:multiLevelType w:val="hybridMultilevel"/>
+    <w:tmpl w:val="FD100A62"/>
+    <w:lvl w:ilvl="0" w:tplc="08090001">
+      <w:start w:val="1"/>
+      <w:numFmt w:val="bullet"/>
+      <w:lvlText w:val=""/>
+      <w:lvlJc w:val="left"/>
+      <w:pPr>
+        <w:ind w:left="720" w:hanging="360"/>
+      </w:pPr>
+      <w:rPr>
+        <w:rFonts w:ascii="Symbol" w:hAnsi="Symbol" w:hint="default"/>
+      </w:rPr>
+    </w:lvl>
+    <w:lvl w:ilvl="1" w:tplc="08090001">
+      <w:start w:val="1"/>
+      <w:numFmt w:val="bullet"/>
+      <w:lvlText w:val=""/>
+      <w:lvlJc w:val="left"/>
+      <w:pPr>
+        <w:ind w:left="1440" w:hanging="360"/>
+      </w:pPr>
+      <w:rPr>
+        <w:rFonts w:ascii="Symbol" w:hAnsi="Symbol" w:hint="default"/>
+      </w:rPr>
+    </w:lvl>
+    <w:lvl w:ilvl="2" w:tplc="08090005" w:tentative="1">
+      <w:start w:val="1"/>
+      <w:numFmt w:val="bullet"/>
+      <w:lvlText w:val=""/>
+      <w:lvlJc w:val="left"/>
+      <w:pPr>
+        <w:ind w:left="2160" w:hanging="360"/>
+      </w:pPr>
+      <w:rPr>
+        <w:rFonts w:ascii="Wingdings" w:hAnsi="Wingdings" w:hint="default"/>
+      </w:rPr>
+    </w:lvl>
+    <w:lvl w:ilvl="3" w:tplc="08090001" w:tentative="1">
+      <w:start w:val="1"/>
+      <w:numFmt w:val="bullet"/>
+      <w:lvlText w:val=""/>
+      <w:lvlJc w:val="left"/>
+      <w:pPr>
+        <w:ind w:left="2880" w:hanging="360"/>
+      </w:pPr>
+      <w:rPr>
+        <w:rFonts w:ascii="Symbol" w:hAnsi="Symbol" w:hint="default"/>
+      </w:rPr>
+    </w:lvl>
+    <w:lvl w:ilvl="4" w:tplc="08090003" w:tentative="1">
+      <w:start w:val="1"/>
+      <w:numFmt w:val="bullet"/>
+      <w:lvlText w:val="o"/>
+      <w:lvlJc w:val="left"/>
+      <w:pPr>
+        <w:ind w:left="3600" w:hanging="360"/>
+      </w:pPr>
+      <w:rPr>
+        <w:rFonts w:ascii="Courier New" w:hAnsi="Courier New" w:cs="Courier New" w:hint="default"/>
+      </w:rPr>
+    </w:lvl>
+    <w:lvl w:ilvl="5" w:tplc="08090005" w:tentative="1">
+      <w:start w:val="1"/>
+      <w:numFmt w:val="bullet"/>
+      <w:lvlText w:val=""/>
+      <w:lvlJc w:val="left"/>
+      <w:pPr>
+        <w:ind w:left="4320" w:hanging="360"/>
+      </w:pPr>
+      <w:rPr>
+        <w:rFonts w:ascii="Wingdings" w:hAnsi="Wingdings" w:hint="default"/>
+      </w:rPr>
+    </w:lvl>
+    <w:lvl w:ilvl="6" w:tplc="08090001" w:tentative="1">
+      <w:start w:val="1"/>
+      <w:numFmt w:val="bullet"/>
+      <w:lvlText w:val=""/>
+      <w:lvlJc w:val="left"/>
+      <w:pPr>
+        <w:ind w:left="5040" w:hanging="360"/>
+      </w:pPr>
+      <w:rPr>
+        <w:rFonts w:ascii="Symbol" w:hAnsi="Symbol" w:hint="default"/>
+      </w:rPr>
+    </w:lvl>
+    <w:lvl w:ilvl="7" w:tplc="08090003" w:tentative="1">
+      <w:start w:val="1"/>
+      <w:numFmt w:val="bullet"/>
+      <w:lvlText w:val="o"/>
+      <w:lvlJc w:val="left"/>
+      <w:pPr>
+        <w:ind w:left="5760" w:hanging="360"/>
+      </w:pPr>
+      <w:rPr>
+        <w:rFonts w:ascii="Courier New" w:hAnsi="Courier New" w:cs="Courier New" w:hint="default"/>
+      </w:rPr>
+    </w:lvl>
+    <w:lvl w:ilvl="8" w:tplc="08090005" w:tentative="1">
+      <w:start w:val="1"/>
+      <w:numFmt w:val="bullet"/>
+      <w:lvlText w:val=""/>
+      <w:lvlJc w:val="left"/>
+      <w:pPr>
+        <w:ind w:left="6480" w:hanging="360"/>
+      </w:pPr>
+      <w:rPr>
+        <w:rFonts w:ascii="Wingdings" w:hAnsi="Wingdings" w:hint="default"/>
+      </w:rPr>
+    </w:lvl>
+  </w:abstractNum>
+  <w:abstractNum w:abstractNumId="27">
     <w:nsid w:val="50BA3014"/>
     <w:multiLevelType w:val="hybridMultilevel"/>
     <w:tmpl w:val="7062E0DC"/>
@@ -16552,7 +18344,7 @@
       </w:rPr>
     </w:lvl>
   </w:abstractNum>
-  <w:abstractNum w:abstractNumId="26">
+  <w:abstractNum w:abstractNumId="28">
     <w:nsid w:val="52292902"/>
     <w:multiLevelType w:val="hybridMultilevel"/>
     <w:tmpl w:val="C7660ABC"/>
@@ -16665,7 +18457,7 @@
       </w:rPr>
     </w:lvl>
   </w:abstractNum>
-  <w:abstractNum w:abstractNumId="27">
+  <w:abstractNum w:abstractNumId="29">
     <w:nsid w:val="54CA172C"/>
     <w:multiLevelType w:val="hybridMultilevel"/>
     <w:tmpl w:val="0B88BD08"/>
@@ -16751,7 +18543,7 @@
       </w:pPr>
     </w:lvl>
   </w:abstractNum>
-  <w:abstractNum w:abstractNumId="28">
+  <w:abstractNum w:abstractNumId="30">
     <w:nsid w:val="54DC41FB"/>
     <w:multiLevelType w:val="hybridMultilevel"/>
     <w:tmpl w:val="50D08AD8"/>
@@ -16864,7 +18656,7 @@
       </w:rPr>
     </w:lvl>
   </w:abstractNum>
-  <w:abstractNum w:abstractNumId="29">
+  <w:abstractNum w:abstractNumId="31">
     <w:nsid w:val="557E14E1"/>
     <w:multiLevelType w:val="hybridMultilevel"/>
     <w:tmpl w:val="53D8178E"/>
@@ -16977,7 +18769,7 @@
       </w:rPr>
     </w:lvl>
   </w:abstractNum>
-  <w:abstractNum w:abstractNumId="30">
+  <w:abstractNum w:abstractNumId="32">
     <w:nsid w:val="5BC26D00"/>
     <w:multiLevelType w:val="hybridMultilevel"/>
     <w:tmpl w:val="CBB6913A"/>
@@ -17090,7 +18882,7 @@
       </w:rPr>
     </w:lvl>
   </w:abstractNum>
-  <w:abstractNum w:abstractNumId="31">
+  <w:abstractNum w:abstractNumId="33">
     <w:nsid w:val="5CAB6725"/>
     <w:multiLevelType w:val="hybridMultilevel"/>
     <w:tmpl w:val="7F22D460"/>
@@ -17203,7 +18995,7 @@
       </w:rPr>
     </w:lvl>
   </w:abstractNum>
-  <w:abstractNum w:abstractNumId="32">
+  <w:abstractNum w:abstractNumId="34">
     <w:nsid w:val="5F103C21"/>
     <w:multiLevelType w:val="hybridMultilevel"/>
     <w:tmpl w:val="DBC01600"/>
@@ -17292,7 +19084,7 @@
       </w:pPr>
     </w:lvl>
   </w:abstractNum>
-  <w:abstractNum w:abstractNumId="33">
+  <w:abstractNum w:abstractNumId="35">
     <w:nsid w:val="67C95051"/>
     <w:multiLevelType w:val="hybridMultilevel"/>
     <w:tmpl w:val="1804C8C8"/>
@@ -17405,7 +19197,7 @@
       </w:rPr>
     </w:lvl>
   </w:abstractNum>
-  <w:abstractNum w:abstractNumId="34">
+  <w:abstractNum w:abstractNumId="36">
     <w:nsid w:val="6BF155FE"/>
     <w:multiLevelType w:val="hybridMultilevel"/>
     <w:tmpl w:val="9796EE38"/>
@@ -17491,7 +19283,7 @@
       </w:pPr>
     </w:lvl>
   </w:abstractNum>
-  <w:abstractNum w:abstractNumId="35">
+  <w:abstractNum w:abstractNumId="37">
     <w:nsid w:val="72C52DE3"/>
     <w:multiLevelType w:val="hybridMultilevel"/>
     <w:tmpl w:val="29109174"/>
@@ -17604,7 +19396,7 @@
       </w:rPr>
     </w:lvl>
   </w:abstractNum>
-  <w:abstractNum w:abstractNumId="36">
+  <w:abstractNum w:abstractNumId="38">
     <w:nsid w:val="77B47D33"/>
     <w:multiLevelType w:val="hybridMultilevel"/>
     <w:tmpl w:val="AA146E8C"/>
@@ -17717,7 +19509,7 @@
       </w:rPr>
     </w:lvl>
   </w:abstractNum>
-  <w:abstractNum w:abstractNumId="37">
+  <w:abstractNum w:abstractNumId="39">
     <w:nsid w:val="7DAB54F1"/>
     <w:multiLevelType w:val="hybridMultilevel"/>
     <w:tmpl w:val="B7A2471E"/>
@@ -17830,7 +19622,7 @@
       </w:rPr>
     </w:lvl>
   </w:abstractNum>
-  <w:abstractNum w:abstractNumId="38">
+  <w:abstractNum w:abstractNumId="40">
     <w:nsid w:val="7F6475FB"/>
     <w:multiLevelType w:val="hybridMultilevel"/>
     <w:tmpl w:val="CD608B4E"/>
@@ -17944,7 +19736,7 @@
     </w:lvl>
   </w:abstractNum>
   <w:num w:numId="1">
-    <w:abstractNumId w:val="20"/>
+    <w:abstractNumId w:val="21"/>
   </w:num>
   <w:num w:numId="2">
     <w:abstractNumId w:val="8"/>
@@ -17953,13 +19745,13 @@
     <w:abstractNumId w:val="13"/>
   </w:num>
   <w:num w:numId="4">
-    <w:abstractNumId w:val="32"/>
+    <w:abstractNumId w:val="34"/>
   </w:num>
   <w:num w:numId="5">
-    <w:abstractNumId w:val="35"/>
+    <w:abstractNumId w:val="37"/>
   </w:num>
   <w:num w:numId="6">
-    <w:abstractNumId w:val="23"/>
+    <w:abstractNumId w:val="24"/>
   </w:num>
   <w:num w:numId="7">
     <w:abstractNumId w:val="10"/>
@@ -17968,58 +19760,58 @@
     <w:abstractNumId w:val="14"/>
   </w:num>
   <w:num w:numId="9">
+    <w:abstractNumId w:val="40"/>
+  </w:num>
+  <w:num w:numId="10">
     <w:abstractNumId w:val="38"/>
   </w:num>
-  <w:num w:numId="10">
-    <w:abstractNumId w:val="36"/>
-  </w:num>
   <w:num w:numId="11">
-    <w:abstractNumId w:val="37"/>
+    <w:abstractNumId w:val="39"/>
   </w:num>
   <w:num w:numId="12">
-    <w:abstractNumId w:val="33"/>
+    <w:abstractNumId w:val="35"/>
   </w:num>
   <w:num w:numId="13">
-    <w:abstractNumId w:val="17"/>
+    <w:abstractNumId w:val="18"/>
   </w:num>
   <w:num w:numId="14">
-    <w:abstractNumId w:val="18"/>
+    <w:abstractNumId w:val="19"/>
   </w:num>
   <w:num w:numId="15">
-    <w:abstractNumId w:val="31"/>
+    <w:abstractNumId w:val="33"/>
   </w:num>
   <w:num w:numId="16">
     <w:abstractNumId w:val="15"/>
   </w:num>
   <w:num w:numId="17">
-    <w:abstractNumId w:val="27"/>
+    <w:abstractNumId w:val="29"/>
   </w:num>
   <w:num w:numId="18">
     <w:abstractNumId w:val="6"/>
   </w:num>
   <w:num w:numId="19">
-    <w:abstractNumId w:val="26"/>
+    <w:abstractNumId w:val="28"/>
   </w:num>
   <w:num w:numId="20">
     <w:abstractNumId w:val="1"/>
   </w:num>
   <w:num w:numId="21">
-    <w:abstractNumId w:val="21"/>
+    <w:abstractNumId w:val="22"/>
   </w:num>
   <w:num w:numId="22">
-    <w:abstractNumId w:val="16"/>
+    <w:abstractNumId w:val="17"/>
   </w:num>
   <w:num w:numId="23">
     <w:abstractNumId w:val="7"/>
   </w:num>
   <w:num w:numId="24">
-    <w:abstractNumId w:val="30"/>
+    <w:abstractNumId w:val="32"/>
   </w:num>
   <w:num w:numId="25">
-    <w:abstractNumId w:val="34"/>
+    <w:abstractNumId w:val="36"/>
   </w:num>
   <w:num w:numId="26">
-    <w:abstractNumId w:val="22"/>
+    <w:abstractNumId w:val="23"/>
   </w:num>
   <w:num w:numId="27">
     <w:abstractNumId w:val="3"/>
@@ -18028,10 +19820,10 @@
     <w:abstractNumId w:val="9"/>
   </w:num>
   <w:num w:numId="29">
-    <w:abstractNumId w:val="19"/>
+    <w:abstractNumId w:val="20"/>
   </w:num>
   <w:num w:numId="30">
-    <w:abstractNumId w:val="29"/>
+    <w:abstractNumId w:val="31"/>
   </w:num>
   <w:num w:numId="31">
     <w:abstractNumId w:val="2"/>
@@ -18046,19 +19838,25 @@
     <w:abstractNumId w:val="0"/>
   </w:num>
   <w:num w:numId="35">
-    <w:abstractNumId w:val="28"/>
+    <w:abstractNumId w:val="30"/>
   </w:num>
   <w:num w:numId="36">
-    <w:abstractNumId w:val="25"/>
+    <w:abstractNumId w:val="27"/>
   </w:num>
   <w:num w:numId="37">
-    <w:abstractNumId w:val="24"/>
+    <w:abstractNumId w:val="25"/>
   </w:num>
   <w:num w:numId="38">
     <w:abstractNumId w:val="12"/>
   </w:num>
   <w:num w:numId="39">
     <w:abstractNumId w:val="11"/>
+  </w:num>
+  <w:num w:numId="40">
+    <w:abstractNumId w:val="16"/>
+  </w:num>
+  <w:num w:numId="41">
+    <w:abstractNumId w:val="26"/>
   </w:num>
   <w:numIdMacAtCleanup w:val="18"/>
 </w:numbering>
@@ -18223,7 +20021,7 @@
   <w:style w:type="paragraph" w:default="1" w:styleId="Normal">
     <w:name w:val="Normal"/>
     <w:qFormat/>
-    <w:rsid w:val="00907624"/>
+    <w:rsid w:val="00DE289E"/>
   </w:style>
   <w:style w:type="paragraph" w:styleId="Heading1">
     <w:name w:val="heading 1"/>
@@ -19196,7 +20994,7 @@
 </file>
 
 <file path=customXml/itemProps2.xml><?xml version="1.0" encoding="utf-8"?>
-<ds:datastoreItem xmlns:ds="http://schemas.openxmlformats.org/officeDocument/2006/customXml" ds:itemID="{20895FDE-3E07-43D0-BB67-15DDE40A841E}">
+<ds:datastoreItem xmlns:ds="http://schemas.openxmlformats.org/officeDocument/2006/customXml" ds:itemID="{3EE881D3-4FAD-4781-ADC3-396822DAFA19}">
   <ds:schemaRefs>
     <ds:schemaRef ds:uri="http://schemas.openxmlformats.org/officeDocument/2006/bibliography"/>
   </ds:schemaRefs>

</xml_diff>

<commit_message>
Improved English and added RESET
Improved some of the English, no behaviour changes.
RESET should be shown as an output Figure 2 (forgot to include latest is.sch on 2 Jul) and added RESET to Table 1.
</commit_message>
<xml_diff>
--- a/CPU Design/L1IsDesign.docx
+++ b/CPU Design/L1IsDesign.docx
@@ -63,7 +63,7 @@
                     <v:path arrowok="t"/>
                   </v:shape>
                 </v:group>
-                <v:rect id="_x0000_s1039" style="position:absolute;left:1800;top:1440;width:8638;height:736;mso-width-percent:1000;mso-position-horizontal:center;mso-position-horizontal-relative:margin;mso-position-vertical:top;mso-position-vertical-relative:margin;mso-width-percent:1000;mso-width-relative:margin;mso-height-relative:margin" filled="f" stroked="f">
+                <v:rect id="_x0000_s1039" style="position:absolute;left:1800;top:1440;width:8638;height:551;mso-width-percent:1000;mso-position-horizontal:center;mso-position-horizontal-relative:margin;mso-position-vertical:top;mso-position-vertical-relative:margin;mso-width-percent:1000;mso-width-relative:margin;mso-height-relative:margin" filled="f" stroked="f">
                   <v:textbox style="mso-next-textbox:#_x0000_s1039;mso-fit-shape-to-text:t">
                     <w:txbxContent>
                       <w:p>
@@ -107,7 +107,7 @@
                             <w:szCs w:val="72"/>
                           </w:rPr>
                           <w:alias w:val="Title"/>
-                          <w:id w:val="75242275"/>
+                          <w:id w:val="232431552"/>
                           <w:dataBinding w:prefixMappings="xmlns:ns0='http://schemas.openxmlformats.org/package/2006/metadata/core-properties' xmlns:ns1='http://purl.org/dc/elements/1.1/'" w:xpath="/ns0:coreProperties[1]/ns1:title[1]" w:storeItemID="{6C3C8BC8-F283-45AE-878A-BAB7291924A1}"/>
                           <w:text/>
                         </w:sdtPr>
@@ -146,7 +146,7 @@
                             <w:szCs w:val="40"/>
                           </w:rPr>
                           <w:alias w:val="Subtitle"/>
-                          <w:id w:val="75242276"/>
+                          <w:id w:val="232431553"/>
                           <w:dataBinding w:prefixMappings="xmlns:ns0='http://schemas.openxmlformats.org/package/2006/metadata/core-properties' xmlns:ns1='http://purl.org/dc/elements/1.1/'" w:xpath="/ns0:coreProperties[1]/ns1:subject[1]" w:storeItemID="{6C3C8BC8-F283-45AE-878A-BAB7291924A1}"/>
                           <w:text/>
                         </w:sdtPr>
@@ -184,7 +184,7 @@
                             <w:szCs w:val="32"/>
                           </w:rPr>
                           <w:alias w:val="Author"/>
-                          <w:id w:val="75242277"/>
+                          <w:id w:val="232431554"/>
                           <w:dataBinding w:prefixMappings="xmlns:ns0='http://schemas.openxmlformats.org/package/2006/metadata/core-properties' xmlns:ns1='http://purl.org/dc/elements/1.1/'" w:xpath="/ns0:coreProperties[1]/ns1:creator[1]" w:storeItemID="{6C3C8BC8-F283-45AE-878A-BAB7291924A1}"/>
                           <w:text/>
                         </w:sdtPr>
@@ -823,6 +823,145 @@
               </w:p>
             </w:tc>
           </w:tr>
+          <w:tr>
+            <w:tc>
+              <w:tcPr>
+                <w:tcW w:w="1384" w:type="dxa"/>
+              </w:tcPr>
+              <w:p>
+                <w:pPr>
+                  <w:rPr>
+                    <w:rFonts w:cstheme="minorHAnsi"/>
+                  </w:rPr>
+                </w:pPr>
+                <w:r>
+                  <w:rPr>
+                    <w:rFonts w:cstheme="minorHAnsi"/>
+                  </w:rPr>
+                  <w:t>4 Jul 2026</w:t>
+                </w:r>
+              </w:p>
+            </w:tc>
+            <w:tc>
+              <w:tcPr>
+                <w:tcW w:w="7858" w:type="dxa"/>
+              </w:tcPr>
+              <w:p>
+                <w:pPr>
+                  <w:rPr>
+                    <w:rFonts w:cstheme="minorHAnsi"/>
+                  </w:rPr>
+                </w:pPr>
+                <w:r>
+                  <w:rPr>
+                    <w:rFonts w:cstheme="minorHAnsi"/>
+                  </w:rPr>
+                  <w:t>Improved some of the English, no behaviour changes.</w:t>
+                </w:r>
+              </w:p>
+              <w:p>
+                <w:pPr>
+                  <w:rPr>
+                    <w:rFonts w:cstheme="minorHAnsi"/>
+                  </w:rPr>
+                </w:pPr>
+                <w:r>
+                  <w:rPr>
+                    <w:rFonts w:cstheme="minorHAnsi"/>
+                  </w:rPr>
+                  <w:t xml:space="preserve">RESET should be shown as an output </w:t>
+                </w:r>
+                <w:r>
+                  <w:rPr>
+                    <w:rFonts w:cstheme="minorHAnsi"/>
+                  </w:rPr>
+                  <w:fldChar w:fldCharType="begin"/>
+                </w:r>
+                <w:r>
+                  <w:rPr>
+                    <w:rFonts w:cstheme="minorHAnsi"/>
+                  </w:rPr>
+                  <w:instrText xml:space="preserve"> REF _Ref232762527 \h </w:instrText>
+                </w:r>
+                <w:r>
+                  <w:rPr>
+                    <w:rFonts w:cstheme="minorHAnsi"/>
+                  </w:rPr>
+                </w:r>
+                <w:r>
+                  <w:rPr>
+                    <w:rFonts w:cstheme="minorHAnsi"/>
+                  </w:rPr>
+                  <w:fldChar w:fldCharType="separate"/>
+                </w:r>
+                <w:r>
+                  <w:t xml:space="preserve">Figure </w:t>
+                </w:r>
+                <w:r>
+                  <w:rPr>
+                    <w:noProof/>
+                  </w:rPr>
+                  <w:t>2</w:t>
+                </w:r>
+                <w:r>
+                  <w:rPr>
+                    <w:rFonts w:cstheme="minorHAnsi"/>
+                  </w:rPr>
+                  <w:fldChar w:fldCharType="end"/>
+                </w:r>
+                <w:r>
+                  <w:rPr>
+                    <w:rFonts w:cstheme="minorHAnsi"/>
+                  </w:rPr>
+                  <w:t xml:space="preserve"> (forgot to include latest is.sch on 2 Jul) and added RESET to </w:t>
+                </w:r>
+                <w:r>
+                  <w:rPr>
+                    <w:rFonts w:cstheme="minorHAnsi"/>
+                  </w:rPr>
+                  <w:fldChar w:fldCharType="begin"/>
+                </w:r>
+                <w:r>
+                  <w:rPr>
+                    <w:rFonts w:cstheme="minorHAnsi"/>
+                  </w:rPr>
+                  <w:instrText xml:space="preserve"> REF _Ref232761378 \h </w:instrText>
+                </w:r>
+                <w:r>
+                  <w:rPr>
+                    <w:rFonts w:cstheme="minorHAnsi"/>
+                  </w:rPr>
+                </w:r>
+                <w:r>
+                  <w:rPr>
+                    <w:rFonts w:cstheme="minorHAnsi"/>
+                  </w:rPr>
+                  <w:fldChar w:fldCharType="separate"/>
+                </w:r>
+                <w:r>
+                  <w:t xml:space="preserve">Table </w:t>
+                </w:r>
+                <w:r>
+                  <w:rPr>
+                    <w:noProof/>
+                  </w:rPr>
+                  <w:t>1</w:t>
+                </w:r>
+                <w:r>
+                  <w:rPr>
+                    <w:rFonts w:cstheme="minorHAnsi"/>
+                  </w:rPr>
+                  <w:fldChar w:fldCharType="end"/>
+                </w:r>
+                <w:r>
+                  <w:rPr>
+                    <w:rFonts w:cstheme="minorHAnsi"/>
+                  </w:rPr>
+                  <w:t>.</w:t>
+                </w:r>
+              </w:p>
+            </w:tc>
+          </w:tr>
         </w:tbl>
         <w:p>
           <w:pPr>
@@ -891,7 +1030,7 @@
           <w:r>
             <w:fldChar w:fldCharType="separate"/>
           </w:r>
-          <w:hyperlink w:anchor="_Toc234055059" w:history="1">
+          <w:hyperlink w:anchor="_Toc234060573" w:history="1">
             <w:r>
               <w:rPr>
                 <w:rStyle w:val="Hyperlink"/>
@@ -937,7 +1076,7 @@
                 <w:noProof/>
                 <w:webHidden/>
               </w:rPr>
-              <w:instrText xml:space="preserve"> PAGEREF _Toc234055059 \h </w:instrText>
+              <w:instrText xml:space="preserve"> PAGEREF _Toc234060573 \h </w:instrText>
             </w:r>
             <w:r>
               <w:rPr>
@@ -981,7 +1120,7 @@
               <w:lang w:eastAsia="en-GB"/>
             </w:rPr>
           </w:pPr>
-          <w:hyperlink w:anchor="_Toc234055060" w:history="1">
+          <w:hyperlink w:anchor="_Toc234060574" w:history="1">
             <w:r>
               <w:rPr>
                 <w:rStyle w:val="Hyperlink"/>
@@ -1025,7 +1164,7 @@
                 <w:noProof/>
                 <w:webHidden/>
               </w:rPr>
-              <w:instrText xml:space="preserve"> PAGEREF _Toc234055060 \h </w:instrText>
+              <w:instrText xml:space="preserve"> PAGEREF _Toc234060574 \h </w:instrText>
             </w:r>
             <w:r>
               <w:rPr>
@@ -1069,7 +1208,7 @@
               <w:lang w:eastAsia="en-GB"/>
             </w:rPr>
           </w:pPr>
-          <w:hyperlink w:anchor="_Toc234055061" w:history="1">
+          <w:hyperlink w:anchor="_Toc234060575" w:history="1">
             <w:r>
               <w:rPr>
                 <w:rStyle w:val="Hyperlink"/>
@@ -1113,7 +1252,7 @@
                 <w:noProof/>
                 <w:webHidden/>
               </w:rPr>
-              <w:instrText xml:space="preserve"> PAGEREF _Toc234055061 \h </w:instrText>
+              <w:instrText xml:space="preserve"> PAGEREF _Toc234060575 \h </w:instrText>
             </w:r>
             <w:r>
               <w:rPr>
@@ -1157,7 +1296,7 @@
               <w:lang w:eastAsia="en-GB"/>
             </w:rPr>
           </w:pPr>
-          <w:hyperlink w:anchor="_Toc234055062" w:history="1">
+          <w:hyperlink w:anchor="_Toc234060576" w:history="1">
             <w:r>
               <w:rPr>
                 <w:rStyle w:val="Hyperlink"/>
@@ -1201,7 +1340,7 @@
                 <w:noProof/>
                 <w:webHidden/>
               </w:rPr>
-              <w:instrText xml:space="preserve"> PAGEREF _Toc234055062 \h </w:instrText>
+              <w:instrText xml:space="preserve"> PAGEREF _Toc234060576 \h </w:instrText>
             </w:r>
             <w:r>
               <w:rPr>
@@ -1245,7 +1384,7 @@
               <w:lang w:eastAsia="en-GB"/>
             </w:rPr>
           </w:pPr>
-          <w:hyperlink w:anchor="_Toc234055063" w:history="1">
+          <w:hyperlink w:anchor="_Toc234060577" w:history="1">
             <w:r>
               <w:rPr>
                 <w:rStyle w:val="Hyperlink"/>
@@ -1268,7 +1407,7 @@
                 <w:noProof/>
                 <w:lang w:eastAsia="en-GB"/>
               </w:rPr>
-              <w:t>IS Requirements for Latch Instruction Decode Outputs</w:t>
+              <w:t>IS Requirements for Instruction Latch and Decode Outputs</w:t>
             </w:r>
             <w:r>
               <w:rPr>
@@ -1289,7 +1428,7 @@
                 <w:noProof/>
                 <w:webHidden/>
               </w:rPr>
-              <w:instrText xml:space="preserve"> PAGEREF _Toc234055063 \h </w:instrText>
+              <w:instrText xml:space="preserve"> PAGEREF _Toc234060577 \h </w:instrText>
             </w:r>
             <w:r>
               <w:rPr>
@@ -1333,7 +1472,7 @@
               <w:lang w:eastAsia="en-GB"/>
             </w:rPr>
           </w:pPr>
-          <w:hyperlink w:anchor="_Toc234055064" w:history="1">
+          <w:hyperlink w:anchor="_Toc234060578" w:history="1">
             <w:r>
               <w:rPr>
                 <w:rStyle w:val="Hyperlink"/>
@@ -1377,7 +1516,7 @@
                 <w:noProof/>
                 <w:webHidden/>
               </w:rPr>
-              <w:instrText xml:space="preserve"> PAGEREF _Toc234055064 \h </w:instrText>
+              <w:instrText xml:space="preserve"> PAGEREF _Toc234060578 \h </w:instrText>
             </w:r>
             <w:r>
               <w:rPr>
@@ -1421,7 +1560,7 @@
               <w:lang w:eastAsia="en-GB"/>
             </w:rPr>
           </w:pPr>
-          <w:hyperlink w:anchor="_Toc234055065" w:history="1">
+          <w:hyperlink w:anchor="_Toc234060579" w:history="1">
             <w:r>
               <w:rPr>
                 <w:rStyle w:val="Hyperlink"/>
@@ -1472,7 +1611,7 @@
                 <w:noProof/>
                 <w:webHidden/>
               </w:rPr>
-              <w:instrText xml:space="preserve"> PAGEREF _Toc234055065 \h </w:instrText>
+              <w:instrText xml:space="preserve"> PAGEREF _Toc234060579 \h </w:instrText>
             </w:r>
             <w:r>
               <w:rPr>
@@ -1516,7 +1655,7 @@
               <w:lang w:eastAsia="en-GB"/>
             </w:rPr>
           </w:pPr>
-          <w:hyperlink w:anchor="_Toc234055066" w:history="1">
+          <w:hyperlink w:anchor="_Toc234060580" w:history="1">
             <w:r>
               <w:rPr>
                 <w:rStyle w:val="Hyperlink"/>
@@ -1560,7 +1699,7 @@
                 <w:noProof/>
                 <w:webHidden/>
               </w:rPr>
-              <w:instrText xml:space="preserve"> PAGEREF _Toc234055066 \h </w:instrText>
+              <w:instrText xml:space="preserve"> PAGEREF _Toc234060580 \h </w:instrText>
             </w:r>
             <w:r>
               <w:rPr>
@@ -1604,7 +1743,7 @@
               <w:lang w:eastAsia="en-GB"/>
             </w:rPr>
           </w:pPr>
-          <w:hyperlink w:anchor="_Toc234055067" w:history="1">
+          <w:hyperlink w:anchor="_Toc234060581" w:history="1">
             <w:r>
               <w:rPr>
                 <w:rStyle w:val="Hyperlink"/>
@@ -1648,7 +1787,7 @@
                 <w:noProof/>
                 <w:webHidden/>
               </w:rPr>
-              <w:instrText xml:space="preserve"> PAGEREF _Toc234055067 \h </w:instrText>
+              <w:instrText xml:space="preserve"> PAGEREF _Toc234060581 \h </w:instrText>
             </w:r>
             <w:r>
               <w:rPr>
@@ -1692,7 +1831,7 @@
               <w:lang w:eastAsia="en-GB"/>
             </w:rPr>
           </w:pPr>
-          <w:hyperlink w:anchor="_Toc234055068" w:history="1">
+          <w:hyperlink w:anchor="_Toc234060582" w:history="1">
             <w:r>
               <w:rPr>
                 <w:rStyle w:val="Hyperlink"/>
@@ -1736,7 +1875,7 @@
                 <w:noProof/>
                 <w:webHidden/>
               </w:rPr>
-              <w:instrText xml:space="preserve"> PAGEREF _Toc234055068 \h </w:instrText>
+              <w:instrText xml:space="preserve"> PAGEREF _Toc234060582 \h </w:instrText>
             </w:r>
             <w:r>
               <w:rPr>
@@ -1780,7 +1919,7 @@
               <w:lang w:eastAsia="en-GB"/>
             </w:rPr>
           </w:pPr>
-          <w:hyperlink w:anchor="_Toc234055069" w:history="1">
+          <w:hyperlink w:anchor="_Toc234060583" w:history="1">
             <w:r>
               <w:rPr>
                 <w:rStyle w:val="Hyperlink"/>
@@ -1824,7 +1963,7 @@
                 <w:noProof/>
                 <w:webHidden/>
               </w:rPr>
-              <w:instrText xml:space="preserve"> PAGEREF _Toc234055069 \h </w:instrText>
+              <w:instrText xml:space="preserve"> PAGEREF _Toc234060583 \h </w:instrText>
             </w:r>
             <w:r>
               <w:rPr>
@@ -1868,7 +2007,7 @@
               <w:lang w:eastAsia="en-GB"/>
             </w:rPr>
           </w:pPr>
-          <w:hyperlink w:anchor="_Toc234055070" w:history="1">
+          <w:hyperlink w:anchor="_Toc234060584" w:history="1">
             <w:r>
               <w:rPr>
                 <w:rStyle w:val="Hyperlink"/>
@@ -1912,7 +2051,7 @@
                 <w:noProof/>
                 <w:webHidden/>
               </w:rPr>
-              <w:instrText xml:space="preserve"> PAGEREF _Toc234055070 \h </w:instrText>
+              <w:instrText xml:space="preserve"> PAGEREF _Toc234060584 \h </w:instrText>
             </w:r>
             <w:r>
               <w:rPr>
@@ -1956,7 +2095,7 @@
               <w:lang w:eastAsia="en-GB"/>
             </w:rPr>
           </w:pPr>
-          <w:hyperlink w:anchor="_Toc234055071" w:history="1">
+          <w:hyperlink w:anchor="_Toc234060585" w:history="1">
             <w:r>
               <w:rPr>
                 <w:rStyle w:val="Hyperlink"/>
@@ -2000,7 +2139,7 @@
                 <w:noProof/>
                 <w:webHidden/>
               </w:rPr>
-              <w:instrText xml:space="preserve"> PAGEREF _Toc234055071 \h </w:instrText>
+              <w:instrText xml:space="preserve"> PAGEREF _Toc234060585 \h </w:instrText>
             </w:r>
             <w:r>
               <w:rPr>
@@ -2044,7 +2183,7 @@
               <w:lang w:eastAsia="en-GB"/>
             </w:rPr>
           </w:pPr>
-          <w:hyperlink w:anchor="_Toc234055072" w:history="1">
+          <w:hyperlink w:anchor="_Toc234060586" w:history="1">
             <w:r>
               <w:rPr>
                 <w:rStyle w:val="Hyperlink"/>
@@ -2088,7 +2227,7 @@
                 <w:noProof/>
                 <w:webHidden/>
               </w:rPr>
-              <w:instrText xml:space="preserve"> PAGEREF _Toc234055072 \h </w:instrText>
+              <w:instrText xml:space="preserve"> PAGEREF _Toc234060586 \h </w:instrText>
             </w:r>
             <w:r>
               <w:rPr>
@@ -2132,7 +2271,7 @@
               <w:lang w:eastAsia="en-GB"/>
             </w:rPr>
           </w:pPr>
-          <w:hyperlink w:anchor="_Toc234055073" w:history="1">
+          <w:hyperlink w:anchor="_Toc234060587" w:history="1">
             <w:r>
               <w:rPr>
                 <w:rStyle w:val="Hyperlink"/>
@@ -2176,7 +2315,7 @@
                 <w:noProof/>
                 <w:webHidden/>
               </w:rPr>
-              <w:instrText xml:space="preserve"> PAGEREF _Toc234055073 \h </w:instrText>
+              <w:instrText xml:space="preserve"> PAGEREF _Toc234060587 \h </w:instrText>
             </w:r>
             <w:r>
               <w:rPr>
@@ -2220,7 +2359,7 @@
               <w:lang w:eastAsia="en-GB"/>
             </w:rPr>
           </w:pPr>
-          <w:hyperlink w:anchor="_Toc234055074" w:history="1">
+          <w:hyperlink w:anchor="_Toc234060588" w:history="1">
             <w:r>
               <w:rPr>
                 <w:rStyle w:val="Hyperlink"/>
@@ -2264,7 +2403,7 @@
                 <w:noProof/>
                 <w:webHidden/>
               </w:rPr>
-              <w:instrText xml:space="preserve"> PAGEREF _Toc234055074 \h </w:instrText>
+              <w:instrText xml:space="preserve"> PAGEREF _Toc234060588 \h </w:instrText>
             </w:r>
             <w:r>
               <w:rPr>
@@ -2308,7 +2447,7 @@
               <w:lang w:eastAsia="en-GB"/>
             </w:rPr>
           </w:pPr>
-          <w:hyperlink w:anchor="_Toc234055075" w:history="1">
+          <w:hyperlink w:anchor="_Toc234060589" w:history="1">
             <w:r>
               <w:rPr>
                 <w:rStyle w:val="Hyperlink"/>
@@ -2352,7 +2491,7 @@
                 <w:noProof/>
                 <w:webHidden/>
               </w:rPr>
-              <w:instrText xml:space="preserve"> PAGEREF _Toc234055075 \h </w:instrText>
+              <w:instrText xml:space="preserve"> PAGEREF _Toc234060589 \h </w:instrText>
             </w:r>
             <w:r>
               <w:rPr>
@@ -2396,7 +2535,7 @@
               <w:lang w:eastAsia="en-GB"/>
             </w:rPr>
           </w:pPr>
-          <w:hyperlink w:anchor="_Toc234055076" w:history="1">
+          <w:hyperlink w:anchor="_Toc234060590" w:history="1">
             <w:r>
               <w:rPr>
                 <w:rStyle w:val="Hyperlink"/>
@@ -2440,7 +2579,7 @@
                 <w:noProof/>
                 <w:webHidden/>
               </w:rPr>
-              <w:instrText xml:space="preserve"> PAGEREF _Toc234055076 \h </w:instrText>
+              <w:instrText xml:space="preserve"> PAGEREF _Toc234060590 \h </w:instrText>
             </w:r>
             <w:r>
               <w:rPr>
@@ -2484,7 +2623,7 @@
               <w:lang w:eastAsia="en-GB"/>
             </w:rPr>
           </w:pPr>
-          <w:hyperlink w:anchor="_Toc234055077" w:history="1">
+          <w:hyperlink w:anchor="_Toc234060591" w:history="1">
             <w:r>
               <w:rPr>
                 <w:rStyle w:val="Hyperlink"/>
@@ -2528,7 +2667,7 @@
                 <w:noProof/>
                 <w:webHidden/>
               </w:rPr>
-              <w:instrText xml:space="preserve"> PAGEREF _Toc234055077 \h </w:instrText>
+              <w:instrText xml:space="preserve"> PAGEREF _Toc234060591 \h </w:instrText>
             </w:r>
             <w:r>
               <w:rPr>
@@ -2572,7 +2711,7 @@
               <w:lang w:eastAsia="en-GB"/>
             </w:rPr>
           </w:pPr>
-          <w:hyperlink w:anchor="_Toc234055078" w:history="1">
+          <w:hyperlink w:anchor="_Toc234060592" w:history="1">
             <w:r>
               <w:rPr>
                 <w:rStyle w:val="Hyperlink"/>
@@ -2616,7 +2755,7 @@
                 <w:noProof/>
                 <w:webHidden/>
               </w:rPr>
-              <w:instrText xml:space="preserve"> PAGEREF _Toc234055078 \h </w:instrText>
+              <w:instrText xml:space="preserve"> PAGEREF _Toc234060592 \h </w:instrText>
             </w:r>
             <w:r>
               <w:rPr>
@@ -2724,7 +2863,7 @@
         </w:rPr>
         <w:fldChar w:fldCharType="separate"/>
       </w:r>
-      <w:hyperlink w:anchor="_Toc234055079" w:history="1">
+      <w:hyperlink w:anchor="_Toc234060593" w:history="1">
         <w:r>
           <w:rPr>
             <w:rStyle w:val="Hyperlink"/>
@@ -2751,7 +2890,7 @@
             <w:noProof/>
             <w:webHidden/>
           </w:rPr>
-          <w:instrText xml:space="preserve"> PAGEREF _Toc234055079 \h </w:instrText>
+          <w:instrText xml:space="preserve"> PAGEREF _Toc234060593 \h </w:instrText>
         </w:r>
         <w:r>
           <w:rPr>
@@ -2794,7 +2933,7 @@
           <w:lang w:eastAsia="en-GB"/>
         </w:rPr>
       </w:pPr>
-      <w:hyperlink w:anchor="_Toc234055080" w:history="1">
+      <w:hyperlink w:anchor="_Toc234060594" w:history="1">
         <w:r>
           <w:rPr>
             <w:rStyle w:val="Hyperlink"/>
@@ -2821,7 +2960,7 @@
             <w:noProof/>
             <w:webHidden/>
           </w:rPr>
-          <w:instrText xml:space="preserve"> PAGEREF _Toc234055080 \h </w:instrText>
+          <w:instrText xml:space="preserve"> PAGEREF _Toc234060594 \h </w:instrText>
         </w:r>
         <w:r>
           <w:rPr>
@@ -2864,7 +3003,7 @@
           <w:lang w:eastAsia="en-GB"/>
         </w:rPr>
       </w:pPr>
-      <w:hyperlink w:anchor="_Toc234055081" w:history="1">
+      <w:hyperlink w:anchor="_Toc234060595" w:history="1">
         <w:r>
           <w:rPr>
             <w:rStyle w:val="Hyperlink"/>
@@ -2891,7 +3030,7 @@
             <w:noProof/>
             <w:webHidden/>
           </w:rPr>
-          <w:instrText xml:space="preserve"> PAGEREF _Toc234055081 \h </w:instrText>
+          <w:instrText xml:space="preserve"> PAGEREF _Toc234060595 \h </w:instrText>
         </w:r>
         <w:r>
           <w:rPr>
@@ -2934,7 +3073,7 @@
           <w:lang w:eastAsia="en-GB"/>
         </w:rPr>
       </w:pPr>
-      <w:hyperlink w:anchor="_Toc234055082" w:history="1">
+      <w:hyperlink w:anchor="_Toc234060596" w:history="1">
         <w:r>
           <w:rPr>
             <w:rStyle w:val="Hyperlink"/>
@@ -2961,7 +3100,7 @@
             <w:noProof/>
             <w:webHidden/>
           </w:rPr>
-          <w:instrText xml:space="preserve"> PAGEREF _Toc234055082 \h </w:instrText>
+          <w:instrText xml:space="preserve"> PAGEREF _Toc234060596 \h </w:instrText>
         </w:r>
         <w:r>
           <w:rPr>
@@ -3004,7 +3143,7 @@
           <w:lang w:eastAsia="en-GB"/>
         </w:rPr>
       </w:pPr>
-      <w:hyperlink w:anchor="_Toc234055083" w:history="1">
+      <w:hyperlink w:anchor="_Toc234060597" w:history="1">
         <w:r>
           <w:rPr>
             <w:rStyle w:val="Hyperlink"/>
@@ -3031,7 +3170,7 @@
             <w:noProof/>
             <w:webHidden/>
           </w:rPr>
-          <w:instrText xml:space="preserve"> PAGEREF _Toc234055083 \h </w:instrText>
+          <w:instrText xml:space="preserve"> PAGEREF _Toc234060597 \h </w:instrText>
         </w:r>
         <w:r>
           <w:rPr>
@@ -3074,7 +3213,7 @@
           <w:lang w:eastAsia="en-GB"/>
         </w:rPr>
       </w:pPr>
-      <w:hyperlink w:anchor="_Toc234055084" w:history="1">
+      <w:hyperlink w:anchor="_Toc234060598" w:history="1">
         <w:r>
           <w:rPr>
             <w:rStyle w:val="Hyperlink"/>
@@ -3101,7 +3240,7 @@
             <w:noProof/>
             <w:webHidden/>
           </w:rPr>
-          <w:instrText xml:space="preserve"> PAGEREF _Toc234055084 \h </w:instrText>
+          <w:instrText xml:space="preserve"> PAGEREF _Toc234060598 \h </w:instrText>
         </w:r>
         <w:r>
           <w:rPr>
@@ -3144,7 +3283,7 @@
           <w:lang w:eastAsia="en-GB"/>
         </w:rPr>
       </w:pPr>
-      <w:hyperlink w:anchor="_Toc234055085" w:history="1">
+      <w:hyperlink w:anchor="_Toc234060599" w:history="1">
         <w:r>
           <w:rPr>
             <w:rStyle w:val="Hyperlink"/>
@@ -3171,7 +3310,7 @@
             <w:noProof/>
             <w:webHidden/>
           </w:rPr>
-          <w:instrText xml:space="preserve"> PAGEREF _Toc234055085 \h </w:instrText>
+          <w:instrText xml:space="preserve"> PAGEREF _Toc234060599 \h </w:instrText>
         </w:r>
         <w:r>
           <w:rPr>
@@ -3214,7 +3353,7 @@
           <w:lang w:eastAsia="en-GB"/>
         </w:rPr>
       </w:pPr>
-      <w:hyperlink w:anchor="_Toc234055086" w:history="1">
+      <w:hyperlink w:anchor="_Toc234060600" w:history="1">
         <w:r>
           <w:rPr>
             <w:rStyle w:val="Hyperlink"/>
@@ -3241,7 +3380,7 @@
             <w:noProof/>
             <w:webHidden/>
           </w:rPr>
-          <w:instrText xml:space="preserve"> PAGEREF _Toc234055086 \h </w:instrText>
+          <w:instrText xml:space="preserve"> PAGEREF _Toc234060600 \h </w:instrText>
         </w:r>
         <w:r>
           <w:rPr>
@@ -3284,7 +3423,7 @@
           <w:lang w:eastAsia="en-GB"/>
         </w:rPr>
       </w:pPr>
-      <w:hyperlink w:anchor="_Toc234055087" w:history="1">
+      <w:hyperlink w:anchor="_Toc234060601" w:history="1">
         <w:r>
           <w:rPr>
             <w:rStyle w:val="Hyperlink"/>
@@ -3311,7 +3450,7 @@
             <w:noProof/>
             <w:webHidden/>
           </w:rPr>
-          <w:instrText xml:space="preserve"> PAGEREF _Toc234055087 \h </w:instrText>
+          <w:instrText xml:space="preserve"> PAGEREF _Toc234060601 \h </w:instrText>
         </w:r>
         <w:r>
           <w:rPr>
@@ -3391,7 +3530,7 @@
           <w:lang w:eastAsia="en-GB"/>
         </w:rPr>
       </w:pPr>
-      <w:bookmarkStart w:id="2" w:name="_Toc234055059"/>
+      <w:bookmarkStart w:id="2" w:name="_Toc234060573"/>
       <w:bookmarkEnd w:id="1"/>
       <w:r>
         <w:rPr>
@@ -3472,7 +3611,7 @@
           <w:lang w:eastAsia="en-GB"/>
         </w:rPr>
       </w:pPr>
-      <w:bookmarkStart w:id="3" w:name="_Toc234055060"/>
+      <w:bookmarkStart w:id="3" w:name="_Toc234060574"/>
       <w:r>
         <w:rPr>
           <w:lang w:eastAsia="en-GB"/>
@@ -3699,7 +3838,7 @@
         </w:rPr>
       </w:pPr>
       <w:bookmarkStart w:id="4" w:name="_Ref232757332"/>
-      <w:bookmarkStart w:id="5" w:name="_Toc234055079"/>
+      <w:bookmarkStart w:id="5" w:name="_Toc234060593"/>
       <w:r>
         <w:t xml:space="preserve">Figure </w:t>
       </w:r>
@@ -4057,7 +4196,7 @@
           <w:lang w:eastAsia="en-GB"/>
         </w:rPr>
       </w:pPr>
-      <w:bookmarkStart w:id="6" w:name="_Toc234055061"/>
+      <w:bookmarkStart w:id="6" w:name="_Toc234060575"/>
       <w:r>
         <w:rPr>
           <w:lang w:eastAsia="en-GB"/>
@@ -4580,6 +4719,77 @@
       </w:tr>
       <w:tr>
         <w:trPr>
+          <w:jc w:val="center"/>
+        </w:trPr>
+        <w:tc>
+          <w:tcPr>
+            <w:tcW w:w="2008" w:type="dxa"/>
+          </w:tcPr>
+          <w:p>
+            <w:pPr>
+              <w:rPr>
+                <w:sz w:val="20"/>
+                <w:szCs w:val="20"/>
+                <w:lang w:eastAsia="en-GB"/>
+              </w:rPr>
+            </w:pPr>
+            <w:r>
+              <w:rPr>
+                <w:sz w:val="20"/>
+                <w:szCs w:val="20"/>
+                <w:lang w:eastAsia="en-GB"/>
+              </w:rPr>
+              <w:t>RESET</w:t>
+            </w:r>
+          </w:p>
+        </w:tc>
+        <w:tc>
+          <w:tcPr>
+            <w:tcW w:w="1294" w:type="dxa"/>
+          </w:tcPr>
+          <w:p>
+            <w:pPr>
+              <w:rPr>
+                <w:sz w:val="20"/>
+                <w:szCs w:val="20"/>
+                <w:lang w:eastAsia="en-GB"/>
+              </w:rPr>
+            </w:pPr>
+            <w:r>
+              <w:rPr>
+                <w:sz w:val="20"/>
+                <w:szCs w:val="20"/>
+                <w:lang w:eastAsia="en-GB"/>
+              </w:rPr>
+              <w:t>RESET</w:t>
+            </w:r>
+          </w:p>
+        </w:tc>
+        <w:tc>
+          <w:tcPr>
+            <w:tcW w:w="1553" w:type="dxa"/>
+          </w:tcPr>
+          <w:p>
+            <w:pPr>
+              <w:rPr>
+                <w:sz w:val="20"/>
+                <w:szCs w:val="20"/>
+                <w:lang w:eastAsia="en-GB"/>
+              </w:rPr>
+            </w:pPr>
+            <w:r>
+              <w:rPr>
+                <w:sz w:val="20"/>
+                <w:szCs w:val="20"/>
+                <w:lang w:eastAsia="en-GB"/>
+              </w:rPr>
+              <w:t>Output</w:t>
+            </w:r>
+          </w:p>
+        </w:tc>
+      </w:tr>
+      <w:tr>
+        <w:trPr>
           <w:trHeight w:val="57"/>
           <w:jc w:val="center"/>
         </w:trPr>
@@ -5586,7 +5796,7 @@
           <w:lang w:eastAsia="en-GB"/>
         </w:rPr>
       </w:pPr>
-      <w:bookmarkStart w:id="8" w:name="_Toc234055062"/>
+      <w:bookmarkStart w:id="8" w:name="_Toc234060576"/>
       <w:r>
         <w:rPr>
           <w:lang w:eastAsia="en-GB"/>
@@ -5657,7 +5867,7 @@
           <w:lang w:eastAsia="en-GB"/>
         </w:rPr>
       </w:pPr>
-      <w:bookmarkStart w:id="9" w:name="_Toc234055063"/>
+      <w:bookmarkStart w:id="9" w:name="_Toc234060577"/>
       <w:r>
         <w:rPr>
           <w:rFonts w:eastAsiaTheme="minorHAnsi"/>
@@ -5669,7 +5879,19 @@
         <w:rPr>
           <w:lang w:eastAsia="en-GB"/>
         </w:rPr>
-        <w:t>Latch Instruction Decode O</w:t>
+        <w:t xml:space="preserve">Instruction </w:t>
+      </w:r>
+      <w:r>
+        <w:rPr>
+          <w:lang w:eastAsia="en-GB"/>
+        </w:rPr>
+        <w:t xml:space="preserve">Latch and </w:t>
+      </w:r>
+      <w:r>
+        <w:rPr>
+          <w:lang w:eastAsia="en-GB"/>
+        </w:rPr>
+        <w:t>Decode O</w:t>
       </w:r>
       <w:r>
         <w:rPr>
@@ -5689,7 +5911,7 @@
         <w:rPr>
           <w:lang w:eastAsia="en-GB"/>
         </w:rPr>
-        <w:t xml:space="preserve">This is the first row of each sequence shown in ref </w:t>
+        <w:t xml:space="preserve">These are the requirements for the Opcode Latch shown in </w:t>
       </w:r>
       <w:r>
         <w:rPr>
@@ -5701,6 +5923,87 @@
         <w:rPr>
           <w:lang w:eastAsia="en-GB"/>
         </w:rPr>
+        <w:instrText xml:space="preserve"> REF _Ref232762527 \h </w:instrText>
+      </w:r>
+      <w:r>
+        <w:rPr>
+          <w:lang w:eastAsia="en-GB"/>
+        </w:rPr>
+      </w:r>
+      <w:r>
+        <w:rPr>
+          <w:lang w:eastAsia="en-GB"/>
+        </w:rPr>
+        <w:fldChar w:fldCharType="separate"/>
+      </w:r>
+      <w:r>
+        <w:t xml:space="preserve">Figure </w:t>
+      </w:r>
+      <w:r>
+        <w:rPr>
+          <w:noProof/>
+        </w:rPr>
+        <w:t>2</w:t>
+      </w:r>
+      <w:r>
+        <w:rPr>
+          <w:lang w:eastAsia="en-GB"/>
+        </w:rPr>
+        <w:fldChar w:fldCharType="end"/>
+      </w:r>
+      <w:r>
+        <w:rPr>
+          <w:lang w:eastAsia="en-GB"/>
+        </w:rPr>
+        <w:t>.</w:t>
+      </w:r>
+    </w:p>
+    <w:p>
+      <w:pPr>
+        <w:rPr>
+          <w:lang w:eastAsia="en-GB"/>
+        </w:rPr>
+      </w:pPr>
+      <w:r>
+        <w:rPr>
+          <w:lang w:eastAsia="en-GB"/>
+        </w:rPr>
+        <w:t xml:space="preserve">This is the </w:t>
+      </w:r>
+      <w:r>
+        <w:rPr>
+          <w:lang w:eastAsia="en-GB"/>
+        </w:rPr>
+        <w:t>done in step 0 of</w:t>
+      </w:r>
+      <w:r>
+        <w:rPr>
+          <w:lang w:eastAsia="en-GB"/>
+        </w:rPr>
+        <w:t xml:space="preserve"> each sequence </w:t>
+      </w:r>
+      <w:r>
+        <w:rPr>
+          <w:lang w:eastAsia="en-GB"/>
+        </w:rPr>
+        <w:t xml:space="preserve">as </w:t>
+      </w:r>
+      <w:r>
+        <w:rPr>
+          <w:lang w:eastAsia="en-GB"/>
+        </w:rPr>
+        <w:t xml:space="preserve">shown in ref </w:t>
+      </w:r>
+      <w:r>
+        <w:rPr>
+          <w:lang w:eastAsia="en-GB"/>
+        </w:rPr>
+        <w:fldChar w:fldCharType="begin"/>
+      </w:r>
+      <w:r>
+        <w:rPr>
+          <w:lang w:eastAsia="en-GB"/>
+        </w:rPr>
         <w:instrText xml:space="preserve"> REF RefL1SeqXlsx \r \h </w:instrText>
       </w:r>
       <w:r>
@@ -5803,7 +6106,31 @@
         <w:rPr>
           <w:lang w:eastAsia="en-GB"/>
         </w:rPr>
-        <w:t>The first thing that has to be extracted from the opcode, and stored, is the sequence number.</w:t>
+        <w:t xml:space="preserve">The first thing that has to be extracted from the </w:t>
+      </w:r>
+      <w:r>
+        <w:rPr>
+          <w:lang w:eastAsia="en-GB"/>
+        </w:rPr>
+        <w:t xml:space="preserve">latched </w:t>
+      </w:r>
+      <w:r>
+        <w:rPr>
+          <w:lang w:eastAsia="en-GB"/>
+        </w:rPr>
+        <w:t>opcode</w:t>
+      </w:r>
+      <w:r>
+        <w:rPr>
+          <w:lang w:eastAsia="en-GB"/>
+        </w:rPr>
+        <w:t xml:space="preserve"> </w:t>
+      </w:r>
+      <w:r>
+        <w:rPr>
+          <w:lang w:eastAsia="en-GB"/>
+        </w:rPr>
+        <w:t>is the sequence number.</w:t>
       </w:r>
     </w:p>
     <w:p>
@@ -9037,7 +9364,7 @@
           <w:lang w:eastAsia="en-GB"/>
         </w:rPr>
       </w:pPr>
-      <w:bookmarkStart w:id="11" w:name="_Toc234055064"/>
+      <w:bookmarkStart w:id="11" w:name="_Toc234060578"/>
       <w:r>
         <w:rPr>
           <w:lang w:eastAsia="en-GB"/>
@@ -9128,9 +9455,9 @@
         </w:rPr>
         <w:drawing>
           <wp:inline distT="0" distB="0" distL="0" distR="0">
-            <wp:extent cx="5731510" cy="3407327"/>
+            <wp:extent cx="5731510" cy="3380142"/>
             <wp:effectExtent l="19050" t="0" r="2540" b="0"/>
-            <wp:docPr id="8" name="Picture 1"/>
+            <wp:docPr id="9" name="Picture 1"/>
             <wp:cNvGraphicFramePr>
               <a:graphicFrameLocks xmlns:a="http://schemas.openxmlformats.org/drawingml/2006/main" noChangeAspect="1"/>
             </wp:cNvGraphicFramePr>
@@ -9153,7 +9480,7 @@
                   <pic:spPr bwMode="auto">
                     <a:xfrm>
                       <a:off x="0" y="0"/>
-                      <a:ext cx="5731510" cy="3407327"/>
+                      <a:ext cx="5731510" cy="3380142"/>
                     </a:xfrm>
                     <a:prstGeom prst="rect">
                       <a:avLst/>
@@ -9180,7 +9507,7 @@
       </w:pPr>
       <w:bookmarkStart w:id="12" w:name="_Ref232762527"/>
       <w:bookmarkStart w:id="13" w:name="_Ref233641508"/>
-      <w:bookmarkStart w:id="14" w:name="_Toc234055080"/>
+      <w:bookmarkStart w:id="14" w:name="_Toc234060594"/>
       <w:r>
         <w:t xml:space="preserve">Figure </w:t>
       </w:r>
@@ -9238,7 +9565,7 @@
           <w:lang w:eastAsia="en-GB"/>
         </w:rPr>
       </w:pPr>
-      <w:bookmarkStart w:id="15" w:name="_Toc234055065"/>
+      <w:bookmarkStart w:id="15" w:name="_Toc234060579"/>
       <w:r>
         <w:rPr>
           <w:lang w:eastAsia="en-GB"/>
@@ -9351,7 +9678,7 @@
         </w:rPr>
       </w:pPr>
       <w:bookmarkStart w:id="16" w:name="_Ref233894649"/>
-      <w:bookmarkStart w:id="17" w:name="_Toc234055066"/>
+      <w:bookmarkStart w:id="17" w:name="_Toc234060580"/>
       <w:r>
         <w:rPr>
           <w:lang w:eastAsia="en-GB"/>
@@ -9790,7 +10117,7 @@
         <w:jc w:val="center"/>
       </w:pPr>
       <w:bookmarkStart w:id="18" w:name="_Ref233471569"/>
-      <w:bookmarkStart w:id="19" w:name="_Toc234055081"/>
+      <w:bookmarkStart w:id="19" w:name="_Toc234060595"/>
       <w:r>
         <w:t xml:space="preserve">Figure </w:t>
       </w:r>
@@ -10093,7 +10420,7 @@
         <w:jc w:val="center"/>
       </w:pPr>
       <w:bookmarkStart w:id="20" w:name="_Ref233472606"/>
-      <w:bookmarkStart w:id="21" w:name="_Toc234055082"/>
+      <w:bookmarkStart w:id="21" w:name="_Toc234060596"/>
       <w:r>
         <w:t xml:space="preserve">Figure </w:t>
       </w:r>
@@ -10208,7 +10535,7 @@
           <w:lang w:eastAsia="en-GB"/>
         </w:rPr>
       </w:pPr>
-      <w:bookmarkStart w:id="24" w:name="_Toc234055067"/>
+      <w:bookmarkStart w:id="24" w:name="_Toc234060581"/>
       <w:r>
         <w:rPr>
           <w:lang w:eastAsia="en-GB"/>
@@ -10374,7 +10701,7 @@
         </w:rPr>
       </w:pPr>
       <w:bookmarkStart w:id="25" w:name="_Ref233900184"/>
-      <w:bookmarkStart w:id="26" w:name="_Toc234055068"/>
+      <w:bookmarkStart w:id="26" w:name="_Toc234060582"/>
       <w:r>
         <w:rPr>
           <w:lang w:eastAsia="en-GB"/>
@@ -10521,7 +10848,7 @@
         </w:rPr>
       </w:pPr>
       <w:bookmarkStart w:id="27" w:name="_Ref233641794"/>
-      <w:bookmarkStart w:id="28" w:name="_Toc234055069"/>
+      <w:bookmarkStart w:id="28" w:name="_Toc234060583"/>
       <w:r>
         <w:rPr>
           <w:lang w:eastAsia="en-GB"/>
@@ -11295,7 +11622,7 @@
         </w:rPr>
       </w:pPr>
       <w:bookmarkStart w:id="31" w:name="_Ref233543378"/>
-      <w:bookmarkStart w:id="32" w:name="_Toc234055070"/>
+      <w:bookmarkStart w:id="32" w:name="_Toc234060584"/>
       <w:r>
         <w:rPr>
           <w:lang w:eastAsia="en-GB"/>
@@ -11481,7 +11808,7 @@
         <w:jc w:val="center"/>
       </w:pPr>
       <w:bookmarkStart w:id="33" w:name="_Ref233534511"/>
-      <w:bookmarkStart w:id="34" w:name="_Toc234055083"/>
+      <w:bookmarkStart w:id="34" w:name="_Toc234060597"/>
       <w:r>
         <w:t xml:space="preserve">Figure </w:t>
       </w:r>
@@ -11859,7 +12186,7 @@
           <w:lang w:eastAsia="en-GB"/>
         </w:rPr>
       </w:pPr>
-      <w:bookmarkStart w:id="35" w:name="_Toc234055071"/>
+      <w:bookmarkStart w:id="35" w:name="_Toc234060585"/>
       <w:r>
         <w:rPr>
           <w:lang w:eastAsia="en-GB"/>
@@ -12228,7 +12555,7 @@
           <w:lang w:eastAsia="en-GB"/>
         </w:rPr>
       </w:pPr>
-      <w:bookmarkStart w:id="36" w:name="_Toc234055072"/>
+      <w:bookmarkStart w:id="36" w:name="_Toc234060586"/>
       <w:r>
         <w:rPr>
           <w:lang w:eastAsia="en-GB"/>
@@ -12485,7 +12812,7 @@
           <w:lang w:eastAsia="en-GB"/>
         </w:rPr>
       </w:pPr>
-      <w:bookmarkStart w:id="37" w:name="_Toc234055073"/>
+      <w:bookmarkStart w:id="37" w:name="_Toc234060587"/>
       <w:r>
         <w:rPr>
           <w:lang w:eastAsia="en-GB"/>
@@ -12558,7 +12885,7 @@
           <w:lang w:eastAsia="en-GB"/>
         </w:rPr>
       </w:pPr>
-      <w:bookmarkStart w:id="38" w:name="_Toc234055074"/>
+      <w:bookmarkStart w:id="38" w:name="_Toc234060588"/>
       <w:r>
         <w:rPr>
           <w:lang w:eastAsia="en-GB"/>
@@ -12701,7 +13028,7 @@
         </w:rPr>
       </w:pPr>
       <w:bookmarkStart w:id="39" w:name="_Ref233797296"/>
-      <w:bookmarkStart w:id="40" w:name="_Toc234055075"/>
+      <w:bookmarkStart w:id="40" w:name="_Toc234060589"/>
       <w:r>
         <w:rPr>
           <w:lang w:eastAsia="en-GB"/>
@@ -12882,7 +13209,7 @@
         <w:jc w:val="center"/>
       </w:pPr>
       <w:bookmarkStart w:id="41" w:name="_Ref233641691"/>
-      <w:bookmarkStart w:id="42" w:name="_Toc234055084"/>
+      <w:bookmarkStart w:id="42" w:name="_Toc234060598"/>
       <w:r>
         <w:t xml:space="preserve">Figure </w:t>
       </w:r>
@@ -13036,7 +13363,7 @@
         <w:jc w:val="center"/>
       </w:pPr>
       <w:bookmarkStart w:id="43" w:name="_Ref233648800"/>
-      <w:bookmarkStart w:id="44" w:name="_Toc234055085"/>
+      <w:bookmarkStart w:id="44" w:name="_Toc234060599"/>
       <w:r>
         <w:t xml:space="preserve">Figure </w:t>
       </w:r>
@@ -13133,7 +13460,7 @@
         </w:rPr>
       </w:pPr>
       <w:bookmarkStart w:id="45" w:name="_Ref233901870"/>
-      <w:bookmarkStart w:id="46" w:name="_Toc234055076"/>
+      <w:bookmarkStart w:id="46" w:name="_Toc234060590"/>
       <w:r>
         <w:rPr>
           <w:lang w:eastAsia="en-GB"/>
@@ -13350,7 +13677,7 @@
       </w:pPr>
       <w:bookmarkStart w:id="47" w:name="_Ref233894277"/>
       <w:bookmarkStart w:id="48" w:name="_Ref233894262"/>
-      <w:bookmarkStart w:id="49" w:name="_Toc234055086"/>
+      <w:bookmarkStart w:id="49" w:name="_Toc234060600"/>
       <w:r>
         <w:t xml:space="preserve">Figure </w:t>
       </w:r>
@@ -13996,7 +14323,7 @@
         <w:jc w:val="center"/>
       </w:pPr>
       <w:bookmarkStart w:id="50" w:name="_Ref233899110"/>
-      <w:bookmarkStart w:id="51" w:name="_Toc234055087"/>
+      <w:bookmarkStart w:id="51" w:name="_Toc234060601"/>
       <w:r>
         <w:t xml:space="preserve">Figure </w:t>
       </w:r>
@@ -14547,7 +14874,7 @@
         </w:rPr>
       </w:pPr>
       <w:bookmarkStart w:id="54" w:name="_Ref233901979"/>
-      <w:bookmarkStart w:id="55" w:name="_Toc234055077"/>
+      <w:bookmarkStart w:id="55" w:name="_Toc234060591"/>
       <w:r>
         <w:rPr>
           <w:lang w:eastAsia="en-GB"/>
@@ -15215,7 +15542,7 @@
           <w:lang w:eastAsia="en-GB"/>
         </w:rPr>
       </w:pPr>
-      <w:bookmarkStart w:id="56" w:name="_Toc234055078"/>
+      <w:bookmarkStart w:id="56" w:name="_Toc234060592"/>
       <w:r>
         <w:rPr>
           <w:lang w:eastAsia="en-GB"/>
@@ -15503,7 +15830,7 @@
         <w:color w:val="7F7F7F" w:themeColor="background1" w:themeShade="7F"/>
         <w:spacing w:val="60"/>
       </w:rPr>
-      <w:id w:val="75242279"/>
+      <w:id w:val="232431556"/>
       <w:docPartObj>
         <w:docPartGallery w:val="Page Numbers (Top of Page)"/>
         <w:docPartUnique/>
@@ -15543,7 +15870,7 @@
               <w:b/>
               <w:noProof/>
             </w:rPr>
-            <w:t>15</w:t>
+            <w:t>ii</w:t>
           </w:r>
         </w:fldSimple>
       </w:p>
@@ -21285,7 +21612,7 @@
 </file>
 
 <file path=customXml/itemProps2.xml><?xml version="1.0" encoding="utf-8"?>
-<ds:datastoreItem xmlns:ds="http://schemas.openxmlformats.org/officeDocument/2006/customXml" ds:itemID="{278C945B-7259-4C39-AF60-EA268F12474E}">
+<ds:datastoreItem xmlns:ds="http://schemas.openxmlformats.org/officeDocument/2006/customXml" ds:itemID="{AFB8BF4A-148C-4367-8465-3539200B9C6E}">
   <ds:schemaRefs>
     <ds:schemaRef ds:uri="http://schemas.openxmlformats.org/officeDocument/2006/bibliography"/>
   </ds:schemaRefs>

</xml_diff>

<commit_message>
Fix typos for Boolean equations for OLS in 4.1
</commit_message>
<xml_diff>
--- a/CPU Design/L1IsDesign.docx
+++ b/CPU Design/L1IsDesign.docx
@@ -960,6 +960,54 @@
                   <w:t>.</w:t>
                 </w:r>
               </w:p>
+              <w:p>
+                <w:pPr>
+                  <w:rPr>
+                    <w:rFonts w:cstheme="minorHAnsi"/>
+                  </w:rPr>
+                </w:pPr>
+                <w:r>
+                  <w:rPr>
+                    <w:rFonts w:cstheme="minorHAnsi"/>
+                  </w:rPr>
+                  <w:t xml:space="preserve">Fixed typos for OLS Boolean equations in </w:t>
+                </w:r>
+                <w:r>
+                  <w:rPr>
+                    <w:rFonts w:cstheme="minorHAnsi"/>
+                  </w:rPr>
+                  <w:fldChar w:fldCharType="begin"/>
+                </w:r>
+                <w:r>
+                  <w:rPr>
+                    <w:rFonts w:cstheme="minorHAnsi"/>
+                  </w:rPr>
+                  <w:instrText xml:space="preserve"> REF _Ref233901870 \r \h </w:instrText>
+                </w:r>
+                <w:r>
+                  <w:rPr>
+                    <w:rFonts w:cstheme="minorHAnsi"/>
+                  </w:rPr>
+                </w:r>
+                <w:r>
+                  <w:rPr>
+                    <w:rFonts w:cstheme="minorHAnsi"/>
+                  </w:rPr>
+                  <w:fldChar w:fldCharType="separate"/>
+                </w:r>
+                <w:r>
+                  <w:rPr>
+                    <w:rFonts w:cstheme="minorHAnsi"/>
+                  </w:rPr>
+                  <w:t>4.1</w:t>
+                </w:r>
+                <w:r>
+                  <w:rPr>
+                    <w:rFonts w:cstheme="minorHAnsi"/>
+                  </w:rPr>
+                  <w:fldChar w:fldCharType="end"/>
+                </w:r>
+              </w:p>
             </w:tc>
           </w:tr>
         </w:tbl>
@@ -1030,7 +1078,7 @@
           <w:r>
             <w:fldChar w:fldCharType="separate"/>
           </w:r>
-          <w:hyperlink w:anchor="_Toc234060573" w:history="1">
+          <w:hyperlink w:anchor="_Toc234070362" w:history="1">
             <w:r>
               <w:rPr>
                 <w:rStyle w:val="Hyperlink"/>
@@ -1076,7 +1124,7 @@
                 <w:noProof/>
                 <w:webHidden/>
               </w:rPr>
-              <w:instrText xml:space="preserve"> PAGEREF _Toc234060573 \h </w:instrText>
+              <w:instrText xml:space="preserve"> PAGEREF _Toc234070362 \h </w:instrText>
             </w:r>
             <w:r>
               <w:rPr>
@@ -1120,7 +1168,7 @@
               <w:lang w:eastAsia="en-GB"/>
             </w:rPr>
           </w:pPr>
-          <w:hyperlink w:anchor="_Toc234060574" w:history="1">
+          <w:hyperlink w:anchor="_Toc234070363" w:history="1">
             <w:r>
               <w:rPr>
                 <w:rStyle w:val="Hyperlink"/>
@@ -1164,7 +1212,7 @@
                 <w:noProof/>
                 <w:webHidden/>
               </w:rPr>
-              <w:instrText xml:space="preserve"> PAGEREF _Toc234060574 \h </w:instrText>
+              <w:instrText xml:space="preserve"> PAGEREF _Toc234070363 \h </w:instrText>
             </w:r>
             <w:r>
               <w:rPr>
@@ -1208,7 +1256,7 @@
               <w:lang w:eastAsia="en-GB"/>
             </w:rPr>
           </w:pPr>
-          <w:hyperlink w:anchor="_Toc234060575" w:history="1">
+          <w:hyperlink w:anchor="_Toc234070364" w:history="1">
             <w:r>
               <w:rPr>
                 <w:rStyle w:val="Hyperlink"/>
@@ -1252,7 +1300,7 @@
                 <w:noProof/>
                 <w:webHidden/>
               </w:rPr>
-              <w:instrText xml:space="preserve"> PAGEREF _Toc234060575 \h </w:instrText>
+              <w:instrText xml:space="preserve"> PAGEREF _Toc234070364 \h </w:instrText>
             </w:r>
             <w:r>
               <w:rPr>
@@ -1296,7 +1344,7 @@
               <w:lang w:eastAsia="en-GB"/>
             </w:rPr>
           </w:pPr>
-          <w:hyperlink w:anchor="_Toc234060576" w:history="1">
+          <w:hyperlink w:anchor="_Toc234070365" w:history="1">
             <w:r>
               <w:rPr>
                 <w:rStyle w:val="Hyperlink"/>
@@ -1340,7 +1388,7 @@
                 <w:noProof/>
                 <w:webHidden/>
               </w:rPr>
-              <w:instrText xml:space="preserve"> PAGEREF _Toc234060576 \h </w:instrText>
+              <w:instrText xml:space="preserve"> PAGEREF _Toc234070365 \h </w:instrText>
             </w:r>
             <w:r>
               <w:rPr>
@@ -1384,7 +1432,7 @@
               <w:lang w:eastAsia="en-GB"/>
             </w:rPr>
           </w:pPr>
-          <w:hyperlink w:anchor="_Toc234060577" w:history="1">
+          <w:hyperlink w:anchor="_Toc234070366" w:history="1">
             <w:r>
               <w:rPr>
                 <w:rStyle w:val="Hyperlink"/>
@@ -1428,7 +1476,7 @@
                 <w:noProof/>
                 <w:webHidden/>
               </w:rPr>
-              <w:instrText xml:space="preserve"> PAGEREF _Toc234060577 \h </w:instrText>
+              <w:instrText xml:space="preserve"> PAGEREF _Toc234070366 \h </w:instrText>
             </w:r>
             <w:r>
               <w:rPr>
@@ -1472,7 +1520,7 @@
               <w:lang w:eastAsia="en-GB"/>
             </w:rPr>
           </w:pPr>
-          <w:hyperlink w:anchor="_Toc234060578" w:history="1">
+          <w:hyperlink w:anchor="_Toc234070367" w:history="1">
             <w:r>
               <w:rPr>
                 <w:rStyle w:val="Hyperlink"/>
@@ -1516,7 +1564,7 @@
                 <w:noProof/>
                 <w:webHidden/>
               </w:rPr>
-              <w:instrText xml:space="preserve"> PAGEREF _Toc234060578 \h </w:instrText>
+              <w:instrText xml:space="preserve"> PAGEREF _Toc234070367 \h </w:instrText>
             </w:r>
             <w:r>
               <w:rPr>
@@ -1560,7 +1608,7 @@
               <w:lang w:eastAsia="en-GB"/>
             </w:rPr>
           </w:pPr>
-          <w:hyperlink w:anchor="_Toc234060579" w:history="1">
+          <w:hyperlink w:anchor="_Toc234070368" w:history="1">
             <w:r>
               <w:rPr>
                 <w:rStyle w:val="Hyperlink"/>
@@ -1611,7 +1659,7 @@
                 <w:noProof/>
                 <w:webHidden/>
               </w:rPr>
-              <w:instrText xml:space="preserve"> PAGEREF _Toc234060579 \h </w:instrText>
+              <w:instrText xml:space="preserve"> PAGEREF _Toc234070368 \h </w:instrText>
             </w:r>
             <w:r>
               <w:rPr>
@@ -1655,7 +1703,7 @@
               <w:lang w:eastAsia="en-GB"/>
             </w:rPr>
           </w:pPr>
-          <w:hyperlink w:anchor="_Toc234060580" w:history="1">
+          <w:hyperlink w:anchor="_Toc234070369" w:history="1">
             <w:r>
               <w:rPr>
                 <w:rStyle w:val="Hyperlink"/>
@@ -1699,7 +1747,7 @@
                 <w:noProof/>
                 <w:webHidden/>
               </w:rPr>
-              <w:instrText xml:space="preserve"> PAGEREF _Toc234060580 \h </w:instrText>
+              <w:instrText xml:space="preserve"> PAGEREF _Toc234070369 \h </w:instrText>
             </w:r>
             <w:r>
               <w:rPr>
@@ -1743,7 +1791,7 @@
               <w:lang w:eastAsia="en-GB"/>
             </w:rPr>
           </w:pPr>
-          <w:hyperlink w:anchor="_Toc234060581" w:history="1">
+          <w:hyperlink w:anchor="_Toc234070370" w:history="1">
             <w:r>
               <w:rPr>
                 <w:rStyle w:val="Hyperlink"/>
@@ -1787,7 +1835,7 @@
                 <w:noProof/>
                 <w:webHidden/>
               </w:rPr>
-              <w:instrText xml:space="preserve"> PAGEREF _Toc234060581 \h </w:instrText>
+              <w:instrText xml:space="preserve"> PAGEREF _Toc234070370 \h </w:instrText>
             </w:r>
             <w:r>
               <w:rPr>
@@ -1831,7 +1879,7 @@
               <w:lang w:eastAsia="en-GB"/>
             </w:rPr>
           </w:pPr>
-          <w:hyperlink w:anchor="_Toc234060582" w:history="1">
+          <w:hyperlink w:anchor="_Toc234070371" w:history="1">
             <w:r>
               <w:rPr>
                 <w:rStyle w:val="Hyperlink"/>
@@ -1875,7 +1923,7 @@
                 <w:noProof/>
                 <w:webHidden/>
               </w:rPr>
-              <w:instrText xml:space="preserve"> PAGEREF _Toc234060582 \h </w:instrText>
+              <w:instrText xml:space="preserve"> PAGEREF _Toc234070371 \h </w:instrText>
             </w:r>
             <w:r>
               <w:rPr>
@@ -1919,7 +1967,7 @@
               <w:lang w:eastAsia="en-GB"/>
             </w:rPr>
           </w:pPr>
-          <w:hyperlink w:anchor="_Toc234060583" w:history="1">
+          <w:hyperlink w:anchor="_Toc234070372" w:history="1">
             <w:r>
               <w:rPr>
                 <w:rStyle w:val="Hyperlink"/>
@@ -1963,7 +2011,7 @@
                 <w:noProof/>
                 <w:webHidden/>
               </w:rPr>
-              <w:instrText xml:space="preserve"> PAGEREF _Toc234060583 \h </w:instrText>
+              <w:instrText xml:space="preserve"> PAGEREF _Toc234070372 \h </w:instrText>
             </w:r>
             <w:r>
               <w:rPr>
@@ -2007,7 +2055,7 @@
               <w:lang w:eastAsia="en-GB"/>
             </w:rPr>
           </w:pPr>
-          <w:hyperlink w:anchor="_Toc234060584" w:history="1">
+          <w:hyperlink w:anchor="_Toc234070373" w:history="1">
             <w:r>
               <w:rPr>
                 <w:rStyle w:val="Hyperlink"/>
@@ -2051,7 +2099,7 @@
                 <w:noProof/>
                 <w:webHidden/>
               </w:rPr>
-              <w:instrText xml:space="preserve"> PAGEREF _Toc234060584 \h </w:instrText>
+              <w:instrText xml:space="preserve"> PAGEREF _Toc234070373 \h </w:instrText>
             </w:r>
             <w:r>
               <w:rPr>
@@ -2095,7 +2143,7 @@
               <w:lang w:eastAsia="en-GB"/>
             </w:rPr>
           </w:pPr>
-          <w:hyperlink w:anchor="_Toc234060585" w:history="1">
+          <w:hyperlink w:anchor="_Toc234070374" w:history="1">
             <w:r>
               <w:rPr>
                 <w:rStyle w:val="Hyperlink"/>
@@ -2139,7 +2187,7 @@
                 <w:noProof/>
                 <w:webHidden/>
               </w:rPr>
-              <w:instrText xml:space="preserve"> PAGEREF _Toc234060585 \h </w:instrText>
+              <w:instrText xml:space="preserve"> PAGEREF _Toc234070374 \h </w:instrText>
             </w:r>
             <w:r>
               <w:rPr>
@@ -2183,7 +2231,7 @@
               <w:lang w:eastAsia="en-GB"/>
             </w:rPr>
           </w:pPr>
-          <w:hyperlink w:anchor="_Toc234060586" w:history="1">
+          <w:hyperlink w:anchor="_Toc234070375" w:history="1">
             <w:r>
               <w:rPr>
                 <w:rStyle w:val="Hyperlink"/>
@@ -2227,7 +2275,7 @@
                 <w:noProof/>
                 <w:webHidden/>
               </w:rPr>
-              <w:instrText xml:space="preserve"> PAGEREF _Toc234060586 \h </w:instrText>
+              <w:instrText xml:space="preserve"> PAGEREF _Toc234070375 \h </w:instrText>
             </w:r>
             <w:r>
               <w:rPr>
@@ -2271,7 +2319,7 @@
               <w:lang w:eastAsia="en-GB"/>
             </w:rPr>
           </w:pPr>
-          <w:hyperlink w:anchor="_Toc234060587" w:history="1">
+          <w:hyperlink w:anchor="_Toc234070376" w:history="1">
             <w:r>
               <w:rPr>
                 <w:rStyle w:val="Hyperlink"/>
@@ -2315,7 +2363,7 @@
                 <w:noProof/>
                 <w:webHidden/>
               </w:rPr>
-              <w:instrText xml:space="preserve"> PAGEREF _Toc234060587 \h </w:instrText>
+              <w:instrText xml:space="preserve"> PAGEREF _Toc234070376 \h </w:instrText>
             </w:r>
             <w:r>
               <w:rPr>
@@ -2359,7 +2407,7 @@
               <w:lang w:eastAsia="en-GB"/>
             </w:rPr>
           </w:pPr>
-          <w:hyperlink w:anchor="_Toc234060588" w:history="1">
+          <w:hyperlink w:anchor="_Toc234070377" w:history="1">
             <w:r>
               <w:rPr>
                 <w:rStyle w:val="Hyperlink"/>
@@ -2403,7 +2451,7 @@
                 <w:noProof/>
                 <w:webHidden/>
               </w:rPr>
-              <w:instrText xml:space="preserve"> PAGEREF _Toc234060588 \h </w:instrText>
+              <w:instrText xml:space="preserve"> PAGEREF _Toc234070377 \h </w:instrText>
             </w:r>
             <w:r>
               <w:rPr>
@@ -2447,7 +2495,7 @@
               <w:lang w:eastAsia="en-GB"/>
             </w:rPr>
           </w:pPr>
-          <w:hyperlink w:anchor="_Toc234060589" w:history="1">
+          <w:hyperlink w:anchor="_Toc234070378" w:history="1">
             <w:r>
               <w:rPr>
                 <w:rStyle w:val="Hyperlink"/>
@@ -2491,7 +2539,7 @@
                 <w:noProof/>
                 <w:webHidden/>
               </w:rPr>
-              <w:instrText xml:space="preserve"> PAGEREF _Toc234060589 \h </w:instrText>
+              <w:instrText xml:space="preserve"> PAGEREF _Toc234070378 \h </w:instrText>
             </w:r>
             <w:r>
               <w:rPr>
@@ -2535,7 +2583,7 @@
               <w:lang w:eastAsia="en-GB"/>
             </w:rPr>
           </w:pPr>
-          <w:hyperlink w:anchor="_Toc234060590" w:history="1">
+          <w:hyperlink w:anchor="_Toc234070379" w:history="1">
             <w:r>
               <w:rPr>
                 <w:rStyle w:val="Hyperlink"/>
@@ -2579,7 +2627,7 @@
                 <w:noProof/>
                 <w:webHidden/>
               </w:rPr>
-              <w:instrText xml:space="preserve"> PAGEREF _Toc234060590 \h </w:instrText>
+              <w:instrText xml:space="preserve"> PAGEREF _Toc234070379 \h </w:instrText>
             </w:r>
             <w:r>
               <w:rPr>
@@ -2623,7 +2671,7 @@
               <w:lang w:eastAsia="en-GB"/>
             </w:rPr>
           </w:pPr>
-          <w:hyperlink w:anchor="_Toc234060591" w:history="1">
+          <w:hyperlink w:anchor="_Toc234070380" w:history="1">
             <w:r>
               <w:rPr>
                 <w:rStyle w:val="Hyperlink"/>
@@ -2667,7 +2715,7 @@
                 <w:noProof/>
                 <w:webHidden/>
               </w:rPr>
-              <w:instrText xml:space="preserve"> PAGEREF _Toc234060591 \h </w:instrText>
+              <w:instrText xml:space="preserve"> PAGEREF _Toc234070380 \h </w:instrText>
             </w:r>
             <w:r>
               <w:rPr>
@@ -2711,7 +2759,7 @@
               <w:lang w:eastAsia="en-GB"/>
             </w:rPr>
           </w:pPr>
-          <w:hyperlink w:anchor="_Toc234060592" w:history="1">
+          <w:hyperlink w:anchor="_Toc234070381" w:history="1">
             <w:r>
               <w:rPr>
                 <w:rStyle w:val="Hyperlink"/>
@@ -2755,7 +2803,7 @@
                 <w:noProof/>
                 <w:webHidden/>
               </w:rPr>
-              <w:instrText xml:space="preserve"> PAGEREF _Toc234060592 \h </w:instrText>
+              <w:instrText xml:space="preserve"> PAGEREF _Toc234070381 \h </w:instrText>
             </w:r>
             <w:r>
               <w:rPr>
@@ -2863,7 +2911,7 @@
         </w:rPr>
         <w:fldChar w:fldCharType="separate"/>
       </w:r>
-      <w:hyperlink w:anchor="_Toc234060593" w:history="1">
+      <w:hyperlink w:anchor="_Toc234070382" w:history="1">
         <w:r>
           <w:rPr>
             <w:rStyle w:val="Hyperlink"/>
@@ -2890,7 +2938,7 @@
             <w:noProof/>
             <w:webHidden/>
           </w:rPr>
-          <w:instrText xml:space="preserve"> PAGEREF _Toc234060593 \h </w:instrText>
+          <w:instrText xml:space="preserve"> PAGEREF _Toc234070382 \h </w:instrText>
         </w:r>
         <w:r>
           <w:rPr>
@@ -2933,7 +2981,7 @@
           <w:lang w:eastAsia="en-GB"/>
         </w:rPr>
       </w:pPr>
-      <w:hyperlink w:anchor="_Toc234060594" w:history="1">
+      <w:hyperlink w:anchor="_Toc234070383" w:history="1">
         <w:r>
           <w:rPr>
             <w:rStyle w:val="Hyperlink"/>
@@ -2960,7 +3008,7 @@
             <w:noProof/>
             <w:webHidden/>
           </w:rPr>
-          <w:instrText xml:space="preserve"> PAGEREF _Toc234060594 \h </w:instrText>
+          <w:instrText xml:space="preserve"> PAGEREF _Toc234070383 \h </w:instrText>
         </w:r>
         <w:r>
           <w:rPr>
@@ -3003,7 +3051,7 @@
           <w:lang w:eastAsia="en-GB"/>
         </w:rPr>
       </w:pPr>
-      <w:hyperlink w:anchor="_Toc234060595" w:history="1">
+      <w:hyperlink w:anchor="_Toc234070384" w:history="1">
         <w:r>
           <w:rPr>
             <w:rStyle w:val="Hyperlink"/>
@@ -3030,7 +3078,7 @@
             <w:noProof/>
             <w:webHidden/>
           </w:rPr>
-          <w:instrText xml:space="preserve"> PAGEREF _Toc234060595 \h </w:instrText>
+          <w:instrText xml:space="preserve"> PAGEREF _Toc234070384 \h </w:instrText>
         </w:r>
         <w:r>
           <w:rPr>
@@ -3073,7 +3121,7 @@
           <w:lang w:eastAsia="en-GB"/>
         </w:rPr>
       </w:pPr>
-      <w:hyperlink w:anchor="_Toc234060596" w:history="1">
+      <w:hyperlink w:anchor="_Toc234070385" w:history="1">
         <w:r>
           <w:rPr>
             <w:rStyle w:val="Hyperlink"/>
@@ -3100,7 +3148,7 @@
             <w:noProof/>
             <w:webHidden/>
           </w:rPr>
-          <w:instrText xml:space="preserve"> PAGEREF _Toc234060596 \h </w:instrText>
+          <w:instrText xml:space="preserve"> PAGEREF _Toc234070385 \h </w:instrText>
         </w:r>
         <w:r>
           <w:rPr>
@@ -3143,7 +3191,7 @@
           <w:lang w:eastAsia="en-GB"/>
         </w:rPr>
       </w:pPr>
-      <w:hyperlink w:anchor="_Toc234060597" w:history="1">
+      <w:hyperlink w:anchor="_Toc234070386" w:history="1">
         <w:r>
           <w:rPr>
             <w:rStyle w:val="Hyperlink"/>
@@ -3170,7 +3218,7 @@
             <w:noProof/>
             <w:webHidden/>
           </w:rPr>
-          <w:instrText xml:space="preserve"> PAGEREF _Toc234060597 \h </w:instrText>
+          <w:instrText xml:space="preserve"> PAGEREF _Toc234070386 \h </w:instrText>
         </w:r>
         <w:r>
           <w:rPr>
@@ -3213,7 +3261,7 @@
           <w:lang w:eastAsia="en-GB"/>
         </w:rPr>
       </w:pPr>
-      <w:hyperlink w:anchor="_Toc234060598" w:history="1">
+      <w:hyperlink w:anchor="_Toc234070387" w:history="1">
         <w:r>
           <w:rPr>
             <w:rStyle w:val="Hyperlink"/>
@@ -3240,7 +3288,7 @@
             <w:noProof/>
             <w:webHidden/>
           </w:rPr>
-          <w:instrText xml:space="preserve"> PAGEREF _Toc234060598 \h </w:instrText>
+          <w:instrText xml:space="preserve"> PAGEREF _Toc234070387 \h </w:instrText>
         </w:r>
         <w:r>
           <w:rPr>
@@ -3283,7 +3331,7 @@
           <w:lang w:eastAsia="en-GB"/>
         </w:rPr>
       </w:pPr>
-      <w:hyperlink w:anchor="_Toc234060599" w:history="1">
+      <w:hyperlink w:anchor="_Toc234070388" w:history="1">
         <w:r>
           <w:rPr>
             <w:rStyle w:val="Hyperlink"/>
@@ -3310,7 +3358,7 @@
             <w:noProof/>
             <w:webHidden/>
           </w:rPr>
-          <w:instrText xml:space="preserve"> PAGEREF _Toc234060599 \h </w:instrText>
+          <w:instrText xml:space="preserve"> PAGEREF _Toc234070388 \h </w:instrText>
         </w:r>
         <w:r>
           <w:rPr>
@@ -3353,7 +3401,7 @@
           <w:lang w:eastAsia="en-GB"/>
         </w:rPr>
       </w:pPr>
-      <w:hyperlink w:anchor="_Toc234060600" w:history="1">
+      <w:hyperlink w:anchor="_Toc234070389" w:history="1">
         <w:r>
           <w:rPr>
             <w:rStyle w:val="Hyperlink"/>
@@ -3380,7 +3428,7 @@
             <w:noProof/>
             <w:webHidden/>
           </w:rPr>
-          <w:instrText xml:space="preserve"> PAGEREF _Toc234060600 \h </w:instrText>
+          <w:instrText xml:space="preserve"> PAGEREF _Toc234070389 \h </w:instrText>
         </w:r>
         <w:r>
           <w:rPr>
@@ -3423,7 +3471,7 @@
           <w:lang w:eastAsia="en-GB"/>
         </w:rPr>
       </w:pPr>
-      <w:hyperlink w:anchor="_Toc234060601" w:history="1">
+      <w:hyperlink w:anchor="_Toc234070390" w:history="1">
         <w:r>
           <w:rPr>
             <w:rStyle w:val="Hyperlink"/>
@@ -3450,7 +3498,7 @@
             <w:noProof/>
             <w:webHidden/>
           </w:rPr>
-          <w:instrText xml:space="preserve"> PAGEREF _Toc234060601 \h </w:instrText>
+          <w:instrText xml:space="preserve"> PAGEREF _Toc234070390 \h </w:instrText>
         </w:r>
         <w:r>
           <w:rPr>
@@ -3530,7 +3578,7 @@
           <w:lang w:eastAsia="en-GB"/>
         </w:rPr>
       </w:pPr>
-      <w:bookmarkStart w:id="2" w:name="_Toc234060573"/>
+      <w:bookmarkStart w:id="2" w:name="_Toc234070362"/>
       <w:bookmarkEnd w:id="1"/>
       <w:r>
         <w:rPr>
@@ -3611,7 +3659,7 @@
           <w:lang w:eastAsia="en-GB"/>
         </w:rPr>
       </w:pPr>
-      <w:bookmarkStart w:id="3" w:name="_Toc234060574"/>
+      <w:bookmarkStart w:id="3" w:name="_Toc234070363"/>
       <w:r>
         <w:rPr>
           <w:lang w:eastAsia="en-GB"/>
@@ -3838,7 +3886,7 @@
         </w:rPr>
       </w:pPr>
       <w:bookmarkStart w:id="4" w:name="_Ref232757332"/>
-      <w:bookmarkStart w:id="5" w:name="_Toc234060593"/>
+      <w:bookmarkStart w:id="5" w:name="_Toc234070382"/>
       <w:r>
         <w:t xml:space="preserve">Figure </w:t>
       </w:r>
@@ -4196,7 +4244,7 @@
           <w:lang w:eastAsia="en-GB"/>
         </w:rPr>
       </w:pPr>
-      <w:bookmarkStart w:id="6" w:name="_Toc234060575"/>
+      <w:bookmarkStart w:id="6" w:name="_Toc234070364"/>
       <w:r>
         <w:rPr>
           <w:lang w:eastAsia="en-GB"/>
@@ -5796,7 +5844,7 @@
           <w:lang w:eastAsia="en-GB"/>
         </w:rPr>
       </w:pPr>
-      <w:bookmarkStart w:id="8" w:name="_Toc234060576"/>
+      <w:bookmarkStart w:id="8" w:name="_Toc234070365"/>
       <w:r>
         <w:rPr>
           <w:lang w:eastAsia="en-GB"/>
@@ -5867,7 +5915,7 @@
           <w:lang w:eastAsia="en-GB"/>
         </w:rPr>
       </w:pPr>
-      <w:bookmarkStart w:id="9" w:name="_Toc234060577"/>
+      <w:bookmarkStart w:id="9" w:name="_Toc234070366"/>
       <w:r>
         <w:rPr>
           <w:rFonts w:eastAsiaTheme="minorHAnsi"/>
@@ -9364,7 +9412,7 @@
           <w:lang w:eastAsia="en-GB"/>
         </w:rPr>
       </w:pPr>
-      <w:bookmarkStart w:id="11" w:name="_Toc234060578"/>
+      <w:bookmarkStart w:id="11" w:name="_Toc234070367"/>
       <w:r>
         <w:rPr>
           <w:lang w:eastAsia="en-GB"/>
@@ -9507,7 +9555,7 @@
       </w:pPr>
       <w:bookmarkStart w:id="12" w:name="_Ref232762527"/>
       <w:bookmarkStart w:id="13" w:name="_Ref233641508"/>
-      <w:bookmarkStart w:id="14" w:name="_Toc234060594"/>
+      <w:bookmarkStart w:id="14" w:name="_Toc234070383"/>
       <w:r>
         <w:t xml:space="preserve">Figure </w:t>
       </w:r>
@@ -9565,7 +9613,7 @@
           <w:lang w:eastAsia="en-GB"/>
         </w:rPr>
       </w:pPr>
-      <w:bookmarkStart w:id="15" w:name="_Toc234060579"/>
+      <w:bookmarkStart w:id="15" w:name="_Toc234070368"/>
       <w:r>
         <w:rPr>
           <w:lang w:eastAsia="en-GB"/>
@@ -9678,7 +9726,7 @@
         </w:rPr>
       </w:pPr>
       <w:bookmarkStart w:id="16" w:name="_Ref233894649"/>
-      <w:bookmarkStart w:id="17" w:name="_Toc234060580"/>
+      <w:bookmarkStart w:id="17" w:name="_Toc234070369"/>
       <w:r>
         <w:rPr>
           <w:lang w:eastAsia="en-GB"/>
@@ -10117,7 +10165,7 @@
         <w:jc w:val="center"/>
       </w:pPr>
       <w:bookmarkStart w:id="18" w:name="_Ref233471569"/>
-      <w:bookmarkStart w:id="19" w:name="_Toc234060595"/>
+      <w:bookmarkStart w:id="19" w:name="_Toc234070384"/>
       <w:r>
         <w:t xml:space="preserve">Figure </w:t>
       </w:r>
@@ -10420,7 +10468,7 @@
         <w:jc w:val="center"/>
       </w:pPr>
       <w:bookmarkStart w:id="20" w:name="_Ref233472606"/>
-      <w:bookmarkStart w:id="21" w:name="_Toc234060596"/>
+      <w:bookmarkStart w:id="21" w:name="_Toc234070385"/>
       <w:r>
         <w:t xml:space="preserve">Figure </w:t>
       </w:r>
@@ -10535,7 +10583,7 @@
           <w:lang w:eastAsia="en-GB"/>
         </w:rPr>
       </w:pPr>
-      <w:bookmarkStart w:id="24" w:name="_Toc234060581"/>
+      <w:bookmarkStart w:id="24" w:name="_Toc234070370"/>
       <w:r>
         <w:rPr>
           <w:lang w:eastAsia="en-GB"/>
@@ -10701,7 +10749,7 @@
         </w:rPr>
       </w:pPr>
       <w:bookmarkStart w:id="25" w:name="_Ref233900184"/>
-      <w:bookmarkStart w:id="26" w:name="_Toc234060582"/>
+      <w:bookmarkStart w:id="26" w:name="_Toc234070371"/>
       <w:r>
         <w:rPr>
           <w:lang w:eastAsia="en-GB"/>
@@ -10848,7 +10896,7 @@
         </w:rPr>
       </w:pPr>
       <w:bookmarkStart w:id="27" w:name="_Ref233641794"/>
-      <w:bookmarkStart w:id="28" w:name="_Toc234060583"/>
+      <w:bookmarkStart w:id="28" w:name="_Toc234070372"/>
       <w:r>
         <w:rPr>
           <w:lang w:eastAsia="en-GB"/>
@@ -11622,7 +11670,7 @@
         </w:rPr>
       </w:pPr>
       <w:bookmarkStart w:id="31" w:name="_Ref233543378"/>
-      <w:bookmarkStart w:id="32" w:name="_Toc234060584"/>
+      <w:bookmarkStart w:id="32" w:name="_Toc234070373"/>
       <w:r>
         <w:rPr>
           <w:lang w:eastAsia="en-GB"/>
@@ -11808,7 +11856,7 @@
         <w:jc w:val="center"/>
       </w:pPr>
       <w:bookmarkStart w:id="33" w:name="_Ref233534511"/>
-      <w:bookmarkStart w:id="34" w:name="_Toc234060597"/>
+      <w:bookmarkStart w:id="34" w:name="_Toc234070386"/>
       <w:r>
         <w:t xml:space="preserve">Figure </w:t>
       </w:r>
@@ -12186,7 +12234,7 @@
           <w:lang w:eastAsia="en-GB"/>
         </w:rPr>
       </w:pPr>
-      <w:bookmarkStart w:id="35" w:name="_Toc234060585"/>
+      <w:bookmarkStart w:id="35" w:name="_Toc234070374"/>
       <w:r>
         <w:rPr>
           <w:lang w:eastAsia="en-GB"/>
@@ -12555,7 +12603,7 @@
           <w:lang w:eastAsia="en-GB"/>
         </w:rPr>
       </w:pPr>
-      <w:bookmarkStart w:id="36" w:name="_Toc234060586"/>
+      <w:bookmarkStart w:id="36" w:name="_Toc234070375"/>
       <w:r>
         <w:rPr>
           <w:lang w:eastAsia="en-GB"/>
@@ -12812,7 +12860,7 @@
           <w:lang w:eastAsia="en-GB"/>
         </w:rPr>
       </w:pPr>
-      <w:bookmarkStart w:id="37" w:name="_Toc234060587"/>
+      <w:bookmarkStart w:id="37" w:name="_Toc234070376"/>
       <w:r>
         <w:rPr>
           <w:lang w:eastAsia="en-GB"/>
@@ -12885,7 +12933,7 @@
           <w:lang w:eastAsia="en-GB"/>
         </w:rPr>
       </w:pPr>
-      <w:bookmarkStart w:id="38" w:name="_Toc234060588"/>
+      <w:bookmarkStart w:id="38" w:name="_Toc234070377"/>
       <w:r>
         <w:rPr>
           <w:lang w:eastAsia="en-GB"/>
@@ -13028,7 +13076,7 @@
         </w:rPr>
       </w:pPr>
       <w:bookmarkStart w:id="39" w:name="_Ref233797296"/>
-      <w:bookmarkStart w:id="40" w:name="_Toc234060589"/>
+      <w:bookmarkStart w:id="40" w:name="_Toc234070378"/>
       <w:r>
         <w:rPr>
           <w:lang w:eastAsia="en-GB"/>
@@ -13209,7 +13257,7 @@
         <w:jc w:val="center"/>
       </w:pPr>
       <w:bookmarkStart w:id="41" w:name="_Ref233641691"/>
-      <w:bookmarkStart w:id="42" w:name="_Toc234060598"/>
+      <w:bookmarkStart w:id="42" w:name="_Toc234070387"/>
       <w:r>
         <w:t xml:space="preserve">Figure </w:t>
       </w:r>
@@ -13363,7 +13411,7 @@
         <w:jc w:val="center"/>
       </w:pPr>
       <w:bookmarkStart w:id="43" w:name="_Ref233648800"/>
-      <w:bookmarkStart w:id="44" w:name="_Toc234060599"/>
+      <w:bookmarkStart w:id="44" w:name="_Toc234070388"/>
       <w:r>
         <w:t xml:space="preserve">Figure </w:t>
       </w:r>
@@ -13460,7 +13508,7 @@
         </w:rPr>
       </w:pPr>
       <w:bookmarkStart w:id="45" w:name="_Ref233901870"/>
-      <w:bookmarkStart w:id="46" w:name="_Toc234060590"/>
+      <w:bookmarkStart w:id="46" w:name="_Toc234070379"/>
       <w:r>
         <w:rPr>
           <w:lang w:eastAsia="en-GB"/>
@@ -13677,7 +13725,7 @@
       </w:pPr>
       <w:bookmarkStart w:id="47" w:name="_Ref233894277"/>
       <w:bookmarkStart w:id="48" w:name="_Ref233894262"/>
-      <w:bookmarkStart w:id="49" w:name="_Toc234060600"/>
+      <w:bookmarkStart w:id="49" w:name="_Toc234070389"/>
       <w:r>
         <w:t xml:space="preserve">Figure </w:t>
       </w:r>
@@ -14167,7 +14215,49 @@
         <w:rPr>
           <w:lang w:eastAsia="en-GB"/>
         </w:rPr>
-        <w:t>OLS = SEQ_END AND !CLOCK</w:t>
+        <w:t xml:space="preserve">OLS = </w:t>
+      </w:r>
+      <w:r>
+        <w:rPr>
+          <w:lang w:eastAsia="en-GB"/>
+        </w:rPr>
+        <w:t>(!</w:t>
+      </w:r>
+      <w:r>
+        <w:rPr>
+          <w:lang w:eastAsia="en-GB"/>
+        </w:rPr>
+        <w:t>SEQ_END</w:t>
+      </w:r>
+      <w:r>
+        <w:rPr>
+          <w:lang w:eastAsia="en-GB"/>
+        </w:rPr>
+        <w:t>)</w:t>
+      </w:r>
+      <w:r>
+        <w:rPr>
+          <w:lang w:eastAsia="en-GB"/>
+        </w:rPr>
+        <w:t xml:space="preserve"> AND </w:t>
+      </w:r>
+      <w:r>
+        <w:rPr>
+          <w:lang w:eastAsia="en-GB"/>
+        </w:rPr>
+        <w:t>(</w:t>
+      </w:r>
+      <w:r>
+        <w:rPr>
+          <w:lang w:eastAsia="en-GB"/>
+        </w:rPr>
+        <w:t>!CLOCK</w:t>
+      </w:r>
+      <w:r>
+        <w:rPr>
+          <w:lang w:eastAsia="en-GB"/>
+        </w:rPr>
+        <w:t>)</w:t>
       </w:r>
       <w:r>
         <w:rPr>
@@ -14323,7 +14413,7 @@
         <w:jc w:val="center"/>
       </w:pPr>
       <w:bookmarkStart w:id="50" w:name="_Ref233899110"/>
-      <w:bookmarkStart w:id="51" w:name="_Toc234060601"/>
+      <w:bookmarkStart w:id="51" w:name="_Toc234070390"/>
       <w:r>
         <w:t xml:space="preserve">Figure </w:t>
       </w:r>
@@ -14649,7 +14739,49 @@
         <w:rPr>
           <w:lang w:eastAsia="en-GB"/>
         </w:rPr>
-        <w:t>OLS = RESET AND !CLOCK</w:t>
+        <w:t xml:space="preserve">OLS = </w:t>
+      </w:r>
+      <w:r>
+        <w:rPr>
+          <w:lang w:eastAsia="en-GB"/>
+        </w:rPr>
+        <w:t>(!</w:t>
+      </w:r>
+      <w:r>
+        <w:rPr>
+          <w:lang w:eastAsia="en-GB"/>
+        </w:rPr>
+        <w:t>RESET</w:t>
+      </w:r>
+      <w:r>
+        <w:rPr>
+          <w:lang w:eastAsia="en-GB"/>
+        </w:rPr>
+        <w:t>)</w:t>
+      </w:r>
+      <w:r>
+        <w:rPr>
+          <w:lang w:eastAsia="en-GB"/>
+        </w:rPr>
+        <w:t xml:space="preserve"> AND </w:t>
+      </w:r>
+      <w:r>
+        <w:rPr>
+          <w:lang w:eastAsia="en-GB"/>
+        </w:rPr>
+        <w:t>(</w:t>
+      </w:r>
+      <w:r>
+        <w:rPr>
+          <w:lang w:eastAsia="en-GB"/>
+        </w:rPr>
+        <w:t>!CLOCK</w:t>
+      </w:r>
+      <w:r>
+        <w:rPr>
+          <w:lang w:eastAsia="en-GB"/>
+        </w:rPr>
+        <w:t>)</w:t>
       </w:r>
     </w:p>
     <w:p>
@@ -14754,7 +14886,49 @@
         <w:rPr>
           <w:lang w:eastAsia="en-GB"/>
         </w:rPr>
-        <w:t xml:space="preserve"> OLS = SEQ_END AND !CLOCK</w:t>
+        <w:t xml:space="preserve"> OLS = </w:t>
+      </w:r>
+      <w:r>
+        <w:rPr>
+          <w:lang w:eastAsia="en-GB"/>
+        </w:rPr>
+        <w:t>(!</w:t>
+      </w:r>
+      <w:r>
+        <w:rPr>
+          <w:lang w:eastAsia="en-GB"/>
+        </w:rPr>
+        <w:t>SEQ_END</w:t>
+      </w:r>
+      <w:r>
+        <w:rPr>
+          <w:lang w:eastAsia="en-GB"/>
+        </w:rPr>
+        <w:t>)</w:t>
+      </w:r>
+      <w:r>
+        <w:rPr>
+          <w:lang w:eastAsia="en-GB"/>
+        </w:rPr>
+        <w:t xml:space="preserve"> AND </w:t>
+      </w:r>
+      <w:r>
+        <w:rPr>
+          <w:lang w:eastAsia="en-GB"/>
+        </w:rPr>
+        <w:t>(</w:t>
+      </w:r>
+      <w:r>
+        <w:rPr>
+          <w:lang w:eastAsia="en-GB"/>
+        </w:rPr>
+        <w:t>!CLOCK</w:t>
+      </w:r>
+      <w:r>
+        <w:rPr>
+          <w:lang w:eastAsia="en-GB"/>
+        </w:rPr>
+        <w:t>)</w:t>
       </w:r>
     </w:p>
     <w:p>
@@ -14810,7 +14984,49 @@
         <w:rPr>
           <w:lang w:eastAsia="en-GB"/>
         </w:rPr>
-        <w:t xml:space="preserve"> OLS = RESET AND !CLOCK</w:t>
+        <w:t xml:space="preserve"> OLS = </w:t>
+      </w:r>
+      <w:r>
+        <w:rPr>
+          <w:lang w:eastAsia="en-GB"/>
+        </w:rPr>
+        <w:t>(!</w:t>
+      </w:r>
+      <w:r>
+        <w:rPr>
+          <w:lang w:eastAsia="en-GB"/>
+        </w:rPr>
+        <w:t>RESET</w:t>
+      </w:r>
+      <w:r>
+        <w:rPr>
+          <w:lang w:eastAsia="en-GB"/>
+        </w:rPr>
+        <w:t>)</w:t>
+      </w:r>
+      <w:r>
+        <w:rPr>
+          <w:lang w:eastAsia="en-GB"/>
+        </w:rPr>
+        <w:t xml:space="preserve"> AND </w:t>
+      </w:r>
+      <w:r>
+        <w:rPr>
+          <w:lang w:eastAsia="en-GB"/>
+        </w:rPr>
+        <w:t>(</w:t>
+      </w:r>
+      <w:r>
+        <w:rPr>
+          <w:lang w:eastAsia="en-GB"/>
+        </w:rPr>
+        <w:t>!CLOCK</w:t>
+      </w:r>
+      <w:r>
+        <w:rPr>
+          <w:lang w:eastAsia="en-GB"/>
+        </w:rPr>
+        <w:t>)</w:t>
       </w:r>
     </w:p>
     <w:p>
@@ -14835,16 +15051,58 @@
         <w:rPr>
           <w:lang w:eastAsia="en-GB"/>
         </w:rPr>
-        <w:t xml:space="preserve">OLS = (SEQ_END OR RESET) </w:t>
+        <w:t xml:space="preserve">OLS = </w:t>
+      </w:r>
+      <w:r>
+        <w:rPr>
+          <w:lang w:eastAsia="en-GB"/>
+        </w:rPr>
+        <w:t>(</w:t>
+      </w:r>
+      <w:r>
+        <w:rPr>
+          <w:lang w:eastAsia="en-GB"/>
+        </w:rPr>
+        <w:t>(</w:t>
       </w:r>
       <w:proofErr w:type="gramStart"/>
       <w:r>
         <w:rPr>
           <w:lang w:eastAsia="en-GB"/>
         </w:rPr>
-        <w:t>AND !CLOCK</w:t>
+        <w:t>!SEQ</w:t>
       </w:r>
       <w:proofErr w:type="gramEnd"/>
+      <w:r>
+        <w:rPr>
+          <w:lang w:eastAsia="en-GB"/>
+        </w:rPr>
+        <w:t>_END) OR (!RESET)) AND</w:t>
+      </w:r>
+      <w:r>
+        <w:rPr>
+          <w:lang w:eastAsia="en-GB"/>
+        </w:rPr>
+        <w:t xml:space="preserve">  </w:t>
+      </w:r>
+      <w:r>
+        <w:rPr>
+          <w:lang w:eastAsia="en-GB"/>
+        </w:rPr>
+        <w:t>(</w:t>
+      </w:r>
+      <w:r>
+        <w:rPr>
+          <w:lang w:eastAsia="en-GB"/>
+        </w:rPr>
+        <w:t>!CLOCK</w:t>
+      </w:r>
+      <w:r>
+        <w:rPr>
+          <w:lang w:eastAsia="en-GB"/>
+        </w:rPr>
+        <w:t>)</w:t>
+      </w:r>
     </w:p>
     <w:p>
       <w:pPr>
@@ -14874,7 +15132,7 @@
         </w:rPr>
       </w:pPr>
       <w:bookmarkStart w:id="54" w:name="_Ref233901979"/>
-      <w:bookmarkStart w:id="55" w:name="_Toc234060591"/>
+      <w:bookmarkStart w:id="55" w:name="_Toc234070380"/>
       <w:r>
         <w:rPr>
           <w:lang w:eastAsia="en-GB"/>
@@ -15542,7 +15800,7 @@
           <w:lang w:eastAsia="en-GB"/>
         </w:rPr>
       </w:pPr>
-      <w:bookmarkStart w:id="56" w:name="_Toc234060592"/>
+      <w:bookmarkStart w:id="56" w:name="_Toc234070381"/>
       <w:r>
         <w:rPr>
           <w:lang w:eastAsia="en-GB"/>
@@ -15581,11 +15839,6 @@
         <w:rPr>
           <w:lang w:eastAsia="en-GB"/>
         </w:rPr>
-      </w:r>
-      <w:r>
-        <w:rPr>
-          <w:lang w:eastAsia="en-GB"/>
-        </w:rPr>
         <w:fldChar w:fldCharType="separate"/>
       </w:r>
       <w:r>
@@ -15631,11 +15884,6 @@
         <w:rPr>
           <w:lang w:eastAsia="en-GB"/>
         </w:rPr>
-      </w:r>
-      <w:r>
-        <w:rPr>
-          <w:lang w:eastAsia="en-GB"/>
-        </w:rPr>
         <w:fldChar w:fldCharType="separate"/>
       </w:r>
       <w:r>
@@ -15681,11 +15929,6 @@
         <w:rPr>
           <w:lang w:eastAsia="en-GB"/>
         </w:rPr>
-      </w:r>
-      <w:r>
-        <w:rPr>
-          <w:lang w:eastAsia="en-GB"/>
-        </w:rPr>
         <w:fldChar w:fldCharType="separate"/>
       </w:r>
       <w:r>
@@ -15726,11 +15969,6 @@
           <w:lang w:eastAsia="en-GB"/>
         </w:rPr>
         <w:instrText>HYPERLINK "CPU%20opcodes.xlsx"</w:instrText>
-      </w:r>
-      <w:r>
-        <w:rPr>
-          <w:lang w:eastAsia="en-GB"/>
-        </w:rPr>
       </w:r>
       <w:r>
         <w:rPr>
@@ -15870,7 +16108,7 @@
               <w:b/>
               <w:noProof/>
             </w:rPr>
-            <w:t>ii</w:t>
+            <w:t>11</w:t>
           </w:r>
         </w:fldSimple>
       </w:p>
@@ -21612,7 +21850,7 @@
 </file>
 
 <file path=customXml/itemProps2.xml><?xml version="1.0" encoding="utf-8"?>
-<ds:datastoreItem xmlns:ds="http://schemas.openxmlformats.org/officeDocument/2006/customXml" ds:itemID="{AFB8BF4A-148C-4367-8465-3539200B9C6E}">
+<ds:datastoreItem xmlns:ds="http://schemas.openxmlformats.org/officeDocument/2006/customXml" ds:itemID="{046CA203-CA3D-40AA-884D-6D2C1A070E38}">
   <ds:schemaRefs>
     <ds:schemaRef ds:uri="http://schemas.openxmlformats.org/officeDocument/2006/bibliography"/>
   </ds:schemaRefs>

</xml_diff>

<commit_message>
Add latch to output of sequence ROM in 3.5
Also Split up the existing + new text into three new sub-sections 3.5.*.
</commit_message>
<xml_diff>
--- a/CPU Design/L1IsDesign.docx
+++ b/CPU Design/L1IsDesign.docx
@@ -63,7 +63,7 @@
                     <v:path arrowok="t"/>
                   </v:shape>
                 </v:group>
-                <v:rect id="_x0000_s1039" style="position:absolute;left:1800;top:1440;width:8638;height:551;mso-width-percent:1000;mso-position-horizontal:center;mso-position-horizontal-relative:margin;mso-position-vertical:top;mso-position-vertical-relative:margin;mso-width-percent:1000;mso-width-relative:margin;mso-height-relative:margin" filled="f" stroked="f">
+                <v:rect id="_x0000_s1039" style="position:absolute;left:1800;top:1440;width:8638;height:736;mso-width-percent:1000;mso-position-horizontal:center;mso-position-horizontal-relative:margin;mso-position-vertical:top;mso-position-vertical-relative:margin;mso-width-percent:1000;mso-width-relative:margin;mso-height-relative:margin" filled="f" stroked="f">
                   <v:textbox style="mso-next-textbox:#_x0000_s1039;mso-fit-shape-to-text:t">
                     <w:txbxContent>
                       <w:p>
@@ -1010,6 +1010,126 @@
               </w:p>
             </w:tc>
           </w:tr>
+          <w:tr>
+            <w:tc>
+              <w:tcPr>
+                <w:tcW w:w="1384" w:type="dxa"/>
+              </w:tcPr>
+              <w:p>
+                <w:pPr>
+                  <w:rPr>
+                    <w:rFonts w:cstheme="minorHAnsi"/>
+                  </w:rPr>
+                </w:pPr>
+                <w:r>
+                  <w:rPr>
+                    <w:rFonts w:cstheme="minorHAnsi"/>
+                  </w:rPr>
+                  <w:t>5 Jul 2026</w:t>
+                </w:r>
+              </w:p>
+            </w:tc>
+            <w:tc>
+              <w:tcPr>
+                <w:tcW w:w="7858" w:type="dxa"/>
+              </w:tcPr>
+              <w:p>
+                <w:pPr>
+                  <w:rPr>
+                    <w:rFonts w:cstheme="minorHAnsi"/>
+                  </w:rPr>
+                </w:pPr>
+                <w:r>
+                  <w:rPr>
+                    <w:rFonts w:cstheme="minorHAnsi"/>
+                  </w:rPr>
+                  <w:t xml:space="preserve">Add latch to output of sequence ROM in </w:t>
+                </w:r>
+                <w:r>
+                  <w:rPr>
+                    <w:rFonts w:cstheme="minorHAnsi"/>
+                  </w:rPr>
+                  <w:fldChar w:fldCharType="begin"/>
+                </w:r>
+                <w:r>
+                  <w:rPr>
+                    <w:rFonts w:cstheme="minorHAnsi"/>
+                  </w:rPr>
+                  <w:instrText xml:space="preserve"> REF _Ref233543378 \r \h </w:instrText>
+                </w:r>
+                <w:r>
+                  <w:rPr>
+                    <w:rFonts w:cstheme="minorHAnsi"/>
+                  </w:rPr>
+                </w:r>
+                <w:r>
+                  <w:rPr>
+                    <w:rFonts w:cstheme="minorHAnsi"/>
+                  </w:rPr>
+                  <w:fldChar w:fldCharType="separate"/>
+                </w:r>
+                <w:r>
+                  <w:rPr>
+                    <w:rFonts w:cstheme="minorHAnsi"/>
+                  </w:rPr>
+                  <w:t>3.5</w:t>
+                </w:r>
+                <w:r>
+                  <w:rPr>
+                    <w:rFonts w:cstheme="minorHAnsi"/>
+                  </w:rPr>
+                  <w:fldChar w:fldCharType="end"/>
+                </w:r>
+                <w:r>
+                  <w:rPr>
+                    <w:rFonts w:cstheme="minorHAnsi"/>
+                  </w:rPr>
+                  <w:t xml:space="preserve">. Split up the text into three new sub-sections </w:t>
+                </w:r>
+                <w:r>
+                  <w:rPr>
+                    <w:rFonts w:cstheme="minorHAnsi"/>
+                  </w:rPr>
+                  <w:fldChar w:fldCharType="begin"/>
+                </w:r>
+                <w:r>
+                  <w:rPr>
+                    <w:rFonts w:cstheme="minorHAnsi"/>
+                  </w:rPr>
+                  <w:instrText xml:space="preserve"> REF _Ref233543378 \r \h </w:instrText>
+                </w:r>
+                <w:r>
+                  <w:rPr>
+                    <w:rFonts w:cstheme="minorHAnsi"/>
+                  </w:rPr>
+                </w:r>
+                <w:r>
+                  <w:rPr>
+                    <w:rFonts w:cstheme="minorHAnsi"/>
+                  </w:rPr>
+                  <w:fldChar w:fldCharType="separate"/>
+                </w:r>
+                <w:r>
+                  <w:rPr>
+                    <w:rFonts w:cstheme="minorHAnsi"/>
+                  </w:rPr>
+                  <w:t>3.5</w:t>
+                </w:r>
+                <w:r>
+                  <w:rPr>
+                    <w:rFonts w:cstheme="minorHAnsi"/>
+                  </w:rPr>
+                  <w:fldChar w:fldCharType="end"/>
+                </w:r>
+                <w:r>
+                  <w:rPr>
+                    <w:rFonts w:cstheme="minorHAnsi"/>
+                  </w:rPr>
+                  <w:t>.*.</w:t>
+                </w:r>
+              </w:p>
+            </w:tc>
+          </w:tr>
         </w:tbl>
         <w:p>
           <w:pPr>
@@ -1078,7 +1198,7 @@
           <w:r>
             <w:fldChar w:fldCharType="separate"/>
           </w:r>
-          <w:hyperlink w:anchor="_Toc234070362" w:history="1">
+          <w:hyperlink w:anchor="_Toc234149860" w:history="1">
             <w:r>
               <w:rPr>
                 <w:rStyle w:val="Hyperlink"/>
@@ -1124,7 +1244,7 @@
                 <w:noProof/>
                 <w:webHidden/>
               </w:rPr>
-              <w:instrText xml:space="preserve"> PAGEREF _Toc234070362 \h </w:instrText>
+              <w:instrText xml:space="preserve"> PAGEREF _Toc234149860 \h </w:instrText>
             </w:r>
             <w:r>
               <w:rPr>
@@ -1168,7 +1288,7 @@
               <w:lang w:eastAsia="en-GB"/>
             </w:rPr>
           </w:pPr>
-          <w:hyperlink w:anchor="_Toc234070363" w:history="1">
+          <w:hyperlink w:anchor="_Toc234149861" w:history="1">
             <w:r>
               <w:rPr>
                 <w:rStyle w:val="Hyperlink"/>
@@ -1212,7 +1332,7 @@
                 <w:noProof/>
                 <w:webHidden/>
               </w:rPr>
-              <w:instrText xml:space="preserve"> PAGEREF _Toc234070363 \h </w:instrText>
+              <w:instrText xml:space="preserve"> PAGEREF _Toc234149861 \h </w:instrText>
             </w:r>
             <w:r>
               <w:rPr>
@@ -1256,7 +1376,7 @@
               <w:lang w:eastAsia="en-GB"/>
             </w:rPr>
           </w:pPr>
-          <w:hyperlink w:anchor="_Toc234070364" w:history="1">
+          <w:hyperlink w:anchor="_Toc234149862" w:history="1">
             <w:r>
               <w:rPr>
                 <w:rStyle w:val="Hyperlink"/>
@@ -1300,7 +1420,7 @@
                 <w:noProof/>
                 <w:webHidden/>
               </w:rPr>
-              <w:instrText xml:space="preserve"> PAGEREF _Toc234070364 \h </w:instrText>
+              <w:instrText xml:space="preserve"> PAGEREF _Toc234149862 \h </w:instrText>
             </w:r>
             <w:r>
               <w:rPr>
@@ -1344,7 +1464,7 @@
               <w:lang w:eastAsia="en-GB"/>
             </w:rPr>
           </w:pPr>
-          <w:hyperlink w:anchor="_Toc234070365" w:history="1">
+          <w:hyperlink w:anchor="_Toc234149863" w:history="1">
             <w:r>
               <w:rPr>
                 <w:rStyle w:val="Hyperlink"/>
@@ -1388,7 +1508,7 @@
                 <w:noProof/>
                 <w:webHidden/>
               </w:rPr>
-              <w:instrText xml:space="preserve"> PAGEREF _Toc234070365 \h </w:instrText>
+              <w:instrText xml:space="preserve"> PAGEREF _Toc234149863 \h </w:instrText>
             </w:r>
             <w:r>
               <w:rPr>
@@ -1432,7 +1552,7 @@
               <w:lang w:eastAsia="en-GB"/>
             </w:rPr>
           </w:pPr>
-          <w:hyperlink w:anchor="_Toc234070366" w:history="1">
+          <w:hyperlink w:anchor="_Toc234149864" w:history="1">
             <w:r>
               <w:rPr>
                 <w:rStyle w:val="Hyperlink"/>
@@ -1476,7 +1596,7 @@
                 <w:noProof/>
                 <w:webHidden/>
               </w:rPr>
-              <w:instrText xml:space="preserve"> PAGEREF _Toc234070366 \h </w:instrText>
+              <w:instrText xml:space="preserve"> PAGEREF _Toc234149864 \h </w:instrText>
             </w:r>
             <w:r>
               <w:rPr>
@@ -1520,7 +1640,7 @@
               <w:lang w:eastAsia="en-GB"/>
             </w:rPr>
           </w:pPr>
-          <w:hyperlink w:anchor="_Toc234070367" w:history="1">
+          <w:hyperlink w:anchor="_Toc234149865" w:history="1">
             <w:r>
               <w:rPr>
                 <w:rStyle w:val="Hyperlink"/>
@@ -1564,7 +1684,7 @@
                 <w:noProof/>
                 <w:webHidden/>
               </w:rPr>
-              <w:instrText xml:space="preserve"> PAGEREF _Toc234070367 \h </w:instrText>
+              <w:instrText xml:space="preserve"> PAGEREF _Toc234149865 \h </w:instrText>
             </w:r>
             <w:r>
               <w:rPr>
@@ -1608,7 +1728,7 @@
               <w:lang w:eastAsia="en-GB"/>
             </w:rPr>
           </w:pPr>
-          <w:hyperlink w:anchor="_Toc234070368" w:history="1">
+          <w:hyperlink w:anchor="_Toc234149866" w:history="1">
             <w:r>
               <w:rPr>
                 <w:rStyle w:val="Hyperlink"/>
@@ -1659,7 +1779,7 @@
                 <w:noProof/>
                 <w:webHidden/>
               </w:rPr>
-              <w:instrText xml:space="preserve"> PAGEREF _Toc234070368 \h </w:instrText>
+              <w:instrText xml:space="preserve"> PAGEREF _Toc234149866 \h </w:instrText>
             </w:r>
             <w:r>
               <w:rPr>
@@ -1703,7 +1823,7 @@
               <w:lang w:eastAsia="en-GB"/>
             </w:rPr>
           </w:pPr>
-          <w:hyperlink w:anchor="_Toc234070369" w:history="1">
+          <w:hyperlink w:anchor="_Toc234149867" w:history="1">
             <w:r>
               <w:rPr>
                 <w:rStyle w:val="Hyperlink"/>
@@ -1747,7 +1867,7 @@
                 <w:noProof/>
                 <w:webHidden/>
               </w:rPr>
-              <w:instrText xml:space="preserve"> PAGEREF _Toc234070369 \h </w:instrText>
+              <w:instrText xml:space="preserve"> PAGEREF _Toc234149867 \h </w:instrText>
             </w:r>
             <w:r>
               <w:rPr>
@@ -1791,7 +1911,7 @@
               <w:lang w:eastAsia="en-GB"/>
             </w:rPr>
           </w:pPr>
-          <w:hyperlink w:anchor="_Toc234070370" w:history="1">
+          <w:hyperlink w:anchor="_Toc234149868" w:history="1">
             <w:r>
               <w:rPr>
                 <w:rStyle w:val="Hyperlink"/>
@@ -1835,7 +1955,7 @@
                 <w:noProof/>
                 <w:webHidden/>
               </w:rPr>
-              <w:instrText xml:space="preserve"> PAGEREF _Toc234070370 \h </w:instrText>
+              <w:instrText xml:space="preserve"> PAGEREF _Toc234149868 \h </w:instrText>
             </w:r>
             <w:r>
               <w:rPr>
@@ -1879,7 +1999,7 @@
               <w:lang w:eastAsia="en-GB"/>
             </w:rPr>
           </w:pPr>
-          <w:hyperlink w:anchor="_Toc234070371" w:history="1">
+          <w:hyperlink w:anchor="_Toc234149869" w:history="1">
             <w:r>
               <w:rPr>
                 <w:rStyle w:val="Hyperlink"/>
@@ -1923,7 +2043,7 @@
                 <w:noProof/>
                 <w:webHidden/>
               </w:rPr>
-              <w:instrText xml:space="preserve"> PAGEREF _Toc234070371 \h </w:instrText>
+              <w:instrText xml:space="preserve"> PAGEREF _Toc234149869 \h </w:instrText>
             </w:r>
             <w:r>
               <w:rPr>
@@ -1967,7 +2087,7 @@
               <w:lang w:eastAsia="en-GB"/>
             </w:rPr>
           </w:pPr>
-          <w:hyperlink w:anchor="_Toc234070372" w:history="1">
+          <w:hyperlink w:anchor="_Toc234149870" w:history="1">
             <w:r>
               <w:rPr>
                 <w:rStyle w:val="Hyperlink"/>
@@ -2011,7 +2131,7 @@
                 <w:noProof/>
                 <w:webHidden/>
               </w:rPr>
-              <w:instrText xml:space="preserve"> PAGEREF _Toc234070372 \h </w:instrText>
+              <w:instrText xml:space="preserve"> PAGEREF _Toc234149870 \h </w:instrText>
             </w:r>
             <w:r>
               <w:rPr>
@@ -2055,7 +2175,7 @@
               <w:lang w:eastAsia="en-GB"/>
             </w:rPr>
           </w:pPr>
-          <w:hyperlink w:anchor="_Toc234070373" w:history="1">
+          <w:hyperlink w:anchor="_Toc234149871" w:history="1">
             <w:r>
               <w:rPr>
                 <w:rStyle w:val="Hyperlink"/>
@@ -2099,7 +2219,7 @@
                 <w:noProof/>
                 <w:webHidden/>
               </w:rPr>
-              <w:instrText xml:space="preserve"> PAGEREF _Toc234070373 \h </w:instrText>
+              <w:instrText xml:space="preserve"> PAGEREF _Toc234149871 \h </w:instrText>
             </w:r>
             <w:r>
               <w:rPr>
@@ -2120,6 +2240,264 @@
                 <w:webHidden/>
               </w:rPr>
               <w:t>8</w:t>
+            </w:r>
+            <w:r>
+              <w:rPr>
+                <w:noProof/>
+                <w:webHidden/>
+              </w:rPr>
+              <w:fldChar w:fldCharType="end"/>
+            </w:r>
+          </w:hyperlink>
+        </w:p>
+        <w:p>
+          <w:pPr>
+            <w:pStyle w:val="TOC3"/>
+            <w:tabs>
+              <w:tab w:val="left" w:pos="1320"/>
+              <w:tab w:val="right" w:leader="dot" w:pos="9016"/>
+            </w:tabs>
+            <w:rPr>
+              <w:rFonts w:eastAsiaTheme="minorEastAsia"/>
+              <w:noProof/>
+              <w:lang w:eastAsia="en-GB"/>
+            </w:rPr>
+          </w:pPr>
+          <w:hyperlink w:anchor="_Toc234149872" w:history="1">
+            <w:r>
+              <w:rPr>
+                <w:rStyle w:val="Hyperlink"/>
+                <w:noProof/>
+              </w:rPr>
+              <w:t>3.5.1</w:t>
+            </w:r>
+            <w:r>
+              <w:rPr>
+                <w:rFonts w:eastAsiaTheme="minorEastAsia"/>
+                <w:noProof/>
+                <w:lang w:eastAsia="en-GB"/>
+              </w:rPr>
+              <w:tab/>
+            </w:r>
+            <w:r>
+              <w:rPr>
+                <w:rStyle w:val="Hyperlink"/>
+                <w:noProof/>
+              </w:rPr>
+              <w:t>Sequence ROM Outputs</w:t>
+            </w:r>
+            <w:r>
+              <w:rPr>
+                <w:noProof/>
+                <w:webHidden/>
+              </w:rPr>
+              <w:tab/>
+            </w:r>
+            <w:r>
+              <w:rPr>
+                <w:noProof/>
+                <w:webHidden/>
+              </w:rPr>
+              <w:fldChar w:fldCharType="begin"/>
+            </w:r>
+            <w:r>
+              <w:rPr>
+                <w:noProof/>
+                <w:webHidden/>
+              </w:rPr>
+              <w:instrText xml:space="preserve"> PAGEREF _Toc234149872 \h </w:instrText>
+            </w:r>
+            <w:r>
+              <w:rPr>
+                <w:noProof/>
+                <w:webHidden/>
+              </w:rPr>
+            </w:r>
+            <w:r>
+              <w:rPr>
+                <w:noProof/>
+                <w:webHidden/>
+              </w:rPr>
+              <w:fldChar w:fldCharType="separate"/>
+            </w:r>
+            <w:r>
+              <w:rPr>
+                <w:noProof/>
+                <w:webHidden/>
+              </w:rPr>
+              <w:t>8</w:t>
+            </w:r>
+            <w:r>
+              <w:rPr>
+                <w:noProof/>
+                <w:webHidden/>
+              </w:rPr>
+              <w:fldChar w:fldCharType="end"/>
+            </w:r>
+          </w:hyperlink>
+        </w:p>
+        <w:p>
+          <w:pPr>
+            <w:pStyle w:val="TOC3"/>
+            <w:tabs>
+              <w:tab w:val="left" w:pos="1320"/>
+              <w:tab w:val="right" w:leader="dot" w:pos="9016"/>
+            </w:tabs>
+            <w:rPr>
+              <w:rFonts w:eastAsiaTheme="minorEastAsia"/>
+              <w:noProof/>
+              <w:lang w:eastAsia="en-GB"/>
+            </w:rPr>
+          </w:pPr>
+          <w:hyperlink w:anchor="_Toc234149873" w:history="1">
+            <w:r>
+              <w:rPr>
+                <w:rStyle w:val="Hyperlink"/>
+                <w:noProof/>
+              </w:rPr>
+              <w:t>3.5.2</w:t>
+            </w:r>
+            <w:r>
+              <w:rPr>
+                <w:rFonts w:eastAsiaTheme="minorEastAsia"/>
+                <w:noProof/>
+                <w:lang w:eastAsia="en-GB"/>
+              </w:rPr>
+              <w:tab/>
+            </w:r>
+            <w:r>
+              <w:rPr>
+                <w:rStyle w:val="Hyperlink"/>
+                <w:noProof/>
+              </w:rPr>
+              <w:t>Sequence ROM Output Latch</w:t>
+            </w:r>
+            <w:r>
+              <w:rPr>
+                <w:noProof/>
+                <w:webHidden/>
+              </w:rPr>
+              <w:tab/>
+            </w:r>
+            <w:r>
+              <w:rPr>
+                <w:noProof/>
+                <w:webHidden/>
+              </w:rPr>
+              <w:fldChar w:fldCharType="begin"/>
+            </w:r>
+            <w:r>
+              <w:rPr>
+                <w:noProof/>
+                <w:webHidden/>
+              </w:rPr>
+              <w:instrText xml:space="preserve"> PAGEREF _Toc234149873 \h </w:instrText>
+            </w:r>
+            <w:r>
+              <w:rPr>
+                <w:noProof/>
+                <w:webHidden/>
+              </w:rPr>
+            </w:r>
+            <w:r>
+              <w:rPr>
+                <w:noProof/>
+                <w:webHidden/>
+              </w:rPr>
+              <w:fldChar w:fldCharType="separate"/>
+            </w:r>
+            <w:r>
+              <w:rPr>
+                <w:noProof/>
+                <w:webHidden/>
+              </w:rPr>
+              <w:t>9</w:t>
+            </w:r>
+            <w:r>
+              <w:rPr>
+                <w:noProof/>
+                <w:webHidden/>
+              </w:rPr>
+              <w:fldChar w:fldCharType="end"/>
+            </w:r>
+          </w:hyperlink>
+        </w:p>
+        <w:p>
+          <w:pPr>
+            <w:pStyle w:val="TOC3"/>
+            <w:tabs>
+              <w:tab w:val="left" w:pos="1320"/>
+              <w:tab w:val="right" w:leader="dot" w:pos="9016"/>
+            </w:tabs>
+            <w:rPr>
+              <w:rFonts w:eastAsiaTheme="minorEastAsia"/>
+              <w:noProof/>
+              <w:lang w:eastAsia="en-GB"/>
+            </w:rPr>
+          </w:pPr>
+          <w:hyperlink w:anchor="_Toc234149874" w:history="1">
+            <w:r>
+              <w:rPr>
+                <w:rStyle w:val="Hyperlink"/>
+                <w:noProof/>
+              </w:rPr>
+              <w:t>3.5.3</w:t>
+            </w:r>
+            <w:r>
+              <w:rPr>
+                <w:rFonts w:eastAsiaTheme="minorEastAsia"/>
+                <w:noProof/>
+                <w:lang w:eastAsia="en-GB"/>
+              </w:rPr>
+              <w:tab/>
+            </w:r>
+            <w:r>
+              <w:rPr>
+                <w:rStyle w:val="Hyperlink"/>
+                <w:noProof/>
+              </w:rPr>
+              <w:t>Sequence ROM Summary</w:t>
+            </w:r>
+            <w:r>
+              <w:rPr>
+                <w:noProof/>
+                <w:webHidden/>
+              </w:rPr>
+              <w:tab/>
+            </w:r>
+            <w:r>
+              <w:rPr>
+                <w:noProof/>
+                <w:webHidden/>
+              </w:rPr>
+              <w:fldChar w:fldCharType="begin"/>
+            </w:r>
+            <w:r>
+              <w:rPr>
+                <w:noProof/>
+                <w:webHidden/>
+              </w:rPr>
+              <w:instrText xml:space="preserve"> PAGEREF _Toc234149874 \h </w:instrText>
+            </w:r>
+            <w:r>
+              <w:rPr>
+                <w:noProof/>
+                <w:webHidden/>
+              </w:rPr>
+            </w:r>
+            <w:r>
+              <w:rPr>
+                <w:noProof/>
+                <w:webHidden/>
+              </w:rPr>
+              <w:fldChar w:fldCharType="separate"/>
+            </w:r>
+            <w:r>
+              <w:rPr>
+                <w:noProof/>
+                <w:webHidden/>
+              </w:rPr>
+              <w:t>9</w:t>
             </w:r>
             <w:r>
               <w:rPr>
@@ -2143,7 +2521,7 @@
               <w:lang w:eastAsia="en-GB"/>
             </w:rPr>
           </w:pPr>
-          <w:hyperlink w:anchor="_Toc234070374" w:history="1">
+          <w:hyperlink w:anchor="_Toc234149875" w:history="1">
             <w:r>
               <w:rPr>
                 <w:rStyle w:val="Hyperlink"/>
@@ -2187,7 +2565,7 @@
                 <w:noProof/>
                 <w:webHidden/>
               </w:rPr>
-              <w:instrText xml:space="preserve"> PAGEREF _Toc234070374 \h </w:instrText>
+              <w:instrText xml:space="preserve"> PAGEREF _Toc234149875 \h </w:instrText>
             </w:r>
             <w:r>
               <w:rPr>
@@ -2207,7 +2585,7 @@
                 <w:noProof/>
                 <w:webHidden/>
               </w:rPr>
-              <w:t>9</w:t>
+              <w:t>10</w:t>
             </w:r>
             <w:r>
               <w:rPr>
@@ -2231,7 +2609,7 @@
               <w:lang w:eastAsia="en-GB"/>
             </w:rPr>
           </w:pPr>
-          <w:hyperlink w:anchor="_Toc234070375" w:history="1">
+          <w:hyperlink w:anchor="_Toc234149876" w:history="1">
             <w:r>
               <w:rPr>
                 <w:rStyle w:val="Hyperlink"/>
@@ -2275,7 +2653,7 @@
                 <w:noProof/>
                 <w:webHidden/>
               </w:rPr>
-              <w:instrText xml:space="preserve"> PAGEREF _Toc234070375 \h </w:instrText>
+              <w:instrText xml:space="preserve"> PAGEREF _Toc234149876 \h </w:instrText>
             </w:r>
             <w:r>
               <w:rPr>
@@ -2295,7 +2673,7 @@
                 <w:noProof/>
                 <w:webHidden/>
               </w:rPr>
-              <w:t>9</w:t>
+              <w:t>10</w:t>
             </w:r>
             <w:r>
               <w:rPr>
@@ -2319,7 +2697,7 @@
               <w:lang w:eastAsia="en-GB"/>
             </w:rPr>
           </w:pPr>
-          <w:hyperlink w:anchor="_Toc234070376" w:history="1">
+          <w:hyperlink w:anchor="_Toc234149877" w:history="1">
             <w:r>
               <w:rPr>
                 <w:rStyle w:val="Hyperlink"/>
@@ -2363,7 +2741,7 @@
                 <w:noProof/>
                 <w:webHidden/>
               </w:rPr>
-              <w:instrText xml:space="preserve"> PAGEREF _Toc234070376 \h </w:instrText>
+              <w:instrText xml:space="preserve"> PAGEREF _Toc234149877 \h </w:instrText>
             </w:r>
             <w:r>
               <w:rPr>
@@ -2383,7 +2761,7 @@
                 <w:noProof/>
                 <w:webHidden/>
               </w:rPr>
-              <w:t>9</w:t>
+              <w:t>10</w:t>
             </w:r>
             <w:r>
               <w:rPr>
@@ -2407,7 +2785,7 @@
               <w:lang w:eastAsia="en-GB"/>
             </w:rPr>
           </w:pPr>
-          <w:hyperlink w:anchor="_Toc234070377" w:history="1">
+          <w:hyperlink w:anchor="_Toc234149878" w:history="1">
             <w:r>
               <w:rPr>
                 <w:rStyle w:val="Hyperlink"/>
@@ -2451,7 +2829,7 @@
                 <w:noProof/>
                 <w:webHidden/>
               </w:rPr>
-              <w:instrText xml:space="preserve"> PAGEREF _Toc234070377 \h </w:instrText>
+              <w:instrText xml:space="preserve"> PAGEREF _Toc234149878 \h </w:instrText>
             </w:r>
             <w:r>
               <w:rPr>
@@ -2471,7 +2849,7 @@
                 <w:noProof/>
                 <w:webHidden/>
               </w:rPr>
-              <w:t>10</w:t>
+              <w:t>11</w:t>
             </w:r>
             <w:r>
               <w:rPr>
@@ -2495,7 +2873,7 @@
               <w:lang w:eastAsia="en-GB"/>
             </w:rPr>
           </w:pPr>
-          <w:hyperlink w:anchor="_Toc234070378" w:history="1">
+          <w:hyperlink w:anchor="_Toc234149879" w:history="1">
             <w:r>
               <w:rPr>
                 <w:rStyle w:val="Hyperlink"/>
@@ -2539,7 +2917,7 @@
                 <w:noProof/>
                 <w:webHidden/>
               </w:rPr>
-              <w:instrText xml:space="preserve"> PAGEREF _Toc234070378 \h </w:instrText>
+              <w:instrText xml:space="preserve"> PAGEREF _Toc234149879 \h </w:instrText>
             </w:r>
             <w:r>
               <w:rPr>
@@ -2559,7 +2937,7 @@
                 <w:noProof/>
                 <w:webHidden/>
               </w:rPr>
-              <w:t>11</w:t>
+              <w:t>12</w:t>
             </w:r>
             <w:r>
               <w:rPr>
@@ -2583,7 +2961,7 @@
               <w:lang w:eastAsia="en-GB"/>
             </w:rPr>
           </w:pPr>
-          <w:hyperlink w:anchor="_Toc234070379" w:history="1">
+          <w:hyperlink w:anchor="_Toc234149880" w:history="1">
             <w:r>
               <w:rPr>
                 <w:rStyle w:val="Hyperlink"/>
@@ -2627,7 +3005,7 @@
                 <w:noProof/>
                 <w:webHidden/>
               </w:rPr>
-              <w:instrText xml:space="preserve"> PAGEREF _Toc234070379 \h </w:instrText>
+              <w:instrText xml:space="preserve"> PAGEREF _Toc234149880 \h </w:instrText>
             </w:r>
             <w:r>
               <w:rPr>
@@ -2647,7 +3025,7 @@
                 <w:noProof/>
                 <w:webHidden/>
               </w:rPr>
-              <w:t>12</w:t>
+              <w:t>13</w:t>
             </w:r>
             <w:r>
               <w:rPr>
@@ -2671,7 +3049,7 @@
               <w:lang w:eastAsia="en-GB"/>
             </w:rPr>
           </w:pPr>
-          <w:hyperlink w:anchor="_Toc234070380" w:history="1">
+          <w:hyperlink w:anchor="_Toc234149881" w:history="1">
             <w:r>
               <w:rPr>
                 <w:rStyle w:val="Hyperlink"/>
@@ -2715,7 +3093,7 @@
                 <w:noProof/>
                 <w:webHidden/>
               </w:rPr>
-              <w:instrText xml:space="preserve"> PAGEREF _Toc234070380 \h </w:instrText>
+              <w:instrText xml:space="preserve"> PAGEREF _Toc234149881 \h </w:instrText>
             </w:r>
             <w:r>
               <w:rPr>
@@ -2735,7 +3113,7 @@
                 <w:noProof/>
                 <w:webHidden/>
               </w:rPr>
-              <w:t>14</w:t>
+              <w:t>15</w:t>
             </w:r>
             <w:r>
               <w:rPr>
@@ -2759,7 +3137,7 @@
               <w:lang w:eastAsia="en-GB"/>
             </w:rPr>
           </w:pPr>
-          <w:hyperlink w:anchor="_Toc234070381" w:history="1">
+          <w:hyperlink w:anchor="_Toc234149882" w:history="1">
             <w:r>
               <w:rPr>
                 <w:rStyle w:val="Hyperlink"/>
@@ -2803,7 +3181,7 @@
                 <w:noProof/>
                 <w:webHidden/>
               </w:rPr>
-              <w:instrText xml:space="preserve"> PAGEREF _Toc234070381 \h </w:instrText>
+              <w:instrText xml:space="preserve"> PAGEREF _Toc234149882 \h </w:instrText>
             </w:r>
             <w:r>
               <w:rPr>
@@ -2823,7 +3201,7 @@
                 <w:noProof/>
                 <w:webHidden/>
               </w:rPr>
-              <w:t>15</w:t>
+              <w:t>16</w:t>
             </w:r>
             <w:r>
               <w:rPr>
@@ -2911,7 +3289,7 @@
         </w:rPr>
         <w:fldChar w:fldCharType="separate"/>
       </w:r>
-      <w:hyperlink w:anchor="_Toc234070382" w:history="1">
+      <w:hyperlink w:anchor="_Toc234149883" w:history="1">
         <w:r>
           <w:rPr>
             <w:rStyle w:val="Hyperlink"/>
@@ -2938,7 +3316,7 @@
             <w:noProof/>
             <w:webHidden/>
           </w:rPr>
-          <w:instrText xml:space="preserve"> PAGEREF _Toc234070382 \h </w:instrText>
+          <w:instrText xml:space="preserve"> PAGEREF _Toc234149883 \h </w:instrText>
         </w:r>
         <w:r>
           <w:rPr>
@@ -2981,7 +3359,7 @@
           <w:lang w:eastAsia="en-GB"/>
         </w:rPr>
       </w:pPr>
-      <w:hyperlink w:anchor="_Toc234070383" w:history="1">
+      <w:hyperlink w:anchor="_Toc234149884" w:history="1">
         <w:r>
           <w:rPr>
             <w:rStyle w:val="Hyperlink"/>
@@ -3008,7 +3386,7 @@
             <w:noProof/>
             <w:webHidden/>
           </w:rPr>
-          <w:instrText xml:space="preserve"> PAGEREF _Toc234070383 \h </w:instrText>
+          <w:instrText xml:space="preserve"> PAGEREF _Toc234149884 \h </w:instrText>
         </w:r>
         <w:r>
           <w:rPr>
@@ -3051,7 +3429,7 @@
           <w:lang w:eastAsia="en-GB"/>
         </w:rPr>
       </w:pPr>
-      <w:hyperlink w:anchor="_Toc234070384" w:history="1">
+      <w:hyperlink w:anchor="_Toc234149885" w:history="1">
         <w:r>
           <w:rPr>
             <w:rStyle w:val="Hyperlink"/>
@@ -3078,7 +3456,7 @@
             <w:noProof/>
             <w:webHidden/>
           </w:rPr>
-          <w:instrText xml:space="preserve"> PAGEREF _Toc234070384 \h </w:instrText>
+          <w:instrText xml:space="preserve"> PAGEREF _Toc234149885 \h </w:instrText>
         </w:r>
         <w:r>
           <w:rPr>
@@ -3121,7 +3499,7 @@
           <w:lang w:eastAsia="en-GB"/>
         </w:rPr>
       </w:pPr>
-      <w:hyperlink w:anchor="_Toc234070385" w:history="1">
+      <w:hyperlink w:anchor="_Toc234149886" w:history="1">
         <w:r>
           <w:rPr>
             <w:rStyle w:val="Hyperlink"/>
@@ -3148,7 +3526,7 @@
             <w:noProof/>
             <w:webHidden/>
           </w:rPr>
-          <w:instrText xml:space="preserve"> PAGEREF _Toc234070385 \h </w:instrText>
+          <w:instrText xml:space="preserve"> PAGEREF _Toc234149886 \h </w:instrText>
         </w:r>
         <w:r>
           <w:rPr>
@@ -3191,7 +3569,7 @@
           <w:lang w:eastAsia="en-GB"/>
         </w:rPr>
       </w:pPr>
-      <w:hyperlink w:anchor="_Toc234070386" w:history="1">
+      <w:hyperlink w:anchor="_Toc234149887" w:history="1">
         <w:r>
           <w:rPr>
             <w:rStyle w:val="Hyperlink"/>
@@ -3218,7 +3596,7 @@
             <w:noProof/>
             <w:webHidden/>
           </w:rPr>
-          <w:instrText xml:space="preserve"> PAGEREF _Toc234070386 \h </w:instrText>
+          <w:instrText xml:space="preserve"> PAGEREF _Toc234149887 \h </w:instrText>
         </w:r>
         <w:r>
           <w:rPr>
@@ -3261,7 +3639,7 @@
           <w:lang w:eastAsia="en-GB"/>
         </w:rPr>
       </w:pPr>
-      <w:hyperlink w:anchor="_Toc234070387" w:history="1">
+      <w:hyperlink w:anchor="_Toc234149888" w:history="1">
         <w:r>
           <w:rPr>
             <w:rStyle w:val="Hyperlink"/>
@@ -3288,147 +3666,7 @@
             <w:noProof/>
             <w:webHidden/>
           </w:rPr>
-          <w:instrText xml:space="preserve"> PAGEREF _Toc234070387 \h </w:instrText>
-        </w:r>
-        <w:r>
-          <w:rPr>
-            <w:noProof/>
-            <w:webHidden/>
-          </w:rPr>
-        </w:r>
-        <w:r>
-          <w:rPr>
-            <w:noProof/>
-            <w:webHidden/>
-          </w:rPr>
-          <w:fldChar w:fldCharType="separate"/>
-        </w:r>
-        <w:r>
-          <w:rPr>
-            <w:noProof/>
-            <w:webHidden/>
-          </w:rPr>
-          <w:t>11</w:t>
-        </w:r>
-        <w:r>
-          <w:rPr>
-            <w:noProof/>
-            <w:webHidden/>
-          </w:rPr>
-          <w:fldChar w:fldCharType="end"/>
-        </w:r>
-      </w:hyperlink>
-    </w:p>
-    <w:p>
-      <w:pPr>
-        <w:pStyle w:val="TableofFigures"/>
-        <w:tabs>
-          <w:tab w:val="right" w:leader="dot" w:pos="9016"/>
-        </w:tabs>
-        <w:rPr>
-          <w:rFonts w:eastAsiaTheme="minorEastAsia"/>
-          <w:noProof/>
-          <w:lang w:eastAsia="en-GB"/>
-        </w:rPr>
-      </w:pPr>
-      <w:hyperlink w:anchor="_Toc234070388" w:history="1">
-        <w:r>
-          <w:rPr>
-            <w:rStyle w:val="Hyperlink"/>
-            <w:noProof/>
-          </w:rPr>
-          <w:t>Figure 7:   Sequence Control L2 Block Diagram</w:t>
-        </w:r>
-        <w:r>
-          <w:rPr>
-            <w:noProof/>
-            <w:webHidden/>
-          </w:rPr>
-          <w:tab/>
-        </w:r>
-        <w:r>
-          <w:rPr>
-            <w:noProof/>
-            <w:webHidden/>
-          </w:rPr>
-          <w:fldChar w:fldCharType="begin"/>
-        </w:r>
-        <w:r>
-          <w:rPr>
-            <w:noProof/>
-            <w:webHidden/>
-          </w:rPr>
-          <w:instrText xml:space="preserve"> PAGEREF _Toc234070388 \h </w:instrText>
-        </w:r>
-        <w:r>
-          <w:rPr>
-            <w:noProof/>
-            <w:webHidden/>
-          </w:rPr>
-        </w:r>
-        <w:r>
-          <w:rPr>
-            <w:noProof/>
-            <w:webHidden/>
-          </w:rPr>
-          <w:fldChar w:fldCharType="separate"/>
-        </w:r>
-        <w:r>
-          <w:rPr>
-            <w:noProof/>
-            <w:webHidden/>
-          </w:rPr>
-          <w:t>11</w:t>
-        </w:r>
-        <w:r>
-          <w:rPr>
-            <w:noProof/>
-            <w:webHidden/>
-          </w:rPr>
-          <w:fldChar w:fldCharType="end"/>
-        </w:r>
-      </w:hyperlink>
-    </w:p>
-    <w:p>
-      <w:pPr>
-        <w:pStyle w:val="TableofFigures"/>
-        <w:tabs>
-          <w:tab w:val="right" w:leader="dot" w:pos="9016"/>
-        </w:tabs>
-        <w:rPr>
-          <w:rFonts w:eastAsiaTheme="minorEastAsia"/>
-          <w:noProof/>
-          <w:lang w:eastAsia="en-GB"/>
-        </w:rPr>
-      </w:pPr>
-      <w:hyperlink w:anchor="_Toc234070389" w:history="1">
-        <w:r>
-          <w:rPr>
-            <w:rStyle w:val="Hyperlink"/>
-            <w:noProof/>
-          </w:rPr>
-          <w:t>Figure 8:   Timing requirements for 5 bit counter when RESET is high</w:t>
-        </w:r>
-        <w:r>
-          <w:rPr>
-            <w:noProof/>
-            <w:webHidden/>
-          </w:rPr>
-          <w:tab/>
-        </w:r>
-        <w:r>
-          <w:rPr>
-            <w:noProof/>
-            <w:webHidden/>
-          </w:rPr>
-          <w:fldChar w:fldCharType="begin"/>
-        </w:r>
-        <w:r>
-          <w:rPr>
-            <w:noProof/>
-            <w:webHidden/>
-          </w:rPr>
-          <w:instrText xml:space="preserve"> PAGEREF _Toc234070389 \h </w:instrText>
+          <w:instrText xml:space="preserve"> PAGEREF _Toc234149888 \h </w:instrText>
         </w:r>
         <w:r>
           <w:rPr>
@@ -3471,13 +3709,13 @@
           <w:lang w:eastAsia="en-GB"/>
         </w:rPr>
       </w:pPr>
-      <w:hyperlink w:anchor="_Toc234070390" w:history="1">
+      <w:hyperlink w:anchor="_Toc234149889" w:history="1">
         <w:r>
           <w:rPr>
             <w:rStyle w:val="Hyperlink"/>
             <w:noProof/>
           </w:rPr>
-          <w:t>Figure 9:   Timing requirements for 5 bit counter when RESET is low</w:t>
+          <w:t>Figure 7:   Sequence Control L2 Block Diagram</w:t>
         </w:r>
         <w:r>
           <w:rPr>
@@ -3498,7 +3736,77 @@
             <w:noProof/>
             <w:webHidden/>
           </w:rPr>
-          <w:instrText xml:space="preserve"> PAGEREF _Toc234070390 \h </w:instrText>
+          <w:instrText xml:space="preserve"> PAGEREF _Toc234149889 \h </w:instrText>
+        </w:r>
+        <w:r>
+          <w:rPr>
+            <w:noProof/>
+            <w:webHidden/>
+          </w:rPr>
+        </w:r>
+        <w:r>
+          <w:rPr>
+            <w:noProof/>
+            <w:webHidden/>
+          </w:rPr>
+          <w:fldChar w:fldCharType="separate"/>
+        </w:r>
+        <w:r>
+          <w:rPr>
+            <w:noProof/>
+            <w:webHidden/>
+          </w:rPr>
+          <w:t>12</w:t>
+        </w:r>
+        <w:r>
+          <w:rPr>
+            <w:noProof/>
+            <w:webHidden/>
+          </w:rPr>
+          <w:fldChar w:fldCharType="end"/>
+        </w:r>
+      </w:hyperlink>
+    </w:p>
+    <w:p>
+      <w:pPr>
+        <w:pStyle w:val="TableofFigures"/>
+        <w:tabs>
+          <w:tab w:val="right" w:leader="dot" w:pos="9016"/>
+        </w:tabs>
+        <w:rPr>
+          <w:rFonts w:eastAsiaTheme="minorEastAsia"/>
+          <w:noProof/>
+          <w:lang w:eastAsia="en-GB"/>
+        </w:rPr>
+      </w:pPr>
+      <w:hyperlink w:anchor="_Toc234149890" w:history="1">
+        <w:r>
+          <w:rPr>
+            <w:rStyle w:val="Hyperlink"/>
+            <w:noProof/>
+          </w:rPr>
+          <w:t>Figure 8:   Timing requirements for 5 bit counter when RESET is high</w:t>
+        </w:r>
+        <w:r>
+          <w:rPr>
+            <w:noProof/>
+            <w:webHidden/>
+          </w:rPr>
+          <w:tab/>
+        </w:r>
+        <w:r>
+          <w:rPr>
+            <w:noProof/>
+            <w:webHidden/>
+          </w:rPr>
+          <w:fldChar w:fldCharType="begin"/>
+        </w:r>
+        <w:r>
+          <w:rPr>
+            <w:noProof/>
+            <w:webHidden/>
+          </w:rPr>
+          <w:instrText xml:space="preserve"> PAGEREF _Toc234149890 \h </w:instrText>
         </w:r>
         <w:r>
           <w:rPr>
@@ -3531,6 +3839,76 @@
     </w:p>
     <w:p>
       <w:pPr>
+        <w:pStyle w:val="TableofFigures"/>
+        <w:tabs>
+          <w:tab w:val="right" w:leader="dot" w:pos="9016"/>
+        </w:tabs>
+        <w:rPr>
+          <w:rFonts w:eastAsiaTheme="minorEastAsia"/>
+          <w:noProof/>
+          <w:lang w:eastAsia="en-GB"/>
+        </w:rPr>
+      </w:pPr>
+      <w:hyperlink w:anchor="_Toc234149891" w:history="1">
+        <w:r>
+          <w:rPr>
+            <w:rStyle w:val="Hyperlink"/>
+            <w:noProof/>
+          </w:rPr>
+          <w:t>Figure 9:   Timing requirements for 5 bit counter when RESET is low</w:t>
+        </w:r>
+        <w:r>
+          <w:rPr>
+            <w:noProof/>
+            <w:webHidden/>
+          </w:rPr>
+          <w:tab/>
+        </w:r>
+        <w:r>
+          <w:rPr>
+            <w:noProof/>
+            <w:webHidden/>
+          </w:rPr>
+          <w:fldChar w:fldCharType="begin"/>
+        </w:r>
+        <w:r>
+          <w:rPr>
+            <w:noProof/>
+            <w:webHidden/>
+          </w:rPr>
+          <w:instrText xml:space="preserve"> PAGEREF _Toc234149891 \h </w:instrText>
+        </w:r>
+        <w:r>
+          <w:rPr>
+            <w:noProof/>
+            <w:webHidden/>
+          </w:rPr>
+        </w:r>
+        <w:r>
+          <w:rPr>
+            <w:noProof/>
+            <w:webHidden/>
+          </w:rPr>
+          <w:fldChar w:fldCharType="separate"/>
+        </w:r>
+        <w:r>
+          <w:rPr>
+            <w:noProof/>
+            <w:webHidden/>
+          </w:rPr>
+          <w:t>14</w:t>
+        </w:r>
+        <w:r>
+          <w:rPr>
+            <w:noProof/>
+            <w:webHidden/>
+          </w:rPr>
+          <w:fldChar w:fldCharType="end"/>
+        </w:r>
+      </w:hyperlink>
+    </w:p>
+    <w:p>
+      <w:pPr>
         <w:rPr>
           <w:rFonts w:eastAsia="Times New Roman"/>
           <w:lang w:eastAsia="en-GB"/>
@@ -3578,7 +3956,7 @@
           <w:lang w:eastAsia="en-GB"/>
         </w:rPr>
       </w:pPr>
-      <w:bookmarkStart w:id="2" w:name="_Toc234070362"/>
+      <w:bookmarkStart w:id="2" w:name="_Toc234149860"/>
       <w:bookmarkEnd w:id="1"/>
       <w:r>
         <w:rPr>
@@ -3659,7 +4037,7 @@
           <w:lang w:eastAsia="en-GB"/>
         </w:rPr>
       </w:pPr>
-      <w:bookmarkStart w:id="3" w:name="_Toc234070363"/>
+      <w:bookmarkStart w:id="3" w:name="_Toc234149861"/>
       <w:r>
         <w:rPr>
           <w:lang w:eastAsia="en-GB"/>
@@ -3886,7 +4264,7 @@
         </w:rPr>
       </w:pPr>
       <w:bookmarkStart w:id="4" w:name="_Ref232757332"/>
-      <w:bookmarkStart w:id="5" w:name="_Toc234070382"/>
+      <w:bookmarkStart w:id="5" w:name="_Toc234149883"/>
       <w:r>
         <w:t xml:space="preserve">Figure </w:t>
       </w:r>
@@ -4244,7 +4622,7 @@
           <w:lang w:eastAsia="en-GB"/>
         </w:rPr>
       </w:pPr>
-      <w:bookmarkStart w:id="6" w:name="_Toc234070364"/>
+      <w:bookmarkStart w:id="6" w:name="_Toc234149862"/>
       <w:r>
         <w:rPr>
           <w:lang w:eastAsia="en-GB"/>
@@ -5844,7 +6222,7 @@
           <w:lang w:eastAsia="en-GB"/>
         </w:rPr>
       </w:pPr>
-      <w:bookmarkStart w:id="8" w:name="_Toc234070365"/>
+      <w:bookmarkStart w:id="8" w:name="_Toc234149863"/>
       <w:r>
         <w:rPr>
           <w:lang w:eastAsia="en-GB"/>
@@ -5915,7 +6293,7 @@
           <w:lang w:eastAsia="en-GB"/>
         </w:rPr>
       </w:pPr>
-      <w:bookmarkStart w:id="9" w:name="_Toc234070366"/>
+      <w:bookmarkStart w:id="9" w:name="_Toc234149864"/>
       <w:r>
         <w:rPr>
           <w:rFonts w:eastAsiaTheme="minorHAnsi"/>
@@ -9412,7 +9790,7 @@
           <w:lang w:eastAsia="en-GB"/>
         </w:rPr>
       </w:pPr>
-      <w:bookmarkStart w:id="11" w:name="_Toc234070367"/>
+      <w:bookmarkStart w:id="11" w:name="_Toc234149865"/>
       <w:r>
         <w:rPr>
           <w:lang w:eastAsia="en-GB"/>
@@ -9555,7 +9933,7 @@
       </w:pPr>
       <w:bookmarkStart w:id="12" w:name="_Ref232762527"/>
       <w:bookmarkStart w:id="13" w:name="_Ref233641508"/>
-      <w:bookmarkStart w:id="14" w:name="_Toc234070383"/>
+      <w:bookmarkStart w:id="14" w:name="_Toc234149884"/>
       <w:r>
         <w:t xml:space="preserve">Figure </w:t>
       </w:r>
@@ -9613,7 +9991,7 @@
           <w:lang w:eastAsia="en-GB"/>
         </w:rPr>
       </w:pPr>
-      <w:bookmarkStart w:id="15" w:name="_Toc234070368"/>
+      <w:bookmarkStart w:id="15" w:name="_Toc234149866"/>
       <w:r>
         <w:rPr>
           <w:lang w:eastAsia="en-GB"/>
@@ -9726,7 +10104,7 @@
         </w:rPr>
       </w:pPr>
       <w:bookmarkStart w:id="16" w:name="_Ref233894649"/>
-      <w:bookmarkStart w:id="17" w:name="_Toc234070369"/>
+      <w:bookmarkStart w:id="17" w:name="_Toc234149867"/>
       <w:r>
         <w:rPr>
           <w:lang w:eastAsia="en-GB"/>
@@ -10165,7 +10543,7 @@
         <w:jc w:val="center"/>
       </w:pPr>
       <w:bookmarkStart w:id="18" w:name="_Ref233471569"/>
-      <w:bookmarkStart w:id="19" w:name="_Toc234070384"/>
+      <w:bookmarkStart w:id="19" w:name="_Toc234149885"/>
       <w:r>
         <w:t xml:space="preserve">Figure </w:t>
       </w:r>
@@ -10468,7 +10846,7 @@
         <w:jc w:val="center"/>
       </w:pPr>
       <w:bookmarkStart w:id="20" w:name="_Ref233472606"/>
-      <w:bookmarkStart w:id="21" w:name="_Toc234070385"/>
+      <w:bookmarkStart w:id="21" w:name="_Toc234149886"/>
       <w:r>
         <w:t xml:space="preserve">Figure </w:t>
       </w:r>
@@ -10583,7 +10961,7 @@
           <w:lang w:eastAsia="en-GB"/>
         </w:rPr>
       </w:pPr>
-      <w:bookmarkStart w:id="24" w:name="_Toc234070370"/>
+      <w:bookmarkStart w:id="24" w:name="_Toc234149868"/>
       <w:r>
         <w:rPr>
           <w:lang w:eastAsia="en-GB"/>
@@ -10749,7 +11127,7 @@
         </w:rPr>
       </w:pPr>
       <w:bookmarkStart w:id="25" w:name="_Ref233900184"/>
-      <w:bookmarkStart w:id="26" w:name="_Toc234070371"/>
+      <w:bookmarkStart w:id="26" w:name="_Toc234149869"/>
       <w:r>
         <w:rPr>
           <w:lang w:eastAsia="en-GB"/>
@@ -10896,7 +11274,7 @@
         </w:rPr>
       </w:pPr>
       <w:bookmarkStart w:id="27" w:name="_Ref233641794"/>
-      <w:bookmarkStart w:id="28" w:name="_Toc234070372"/>
+      <w:bookmarkStart w:id="28" w:name="_Toc234149870"/>
       <w:r>
         <w:rPr>
           <w:lang w:eastAsia="en-GB"/>
@@ -11670,7 +12048,7 @@
         </w:rPr>
       </w:pPr>
       <w:bookmarkStart w:id="31" w:name="_Ref233543378"/>
-      <w:bookmarkStart w:id="32" w:name="_Toc234070373"/>
+      <w:bookmarkStart w:id="32" w:name="_Toc234149871"/>
       <w:r>
         <w:rPr>
           <w:lang w:eastAsia="en-GB"/>
@@ -11856,7 +12234,7 @@
         <w:jc w:val="center"/>
       </w:pPr>
       <w:bookmarkStart w:id="33" w:name="_Ref233534511"/>
-      <w:bookmarkStart w:id="34" w:name="_Toc234070386"/>
+      <w:bookmarkStart w:id="34" w:name="_Toc234149887"/>
       <w:r>
         <w:t xml:space="preserve">Figure </w:t>
       </w:r>
@@ -11875,6 +12253,19 @@
       <w:bookmarkEnd w:id="34"/>
     </w:p>
     <w:p>
+      <w:pPr>
+        <w:pStyle w:val="Heading3"/>
+      </w:pPr>
+      <w:bookmarkStart w:id="35" w:name="_Toc234149872"/>
+      <w:r>
+        <w:t>Sequence ROM</w:t>
+      </w:r>
+      <w:r>
+        <w:t xml:space="preserve"> Outputs</w:t>
+      </w:r>
+      <w:bookmarkEnd w:id="35"/>
+    </w:p>
+    <w:p>
       <w:r>
         <w:t xml:space="preserve">The outputs in </w:t>
       </w:r>
@@ -12198,6 +12589,83 @@
     </w:p>
     <w:p>
       <w:r>
+        <w:br w:type="page"/>
+      </w:r>
+    </w:p>
+    <w:p/>
+    <w:p>
+      <w:pPr>
+        <w:pStyle w:val="Heading3"/>
+      </w:pPr>
+      <w:bookmarkStart w:id="36" w:name="_Toc234149873"/>
+      <w:r>
+        <w:t>Sequence ROM Output Latch</w:t>
+      </w:r>
+      <w:bookmarkEnd w:id="36"/>
+    </w:p>
+    <w:p>
+      <w:r>
+        <w:t xml:space="preserve">When the address changes, there </w:t>
+      </w:r>
+      <w:r>
+        <w:rPr>
+          <w:i/>
+        </w:rPr>
+        <w:t>may</w:t>
+      </w:r>
+      <w:r>
+        <w:t xml:space="preserve"> be some glitches on the output pins due to propagation delays inside the ROM.</w:t>
+      </w:r>
+    </w:p>
+    <w:p>
+      <w:r>
+        <w:t>To avoid propagating these glitches to the other sections of the CPU, that use these outputs to cause state changes in their circuitry, it’s necessary to have a short delay after the address changes and then latch the ROM output.</w:t>
+      </w:r>
+    </w:p>
+    <w:p>
+      <w:r>
+        <w:t xml:space="preserve">The address will only change shortly after a rising edge of CLOCK </w:t>
+      </w:r>
+      <w:bookmarkStart w:id="37" w:name="CurrentEditPos"/>
+      <w:bookmarkEnd w:id="37"/>
+      <w:r>
+        <w:t xml:space="preserve">due to the design of the Sequence Control part of the IS. </w:t>
+      </w:r>
+    </w:p>
+    <w:p>
+      <w:r>
+        <w:t>The address doesn’t change on every CLOCK rising edge, but it will do no harm, and will be simpler to implement, if the latch is updated on every CLOCK rising edge. If the address hasn’t changed, the latch output will not change.</w:t>
+      </w:r>
+    </w:p>
+    <w:p>
+      <w:r>
+        <w:t xml:space="preserve">This should be an edge triggered latch, triggered by a rising edge of </w:t>
+      </w:r>
+      <w:r>
+        <w:t xml:space="preserve">a delayed version </w:t>
+      </w:r>
+      <w:r>
+        <w:t>CLOCK</w:t>
+      </w:r>
+      <w:r>
+        <w:t>. This delay can be implemented using an RC delay followed by a Schmitt inverter (74xx14).</w:t>
+      </w:r>
+      <w:r>
+        <w:t xml:space="preserve"> </w:t>
+      </w:r>
+    </w:p>
+    <w:p>
+      <w:pPr>
+        <w:pStyle w:val="Heading3"/>
+      </w:pPr>
+      <w:bookmarkStart w:id="38" w:name="_Toc234149874"/>
+      <w:r>
+        <w:t>Sequence ROM Summary</w:t>
+      </w:r>
+      <w:bookmarkEnd w:id="38"/>
+    </w:p>
+    <w:p>
+      <w:r>
         <w:fldChar w:fldCharType="begin"/>
       </w:r>
       <w:r>
@@ -12228,21 +12696,26 @@
       </w:r>
     </w:p>
     <w:p>
+      <w:r>
+        <w:br w:type="page"/>
+      </w:r>
+    </w:p>
+    <w:p/>
+    <w:p>
       <w:pPr>
         <w:pStyle w:val="Heading2"/>
         <w:rPr>
           <w:lang w:eastAsia="en-GB"/>
         </w:rPr>
       </w:pPr>
-      <w:bookmarkStart w:id="35" w:name="_Toc234070374"/>
-      <w:r>
-        <w:rPr>
-          <w:lang w:eastAsia="en-GB"/>
-        </w:rPr>
-        <w:lastRenderedPageBreak/>
+      <w:bookmarkStart w:id="39" w:name="_Toc234149875"/>
+      <w:r>
+        <w:rPr>
+          <w:lang w:eastAsia="en-GB"/>
+        </w:rPr>
         <w:t>RAM Address Control</w:t>
       </w:r>
-      <w:bookmarkEnd w:id="35"/>
+      <w:bookmarkEnd w:id="39"/>
     </w:p>
     <w:p>
       <w:pPr>
@@ -12603,14 +13076,14 @@
           <w:lang w:eastAsia="en-GB"/>
         </w:rPr>
       </w:pPr>
-      <w:bookmarkStart w:id="36" w:name="_Toc234070375"/>
+      <w:bookmarkStart w:id="40" w:name="_Toc234149876"/>
       <w:r>
         <w:rPr>
           <w:lang w:eastAsia="en-GB"/>
         </w:rPr>
         <w:t>Temp 16 Bit Latch1</w:t>
       </w:r>
-      <w:bookmarkEnd w:id="36"/>
+      <w:bookmarkEnd w:id="40"/>
     </w:p>
     <w:p>
       <w:pPr>
@@ -12860,14 +13333,14 @@
           <w:lang w:eastAsia="en-GB"/>
         </w:rPr>
       </w:pPr>
-      <w:bookmarkStart w:id="37" w:name="_Toc234070376"/>
+      <w:bookmarkStart w:id="41" w:name="_Toc234149877"/>
       <w:r>
         <w:rPr>
           <w:lang w:eastAsia="en-GB"/>
         </w:rPr>
         <w:t>Temp 16 Bit Latch2</w:t>
       </w:r>
-      <w:bookmarkEnd w:id="37"/>
+      <w:bookmarkEnd w:id="41"/>
     </w:p>
     <w:p>
       <w:pPr>
@@ -12933,7 +13406,7 @@
           <w:lang w:eastAsia="en-GB"/>
         </w:rPr>
       </w:pPr>
-      <w:bookmarkStart w:id="38" w:name="_Toc234070377"/>
+      <w:bookmarkStart w:id="42" w:name="_Toc234149878"/>
       <w:r>
         <w:rPr>
           <w:lang w:eastAsia="en-GB"/>
@@ -12941,7 +13414,7 @@
         <w:lastRenderedPageBreak/>
         <w:t>16 Bit Tristate Buffer</w:t>
       </w:r>
-      <w:bookmarkEnd w:id="38"/>
+      <w:bookmarkEnd w:id="42"/>
     </w:p>
     <w:p>
       <w:pPr>
@@ -13075,8 +13548,8 @@
           <w:lang w:eastAsia="en-GB"/>
         </w:rPr>
       </w:pPr>
-      <w:bookmarkStart w:id="39" w:name="_Ref233797296"/>
-      <w:bookmarkStart w:id="40" w:name="_Toc234070378"/>
+      <w:bookmarkStart w:id="43" w:name="_Ref233797296"/>
+      <w:bookmarkStart w:id="44" w:name="_Toc234149879"/>
       <w:r>
         <w:rPr>
           <w:lang w:eastAsia="en-GB"/>
@@ -13090,8 +13563,8 @@
         </w:rPr>
         <w:t>or Sequence Control</w:t>
       </w:r>
-      <w:bookmarkEnd w:id="39"/>
-      <w:bookmarkEnd w:id="40"/>
+      <w:bookmarkEnd w:id="43"/>
+      <w:bookmarkEnd w:id="44"/>
     </w:p>
     <w:p>
       <w:pPr>
@@ -13256,8 +13729,8 @@
         <w:pStyle w:val="Caption"/>
         <w:jc w:val="center"/>
       </w:pPr>
-      <w:bookmarkStart w:id="41" w:name="_Ref233641691"/>
-      <w:bookmarkStart w:id="42" w:name="_Toc234070387"/>
+      <w:bookmarkStart w:id="45" w:name="_Ref233641691"/>
+      <w:bookmarkStart w:id="46" w:name="_Toc234149888"/>
       <w:r>
         <w:t xml:space="preserve">Figure </w:t>
       </w:r>
@@ -13269,7 +13742,7 @@
           <w:t>6</w:t>
         </w:r>
       </w:fldSimple>
-      <w:bookmarkEnd w:id="41"/>
+      <w:bookmarkEnd w:id="45"/>
       <w:r>
         <w:t xml:space="preserve">:   Sequence Control part of </w:t>
       </w:r>
@@ -13291,7 +13764,7 @@
         </w:rPr>
         <w:t>2</w:t>
       </w:r>
-      <w:bookmarkEnd w:id="42"/>
+      <w:bookmarkEnd w:id="46"/>
       <w:r>
         <w:fldChar w:fldCharType="end"/>
       </w:r>
@@ -13410,8 +13883,8 @@
         <w:pStyle w:val="Caption"/>
         <w:jc w:val="center"/>
       </w:pPr>
-      <w:bookmarkStart w:id="43" w:name="_Ref233648800"/>
-      <w:bookmarkStart w:id="44" w:name="_Toc234070388"/>
+      <w:bookmarkStart w:id="47" w:name="_Ref233648800"/>
+      <w:bookmarkStart w:id="48" w:name="_Toc234149889"/>
       <w:r>
         <w:t xml:space="preserve">Figure </w:t>
       </w:r>
@@ -13423,11 +13896,11 @@
           <w:t>7</w:t>
         </w:r>
       </w:fldSimple>
-      <w:bookmarkEnd w:id="43"/>
+      <w:bookmarkEnd w:id="47"/>
       <w:r>
         <w:t>:   Sequence Control L2 Block Diagram</w:t>
       </w:r>
-      <w:bookmarkEnd w:id="44"/>
+      <w:bookmarkEnd w:id="48"/>
     </w:p>
     <w:p>
       <w:r>
@@ -13507,8 +13980,8 @@
           <w:lang w:eastAsia="en-GB"/>
         </w:rPr>
       </w:pPr>
-      <w:bookmarkStart w:id="45" w:name="_Ref233901870"/>
-      <w:bookmarkStart w:id="46" w:name="_Toc234070379"/>
+      <w:bookmarkStart w:id="49" w:name="_Ref233901870"/>
+      <w:bookmarkStart w:id="50" w:name="_Toc234149880"/>
       <w:r>
         <w:rPr>
           <w:lang w:eastAsia="en-GB"/>
@@ -13516,8 +13989,8 @@
         <w:lastRenderedPageBreak/>
         <w:t>5 Bit Counter</w:t>
       </w:r>
-      <w:bookmarkEnd w:id="45"/>
-      <w:bookmarkEnd w:id="46"/>
+      <w:bookmarkEnd w:id="49"/>
+      <w:bookmarkEnd w:id="50"/>
     </w:p>
     <w:p>
       <w:pPr>
@@ -13723,9 +14196,9 @@
         <w:pStyle w:val="Caption"/>
         <w:jc w:val="center"/>
       </w:pPr>
-      <w:bookmarkStart w:id="47" w:name="_Ref233894277"/>
-      <w:bookmarkStart w:id="48" w:name="_Ref233894262"/>
-      <w:bookmarkStart w:id="49" w:name="_Toc234070389"/>
+      <w:bookmarkStart w:id="51" w:name="_Ref233894277"/>
+      <w:bookmarkStart w:id="52" w:name="_Ref233894262"/>
+      <w:bookmarkStart w:id="53" w:name="_Toc234149890"/>
       <w:r>
         <w:t xml:space="preserve">Figure </w:t>
       </w:r>
@@ -13737,18 +14210,18 @@
           <w:t>8</w:t>
         </w:r>
       </w:fldSimple>
-      <w:bookmarkEnd w:id="47"/>
+      <w:bookmarkEnd w:id="51"/>
       <w:r>
         <w:t>:   Timing requirements for 5 bit counter</w:t>
       </w:r>
-      <w:bookmarkEnd w:id="48"/>
+      <w:bookmarkEnd w:id="52"/>
       <w:r>
         <w:t xml:space="preserve"> when RESET is </w:t>
       </w:r>
       <w:r>
         <w:t>high</w:t>
       </w:r>
-      <w:bookmarkEnd w:id="49"/>
+      <w:bookmarkEnd w:id="53"/>
     </w:p>
     <w:p>
       <w:pPr>
@@ -14412,8 +14885,8 @@
         <w:pStyle w:val="Caption"/>
         <w:jc w:val="center"/>
       </w:pPr>
-      <w:bookmarkStart w:id="50" w:name="_Ref233899110"/>
-      <w:bookmarkStart w:id="51" w:name="_Toc234070390"/>
+      <w:bookmarkStart w:id="54" w:name="_Ref233899110"/>
+      <w:bookmarkStart w:id="55" w:name="_Toc234149891"/>
       <w:r>
         <w:t xml:space="preserve">Figure </w:t>
       </w:r>
@@ -14425,14 +14898,14 @@
           <w:t>9</w:t>
         </w:r>
       </w:fldSimple>
-      <w:bookmarkEnd w:id="50"/>
+      <w:bookmarkEnd w:id="54"/>
       <w:r>
         <w:t xml:space="preserve">:   Timing requirements for 5 bit counter when RESET is </w:t>
       </w:r>
       <w:r>
         <w:t>low</w:t>
       </w:r>
-      <w:bookmarkEnd w:id="51"/>
+      <w:bookmarkEnd w:id="55"/>
     </w:p>
     <w:p>
       <w:pPr>
@@ -14561,8 +15034,6 @@
           <w:lang w:eastAsia="en-GB"/>
         </w:rPr>
       </w:pPr>
-      <w:bookmarkStart w:id="52" w:name="CurrentEditPos"/>
-      <w:bookmarkEnd w:id="52"/>
       <w:r>
         <w:rPr>
           <w:lang w:eastAsia="en-GB"/>
@@ -15116,7 +15587,7 @@
           <w:lang w:eastAsia="en-GB"/>
         </w:rPr>
       </w:pPr>
-      <w:bookmarkStart w:id="53" w:name="_Ref233822155"/>
+      <w:bookmarkStart w:id="56" w:name="_Ref233822155"/>
       <w:r>
         <w:rPr>
           <w:lang w:eastAsia="en-GB"/>
@@ -15131,8 +15602,8 @@
           <w:lang w:eastAsia="en-GB"/>
         </w:rPr>
       </w:pPr>
-      <w:bookmarkStart w:id="54" w:name="_Ref233901979"/>
-      <w:bookmarkStart w:id="55" w:name="_Toc234070380"/>
+      <w:bookmarkStart w:id="57" w:name="_Ref233901979"/>
+      <w:bookmarkStart w:id="58" w:name="_Toc234149881"/>
       <w:r>
         <w:rPr>
           <w:lang w:eastAsia="en-GB"/>
@@ -15140,9 +15611,9 @@
         <w:lastRenderedPageBreak/>
         <w:t>Follow Jump?</w:t>
       </w:r>
-      <w:bookmarkEnd w:id="53"/>
-      <w:bookmarkEnd w:id="54"/>
-      <w:bookmarkEnd w:id="55"/>
+      <w:bookmarkEnd w:id="56"/>
+      <w:bookmarkEnd w:id="57"/>
+      <w:bookmarkEnd w:id="58"/>
     </w:p>
     <w:p>
       <w:pPr>
@@ -15800,7 +16271,7 @@
           <w:lang w:eastAsia="en-GB"/>
         </w:rPr>
       </w:pPr>
-      <w:bookmarkStart w:id="56" w:name="_Toc234070381"/>
+      <w:bookmarkStart w:id="59" w:name="_Toc234149882"/>
       <w:r>
         <w:rPr>
           <w:lang w:eastAsia="en-GB"/>
@@ -15809,9 +16280,9 @@
         <w:t>References</w:t>
       </w:r>
       <w:bookmarkEnd w:id="23"/>
-      <w:bookmarkEnd w:id="56"/>
-    </w:p>
-    <w:bookmarkStart w:id="57" w:name="AVR_Instruction_Doc"/>
+      <w:bookmarkEnd w:id="59"/>
+    </w:p>
+    <w:bookmarkStart w:id="60" w:name="AVR_Instruction_Doc"/>
     <w:p>
       <w:pPr>
         <w:pStyle w:val="ListParagraph"/>
@@ -15839,6 +16310,11 @@
         <w:rPr>
           <w:lang w:eastAsia="en-GB"/>
         </w:rPr>
+      </w:r>
+      <w:r>
+        <w:rPr>
+          <w:lang w:eastAsia="en-GB"/>
+        </w:rPr>
         <w:fldChar w:fldCharType="separate"/>
       </w:r>
       <w:r>
@@ -15848,7 +16324,7 @@
         </w:rPr>
         <w:t>AVR Instruction Set Manual</w:t>
       </w:r>
-      <w:bookmarkEnd w:id="57"/>
+      <w:bookmarkEnd w:id="60"/>
       <w:r>
         <w:rPr>
           <w:lang w:eastAsia="en-GB"/>
@@ -15856,7 +16332,7 @@
         <w:fldChar w:fldCharType="end"/>
       </w:r>
     </w:p>
-    <w:bookmarkStart w:id="58" w:name="RefCpuDesign"/>
+    <w:bookmarkStart w:id="61" w:name="RefCpuDesign"/>
     <w:p>
       <w:pPr>
         <w:pStyle w:val="ListParagraph"/>
@@ -15884,6 +16360,11 @@
         <w:rPr>
           <w:lang w:eastAsia="en-GB"/>
         </w:rPr>
+      </w:r>
+      <w:r>
+        <w:rPr>
+          <w:lang w:eastAsia="en-GB"/>
+        </w:rPr>
         <w:fldChar w:fldCharType="separate"/>
       </w:r>
       <w:r>
@@ -15893,7 +16374,7 @@
         </w:rPr>
         <w:t>CpuDesign.docx</w:t>
       </w:r>
-      <w:bookmarkEnd w:id="58"/>
+      <w:bookmarkEnd w:id="61"/>
       <w:r>
         <w:rPr>
           <w:lang w:eastAsia="en-GB"/>
@@ -15901,7 +16382,7 @@
         <w:fldChar w:fldCharType="end"/>
       </w:r>
     </w:p>
-    <w:bookmarkStart w:id="59" w:name="RefL1SeqXlsx"/>
+    <w:bookmarkStart w:id="62" w:name="RefL1SeqXlsx"/>
     <w:p>
       <w:pPr>
         <w:pStyle w:val="ListParagraph"/>
@@ -15929,6 +16410,11 @@
         <w:rPr>
           <w:lang w:eastAsia="en-GB"/>
         </w:rPr>
+      </w:r>
+      <w:r>
+        <w:rPr>
+          <w:lang w:eastAsia="en-GB"/>
+        </w:rPr>
         <w:fldChar w:fldCharType="separate"/>
       </w:r>
       <w:r>
@@ -15944,9 +16430,9 @@
         </w:rPr>
         <w:fldChar w:fldCharType="end"/>
       </w:r>
-      <w:bookmarkEnd w:id="59"/>
-    </w:p>
-    <w:bookmarkStart w:id="60" w:name="RefOpcodeFormat"/>
+      <w:bookmarkEnd w:id="62"/>
+    </w:p>
+    <w:bookmarkStart w:id="63" w:name="RefOpcodeFormat"/>
     <w:p>
       <w:pPr>
         <w:pStyle w:val="ListParagraph"/>
@@ -15974,6 +16460,11 @@
         <w:rPr>
           <w:lang w:eastAsia="en-GB"/>
         </w:rPr>
+      </w:r>
+      <w:r>
+        <w:rPr>
+          <w:lang w:eastAsia="en-GB"/>
+        </w:rPr>
         <w:fldChar w:fldCharType="separate"/>
       </w:r>
       <w:r>
@@ -15989,7 +16480,7 @@
         </w:rPr>
         <w:fldChar w:fldCharType="end"/>
       </w:r>
-      <w:bookmarkEnd w:id="60"/>
+      <w:bookmarkEnd w:id="63"/>
     </w:p>
     <w:p>
       <w:pPr>
@@ -16108,7 +16599,7 @@
               <w:b/>
               <w:noProof/>
             </w:rPr>
-            <w:t>11</w:t>
+            <w:t>ii</w:t>
           </w:r>
         </w:fldSimple>
       </w:p>
@@ -21850,7 +22341,7 @@
 </file>
 
 <file path=customXml/itemProps2.xml><?xml version="1.0" encoding="utf-8"?>
-<ds:datastoreItem xmlns:ds="http://schemas.openxmlformats.org/officeDocument/2006/customXml" ds:itemID="{046CA203-CA3D-40AA-884D-6D2C1A070E38}">
+<ds:datastoreItem xmlns:ds="http://schemas.openxmlformats.org/officeDocument/2006/customXml" ds:itemID="{9F721DC1-0573-4AC8-A929-8A3774380AE5}">
   <ds:schemaRefs>
     <ds:schemaRef ds:uri="http://schemas.openxmlformats.org/officeDocument/2006/bibliography"/>
   </ds:schemaRefs>

</xml_diff>